<commit_message>
Update file bao cao va xoa cot thua trong bang danh gia retrieval
</commit_message>
<xml_diff>
--- a/documents/bang_thong_so_danh_gia_models_embedding.docx
+++ b/documents/bang_thong_so_danh_gia_models_embedding.docx
@@ -1318,6 +1318,1561 @@
         </w:tc>
       </w:tr>
     </w:tbl>
+    <w:p>
+      <w:pPr>
+        <w:ind w:firstLine="0"/>
+      </w:pPr>
+      <w:r>
+        <w:br w:type="page"/>
+      </w:r>
+    </w:p>
+    <w:tbl>
+      <w:tblPr>
+        <w:tblStyle w:val="TableGrid"/>
+        <w:tblW w:w="0" w:type="auto"/>
+        <w:tblLook w:val="04A0" w:firstRow="1" w:lastRow="0" w:firstColumn="1" w:lastColumn="0" w:noHBand="0" w:noVBand="1"/>
+      </w:tblPr>
+      <w:tblGrid>
+        <w:gridCol w:w="2757"/>
+        <w:gridCol w:w="1609"/>
+        <w:gridCol w:w="1609"/>
+        <w:gridCol w:w="1609"/>
+        <w:gridCol w:w="939"/>
+        <w:gridCol w:w="939"/>
+        <w:gridCol w:w="1401"/>
+        <w:gridCol w:w="785"/>
+        <w:gridCol w:w="996"/>
+      </w:tblGrid>
+      <w:tr>
+        <w:tc>
+          <w:tcPr>
+            <w:tcW w:w="2757" w:type="dxa"/>
+            <w:vAlign w:val="center"/>
+          </w:tcPr>
+          <w:p>
+            <w:pPr>
+              <w:ind w:firstLine="0"/>
+              <w:jc w:val="center"/>
+              <w:rPr>
+                <w:b/>
+                <w:bCs/>
+                <w:szCs w:val="26"/>
+              </w:rPr>
+            </w:pPr>
+            <w:bookmarkStart w:id="0" w:name="_Hlk199427122"/>
+          </w:p>
+        </w:tc>
+        <w:tc>
+          <w:tcPr>
+            <w:tcW w:w="1554" w:type="dxa"/>
+            <w:vAlign w:val="center"/>
+          </w:tcPr>
+          <w:p>
+            <w:pPr>
+              <w:ind w:firstLine="0"/>
+              <w:jc w:val="center"/>
+              <w:rPr>
+                <w:b/>
+                <w:bCs/>
+                <w:szCs w:val="26"/>
+                <w:lang w:val="vi-VN"/>
+              </w:rPr>
+            </w:pPr>
+            <w:r>
+              <w:rPr>
+                <w:b/>
+                <w:bCs/>
+                <w:szCs w:val="26"/>
+              </w:rPr>
+              <w:t>Precision@1</w:t>
+            </w:r>
+          </w:p>
+        </w:tc>
+        <w:tc>
+          <w:tcPr>
+            <w:tcW w:w="1554" w:type="dxa"/>
+            <w:vAlign w:val="center"/>
+          </w:tcPr>
+          <w:p>
+            <w:pPr>
+              <w:ind w:firstLine="0"/>
+              <w:jc w:val="center"/>
+              <w:rPr>
+                <w:b/>
+                <w:bCs/>
+                <w:szCs w:val="26"/>
+                <w:lang w:val="vi-VN"/>
+              </w:rPr>
+            </w:pPr>
+            <w:r>
+              <w:rPr>
+                <w:b/>
+                <w:bCs/>
+                <w:szCs w:val="26"/>
+              </w:rPr>
+              <w:t>Precision@3</w:t>
+            </w:r>
+          </w:p>
+        </w:tc>
+        <w:tc>
+          <w:tcPr>
+            <w:tcW w:w="1554" w:type="dxa"/>
+            <w:vAlign w:val="center"/>
+          </w:tcPr>
+          <w:p>
+            <w:pPr>
+              <w:ind w:firstLine="0"/>
+              <w:jc w:val="center"/>
+              <w:rPr>
+                <w:b/>
+                <w:bCs/>
+                <w:szCs w:val="26"/>
+              </w:rPr>
+            </w:pPr>
+            <w:r>
+              <w:rPr>
+                <w:b/>
+                <w:bCs/>
+                <w:szCs w:val="26"/>
+              </w:rPr>
+              <w:t>Precision@5</w:t>
+            </w:r>
+          </w:p>
+        </w:tc>
+        <w:tc>
+          <w:tcPr>
+            <w:tcW w:w="895" w:type="dxa"/>
+            <w:vAlign w:val="center"/>
+          </w:tcPr>
+          <w:p>
+            <w:pPr>
+              <w:ind w:firstLine="0"/>
+              <w:jc w:val="center"/>
+              <w:rPr>
+                <w:b/>
+                <w:bCs/>
+                <w:szCs w:val="26"/>
+              </w:rPr>
+            </w:pPr>
+            <w:r>
+              <w:rPr>
+                <w:b/>
+                <w:bCs/>
+                <w:szCs w:val="26"/>
+              </w:rPr>
+              <w:t>Min tokens</w:t>
+            </w:r>
+          </w:p>
+        </w:tc>
+        <w:tc>
+          <w:tcPr>
+            <w:tcW w:w="895" w:type="dxa"/>
+            <w:vAlign w:val="center"/>
+          </w:tcPr>
+          <w:p>
+            <w:pPr>
+              <w:ind w:firstLine="0"/>
+              <w:jc w:val="center"/>
+              <w:rPr>
+                <w:b/>
+                <w:bCs/>
+                <w:szCs w:val="26"/>
+              </w:rPr>
+            </w:pPr>
+            <w:r>
+              <w:rPr>
+                <w:b/>
+                <w:bCs/>
+                <w:szCs w:val="26"/>
+              </w:rPr>
+              <w:t>Max tokens</w:t>
+            </w:r>
+          </w:p>
+        </w:tc>
+        <w:tc>
+          <w:tcPr>
+            <w:tcW w:w="1358" w:type="dxa"/>
+            <w:vAlign w:val="center"/>
+          </w:tcPr>
+          <w:p>
+            <w:pPr>
+              <w:ind w:firstLine="0"/>
+              <w:jc w:val="center"/>
+              <w:rPr>
+                <w:b/>
+                <w:bCs/>
+                <w:szCs w:val="26"/>
+              </w:rPr>
+            </w:pPr>
+            <w:r>
+              <w:rPr>
+                <w:b/>
+                <w:bCs/>
+                <w:szCs w:val="26"/>
+              </w:rPr>
+              <w:t>Dimension</w:t>
+            </w:r>
+          </w:p>
+        </w:tc>
+        <w:tc>
+          <w:tcPr>
+            <w:tcW w:w="747" w:type="dxa"/>
+            <w:vAlign w:val="center"/>
+          </w:tcPr>
+          <w:p>
+            <w:pPr>
+              <w:ind w:firstLine="0"/>
+              <w:jc w:val="center"/>
+              <w:rPr>
+                <w:b/>
+                <w:bCs/>
+                <w:szCs w:val="26"/>
+              </w:rPr>
+            </w:pPr>
+            <w:r>
+              <w:rPr>
+                <w:b/>
+                <w:bCs/>
+                <w:szCs w:val="26"/>
+              </w:rPr>
+              <w:t>Total time (s)</w:t>
+            </w:r>
+          </w:p>
+        </w:tc>
+        <w:tc>
+          <w:tcPr>
+            <w:tcW w:w="953" w:type="dxa"/>
+            <w:vAlign w:val="center"/>
+          </w:tcPr>
+          <w:p>
+            <w:pPr>
+              <w:ind w:firstLine="0"/>
+              <w:jc w:val="center"/>
+              <w:rPr>
+                <w:b/>
+                <w:bCs/>
+                <w:szCs w:val="26"/>
+              </w:rPr>
+            </w:pPr>
+            <w:r>
+              <w:rPr>
+                <w:b/>
+                <w:bCs/>
+                <w:szCs w:val="26"/>
+              </w:rPr>
+              <w:t>On a sample (s)</w:t>
+            </w:r>
+          </w:p>
+        </w:tc>
+      </w:tr>
+      <w:tr>
+        <w:tc>
+          <w:tcPr>
+            <w:tcW w:w="2757" w:type="dxa"/>
+            <w:vAlign w:val="center"/>
+          </w:tcPr>
+          <w:p>
+            <w:pPr>
+              <w:ind w:firstLine="0"/>
+              <w:jc w:val="center"/>
+              <w:rPr>
+                <w:b/>
+                <w:bCs/>
+                <w:szCs w:val="26"/>
+              </w:rPr>
+            </w:pPr>
+            <w:r>
+              <w:rPr>
+                <w:b/>
+                <w:bCs/>
+                <w:szCs w:val="26"/>
+              </w:rPr>
+              <w:t>all-MiniLM-L6-v2</w:t>
+            </w:r>
+          </w:p>
+        </w:tc>
+        <w:tc>
+          <w:tcPr>
+            <w:tcW w:w="1554" w:type="dxa"/>
+            <w:vAlign w:val="center"/>
+          </w:tcPr>
+          <w:p>
+            <w:pPr>
+              <w:ind w:firstLine="0"/>
+              <w:jc w:val="center"/>
+              <w:rPr>
+                <w:szCs w:val="26"/>
+                <w:lang w:val="vi-VN"/>
+              </w:rPr>
+            </w:pPr>
+            <w:r>
+              <w:rPr>
+                <w:szCs w:val="26"/>
+              </w:rPr>
+              <w:t>0</w:t>
+            </w:r>
+            <w:r>
+              <w:rPr>
+                <w:szCs w:val="26"/>
+                <w:lang w:val="vi-VN"/>
+              </w:rPr>
+              <w:t>.57</w:t>
+            </w:r>
+          </w:p>
+        </w:tc>
+        <w:tc>
+          <w:tcPr>
+            <w:tcW w:w="1554" w:type="dxa"/>
+            <w:vAlign w:val="center"/>
+          </w:tcPr>
+          <w:p>
+            <w:pPr>
+              <w:ind w:firstLine="0"/>
+              <w:jc w:val="center"/>
+              <w:rPr>
+                <w:szCs w:val="26"/>
+                <w:lang w:val="vi-VN"/>
+              </w:rPr>
+            </w:pPr>
+            <w:r>
+              <w:rPr>
+                <w:szCs w:val="26"/>
+              </w:rPr>
+              <w:t>0</w:t>
+            </w:r>
+            <w:r>
+              <w:rPr>
+                <w:szCs w:val="26"/>
+                <w:lang w:val="vi-VN"/>
+              </w:rPr>
+              <w:t>.28</w:t>
+            </w:r>
+          </w:p>
+        </w:tc>
+        <w:tc>
+          <w:tcPr>
+            <w:tcW w:w="1554" w:type="dxa"/>
+            <w:vAlign w:val="center"/>
+          </w:tcPr>
+          <w:p>
+            <w:pPr>
+              <w:ind w:firstLine="0"/>
+              <w:jc w:val="center"/>
+              <w:rPr>
+                <w:szCs w:val="26"/>
+                <w:lang w:val="vi-VN"/>
+              </w:rPr>
+            </w:pPr>
+            <w:r>
+              <w:rPr>
+                <w:szCs w:val="26"/>
+              </w:rPr>
+              <w:t>0</w:t>
+            </w:r>
+            <w:r>
+              <w:rPr>
+                <w:szCs w:val="26"/>
+                <w:lang w:val="vi-VN"/>
+              </w:rPr>
+              <w:t>.17</w:t>
+            </w:r>
+          </w:p>
+        </w:tc>
+        <w:tc>
+          <w:tcPr>
+            <w:tcW w:w="895" w:type="dxa"/>
+            <w:vAlign w:val="center"/>
+          </w:tcPr>
+          <w:p>
+            <w:pPr>
+              <w:ind w:firstLine="0"/>
+              <w:jc w:val="center"/>
+              <w:rPr>
+                <w:szCs w:val="26"/>
+              </w:rPr>
+            </w:pPr>
+            <w:r>
+              <w:rPr>
+                <w:szCs w:val="26"/>
+              </w:rPr>
+              <w:t>74</w:t>
+            </w:r>
+          </w:p>
+        </w:tc>
+        <w:tc>
+          <w:tcPr>
+            <w:tcW w:w="895" w:type="dxa"/>
+            <w:vAlign w:val="center"/>
+          </w:tcPr>
+          <w:p>
+            <w:pPr>
+              <w:ind w:firstLine="0"/>
+              <w:jc w:val="center"/>
+              <w:rPr>
+                <w:szCs w:val="26"/>
+              </w:rPr>
+            </w:pPr>
+            <w:r>
+              <w:rPr>
+                <w:szCs w:val="26"/>
+              </w:rPr>
+              <w:t>2828</w:t>
+            </w:r>
+          </w:p>
+        </w:tc>
+        <w:tc>
+          <w:tcPr>
+            <w:tcW w:w="1358" w:type="dxa"/>
+            <w:vAlign w:val="center"/>
+          </w:tcPr>
+          <w:p>
+            <w:pPr>
+              <w:ind w:firstLine="0"/>
+              <w:jc w:val="center"/>
+              <w:rPr>
+                <w:szCs w:val="26"/>
+              </w:rPr>
+            </w:pPr>
+            <w:r>
+              <w:rPr>
+                <w:szCs w:val="26"/>
+              </w:rPr>
+              <w:t>384</w:t>
+            </w:r>
+          </w:p>
+        </w:tc>
+        <w:tc>
+          <w:tcPr>
+            <w:tcW w:w="747" w:type="dxa"/>
+            <w:vAlign w:val="center"/>
+          </w:tcPr>
+          <w:p>
+            <w:pPr>
+              <w:ind w:firstLine="0"/>
+              <w:jc w:val="center"/>
+              <w:rPr>
+                <w:szCs w:val="26"/>
+              </w:rPr>
+            </w:pPr>
+            <w:r>
+              <w:rPr>
+                <w:szCs w:val="26"/>
+              </w:rPr>
+              <w:t>95</w:t>
+            </w:r>
+          </w:p>
+        </w:tc>
+        <w:tc>
+          <w:tcPr>
+            <w:tcW w:w="953" w:type="dxa"/>
+            <w:vAlign w:val="center"/>
+          </w:tcPr>
+          <w:p>
+            <w:pPr>
+              <w:ind w:firstLine="0"/>
+              <w:jc w:val="center"/>
+              <w:rPr>
+                <w:szCs w:val="26"/>
+              </w:rPr>
+            </w:pPr>
+            <w:r>
+              <w:rPr>
+                <w:szCs w:val="26"/>
+              </w:rPr>
+              <w:t>0.11</w:t>
+            </w:r>
+          </w:p>
+        </w:tc>
+      </w:tr>
+      <w:tr>
+        <w:tc>
+          <w:tcPr>
+            <w:tcW w:w="2757" w:type="dxa"/>
+            <w:vAlign w:val="center"/>
+          </w:tcPr>
+          <w:p>
+            <w:pPr>
+              <w:ind w:firstLine="0"/>
+              <w:jc w:val="center"/>
+              <w:rPr>
+                <w:b/>
+                <w:bCs/>
+                <w:szCs w:val="26"/>
+              </w:rPr>
+            </w:pPr>
+            <w:r>
+              <w:rPr>
+                <w:b/>
+                <w:bCs/>
+                <w:szCs w:val="26"/>
+              </w:rPr>
+              <w:t>bert-base-vietnamese-uncased</w:t>
+            </w:r>
+          </w:p>
+        </w:tc>
+        <w:tc>
+          <w:tcPr>
+            <w:tcW w:w="1554" w:type="dxa"/>
+            <w:vAlign w:val="center"/>
+          </w:tcPr>
+          <w:p>
+            <w:pPr>
+              <w:ind w:firstLine="0"/>
+              <w:jc w:val="center"/>
+              <w:rPr>
+                <w:szCs w:val="26"/>
+                <w:lang w:val="vi-VN"/>
+              </w:rPr>
+            </w:pPr>
+            <w:r>
+              <w:rPr>
+                <w:szCs w:val="26"/>
+              </w:rPr>
+              <w:t>4</w:t>
+            </w:r>
+            <w:r>
+              <w:rPr>
+                <w:szCs w:val="26"/>
+                <w:lang w:val="vi-VN"/>
+              </w:rPr>
+              <w:t>.72</w:t>
+            </w:r>
+          </w:p>
+        </w:tc>
+        <w:tc>
+          <w:tcPr>
+            <w:tcW w:w="1554" w:type="dxa"/>
+            <w:vAlign w:val="center"/>
+          </w:tcPr>
+          <w:p>
+            <w:pPr>
+              <w:ind w:firstLine="0"/>
+              <w:jc w:val="center"/>
+              <w:rPr>
+                <w:szCs w:val="26"/>
+                <w:lang w:val="vi-VN"/>
+              </w:rPr>
+            </w:pPr>
+            <w:r>
+              <w:rPr>
+                <w:szCs w:val="26"/>
+              </w:rPr>
+              <w:t>0</w:t>
+            </w:r>
+            <w:r>
+              <w:rPr>
+                <w:szCs w:val="26"/>
+                <w:lang w:val="vi-VN"/>
+              </w:rPr>
+              <w:t>.47</w:t>
+            </w:r>
+          </w:p>
+        </w:tc>
+        <w:tc>
+          <w:tcPr>
+            <w:tcW w:w="1554" w:type="dxa"/>
+            <w:vAlign w:val="center"/>
+          </w:tcPr>
+          <w:p>
+            <w:pPr>
+              <w:ind w:firstLine="0"/>
+              <w:jc w:val="center"/>
+              <w:rPr>
+                <w:szCs w:val="26"/>
+                <w:lang w:val="vi-VN"/>
+              </w:rPr>
+            </w:pPr>
+            <w:r>
+              <w:rPr>
+                <w:szCs w:val="26"/>
+              </w:rPr>
+              <w:t>0</w:t>
+            </w:r>
+            <w:r>
+              <w:rPr>
+                <w:szCs w:val="26"/>
+                <w:lang w:val="vi-VN"/>
+              </w:rPr>
+              <w:t>.48</w:t>
+            </w:r>
+          </w:p>
+        </w:tc>
+        <w:tc>
+          <w:tcPr>
+            <w:tcW w:w="895" w:type="dxa"/>
+            <w:vAlign w:val="center"/>
+          </w:tcPr>
+          <w:p>
+            <w:pPr>
+              <w:ind w:firstLine="0"/>
+              <w:jc w:val="center"/>
+              <w:rPr>
+                <w:szCs w:val="26"/>
+              </w:rPr>
+            </w:pPr>
+            <w:r>
+              <w:rPr>
+                <w:szCs w:val="26"/>
+              </w:rPr>
+              <w:t>53</w:t>
+            </w:r>
+          </w:p>
+        </w:tc>
+        <w:tc>
+          <w:tcPr>
+            <w:tcW w:w="895" w:type="dxa"/>
+            <w:vAlign w:val="center"/>
+          </w:tcPr>
+          <w:p>
+            <w:pPr>
+              <w:ind w:firstLine="0"/>
+              <w:jc w:val="center"/>
+              <w:rPr>
+                <w:szCs w:val="26"/>
+              </w:rPr>
+            </w:pPr>
+            <w:r>
+              <w:rPr>
+                <w:szCs w:val="26"/>
+              </w:rPr>
+              <w:t>2267</w:t>
+            </w:r>
+          </w:p>
+        </w:tc>
+        <w:tc>
+          <w:tcPr>
+            <w:tcW w:w="1358" w:type="dxa"/>
+            <w:vAlign w:val="center"/>
+          </w:tcPr>
+          <w:p>
+            <w:pPr>
+              <w:ind w:firstLine="0"/>
+              <w:jc w:val="center"/>
+              <w:rPr>
+                <w:szCs w:val="26"/>
+              </w:rPr>
+            </w:pPr>
+            <w:r>
+              <w:rPr>
+                <w:szCs w:val="26"/>
+              </w:rPr>
+              <w:t>768</w:t>
+            </w:r>
+          </w:p>
+        </w:tc>
+        <w:tc>
+          <w:tcPr>
+            <w:tcW w:w="747" w:type="dxa"/>
+            <w:vAlign w:val="center"/>
+          </w:tcPr>
+          <w:p>
+            <w:pPr>
+              <w:ind w:firstLine="0"/>
+              <w:jc w:val="center"/>
+              <w:rPr>
+                <w:szCs w:val="26"/>
+              </w:rPr>
+            </w:pPr>
+            <w:r>
+              <w:rPr>
+                <w:szCs w:val="26"/>
+              </w:rPr>
+              <w:t>643</w:t>
+            </w:r>
+          </w:p>
+        </w:tc>
+        <w:tc>
+          <w:tcPr>
+            <w:tcW w:w="953" w:type="dxa"/>
+            <w:vAlign w:val="center"/>
+          </w:tcPr>
+          <w:p>
+            <w:pPr>
+              <w:ind w:firstLine="0"/>
+              <w:jc w:val="center"/>
+              <w:rPr>
+                <w:szCs w:val="26"/>
+              </w:rPr>
+            </w:pPr>
+            <w:r>
+              <w:rPr>
+                <w:szCs w:val="26"/>
+              </w:rPr>
+              <w:t>0.75</w:t>
+            </w:r>
+          </w:p>
+        </w:tc>
+      </w:tr>
+      <w:tr>
+        <w:tc>
+          <w:tcPr>
+            <w:tcW w:w="2757" w:type="dxa"/>
+            <w:vAlign w:val="center"/>
+          </w:tcPr>
+          <w:p>
+            <w:pPr>
+              <w:ind w:firstLine="0"/>
+              <w:jc w:val="center"/>
+              <w:rPr>
+                <w:b/>
+                <w:bCs/>
+                <w:szCs w:val="26"/>
+              </w:rPr>
+            </w:pPr>
+            <w:r>
+              <w:rPr>
+                <w:b/>
+                <w:bCs/>
+                <w:szCs w:val="26"/>
+              </w:rPr>
+              <w:t>distiluse-base-multilingual-cased-v2</w:t>
+            </w:r>
+          </w:p>
+        </w:tc>
+        <w:tc>
+          <w:tcPr>
+            <w:tcW w:w="1554" w:type="dxa"/>
+            <w:vAlign w:val="center"/>
+          </w:tcPr>
+          <w:p>
+            <w:pPr>
+              <w:ind w:firstLine="0"/>
+              <w:jc w:val="center"/>
+              <w:rPr>
+                <w:szCs w:val="26"/>
+                <w:lang w:val="vi-VN"/>
+              </w:rPr>
+            </w:pPr>
+            <w:r>
+              <w:rPr>
+                <w:szCs w:val="26"/>
+              </w:rPr>
+              <w:t>0</w:t>
+            </w:r>
+            <w:r>
+              <w:rPr>
+                <w:szCs w:val="26"/>
+                <w:lang w:val="vi-VN"/>
+              </w:rPr>
+              <w:t>.57</w:t>
+            </w:r>
+          </w:p>
+        </w:tc>
+        <w:tc>
+          <w:tcPr>
+            <w:tcW w:w="1554" w:type="dxa"/>
+            <w:vAlign w:val="center"/>
+          </w:tcPr>
+          <w:p>
+            <w:pPr>
+              <w:ind w:firstLine="0"/>
+              <w:jc w:val="center"/>
+              <w:rPr>
+                <w:szCs w:val="26"/>
+                <w:lang w:val="vi-VN"/>
+              </w:rPr>
+            </w:pPr>
+            <w:r>
+              <w:rPr>
+                <w:szCs w:val="26"/>
+                <w:lang w:val="vi-VN"/>
+              </w:rPr>
+              <w:t>0.57</w:t>
+            </w:r>
+          </w:p>
+        </w:tc>
+        <w:tc>
+          <w:tcPr>
+            <w:tcW w:w="1554" w:type="dxa"/>
+            <w:vAlign w:val="center"/>
+          </w:tcPr>
+          <w:p>
+            <w:pPr>
+              <w:ind w:firstLine="0"/>
+              <w:jc w:val="center"/>
+              <w:rPr>
+                <w:szCs w:val="26"/>
+                <w:lang w:val="vi-VN"/>
+              </w:rPr>
+            </w:pPr>
+            <w:r>
+              <w:rPr>
+                <w:szCs w:val="26"/>
+                <w:lang w:val="vi-VN"/>
+              </w:rPr>
+              <w:t>0.54</w:t>
+            </w:r>
+          </w:p>
+        </w:tc>
+        <w:tc>
+          <w:tcPr>
+            <w:tcW w:w="895" w:type="dxa"/>
+            <w:vAlign w:val="center"/>
+          </w:tcPr>
+          <w:p>
+            <w:pPr>
+              <w:ind w:firstLine="0"/>
+              <w:jc w:val="center"/>
+              <w:rPr>
+                <w:szCs w:val="26"/>
+              </w:rPr>
+            </w:pPr>
+            <w:r>
+              <w:rPr>
+                <w:szCs w:val="26"/>
+              </w:rPr>
+              <w:t>44</w:t>
+            </w:r>
+          </w:p>
+        </w:tc>
+        <w:tc>
+          <w:tcPr>
+            <w:tcW w:w="895" w:type="dxa"/>
+            <w:vAlign w:val="center"/>
+          </w:tcPr>
+          <w:p>
+            <w:pPr>
+              <w:ind w:firstLine="0"/>
+              <w:jc w:val="center"/>
+              <w:rPr>
+                <w:szCs w:val="26"/>
+              </w:rPr>
+            </w:pPr>
+            <w:r>
+              <w:rPr>
+                <w:szCs w:val="26"/>
+              </w:rPr>
+              <w:t>2031</w:t>
+            </w:r>
+          </w:p>
+        </w:tc>
+        <w:tc>
+          <w:tcPr>
+            <w:tcW w:w="1358" w:type="dxa"/>
+            <w:vAlign w:val="center"/>
+          </w:tcPr>
+          <w:p>
+            <w:pPr>
+              <w:ind w:firstLine="0"/>
+              <w:jc w:val="center"/>
+              <w:rPr>
+                <w:szCs w:val="26"/>
+              </w:rPr>
+            </w:pPr>
+            <w:r>
+              <w:rPr>
+                <w:szCs w:val="26"/>
+              </w:rPr>
+              <w:t>512</w:t>
+            </w:r>
+          </w:p>
+        </w:tc>
+        <w:tc>
+          <w:tcPr>
+            <w:tcW w:w="747" w:type="dxa"/>
+            <w:vAlign w:val="center"/>
+          </w:tcPr>
+          <w:p>
+            <w:pPr>
+              <w:ind w:firstLine="0"/>
+              <w:jc w:val="center"/>
+              <w:rPr>
+                <w:szCs w:val="26"/>
+              </w:rPr>
+            </w:pPr>
+            <w:r>
+              <w:rPr>
+                <w:szCs w:val="26"/>
+              </w:rPr>
+              <w:t>159</w:t>
+            </w:r>
+          </w:p>
+        </w:tc>
+        <w:tc>
+          <w:tcPr>
+            <w:tcW w:w="953" w:type="dxa"/>
+            <w:vAlign w:val="center"/>
+          </w:tcPr>
+          <w:p>
+            <w:pPr>
+              <w:ind w:firstLine="0"/>
+              <w:jc w:val="center"/>
+              <w:rPr>
+                <w:szCs w:val="26"/>
+              </w:rPr>
+            </w:pPr>
+            <w:r>
+              <w:rPr>
+                <w:szCs w:val="26"/>
+              </w:rPr>
+              <w:t>0.18</w:t>
+            </w:r>
+          </w:p>
+        </w:tc>
+      </w:tr>
+      <w:tr>
+        <w:tc>
+          <w:tcPr>
+            <w:tcW w:w="2757" w:type="dxa"/>
+            <w:vAlign w:val="center"/>
+          </w:tcPr>
+          <w:p>
+            <w:pPr>
+              <w:ind w:firstLine="0"/>
+              <w:jc w:val="center"/>
+              <w:rPr>
+                <w:b/>
+                <w:bCs/>
+                <w:szCs w:val="26"/>
+              </w:rPr>
+            </w:pPr>
+            <w:r>
+              <w:rPr>
+                <w:b/>
+                <w:bCs/>
+                <w:szCs w:val="26"/>
+              </w:rPr>
+              <w:t>multilingual-e5-small</w:t>
+            </w:r>
+          </w:p>
+        </w:tc>
+        <w:tc>
+          <w:tcPr>
+            <w:tcW w:w="1554" w:type="dxa"/>
+            <w:vAlign w:val="center"/>
+          </w:tcPr>
+          <w:p>
+            <w:pPr>
+              <w:ind w:firstLine="0"/>
+              <w:jc w:val="center"/>
+              <w:rPr>
+                <w:szCs w:val="26"/>
+                <w:lang w:val="vi-VN"/>
+              </w:rPr>
+            </w:pPr>
+            <w:r>
+              <w:rPr>
+                <w:szCs w:val="26"/>
+              </w:rPr>
+              <w:t>1</w:t>
+            </w:r>
+            <w:r>
+              <w:rPr>
+                <w:szCs w:val="26"/>
+                <w:lang w:val="vi-VN"/>
+              </w:rPr>
+              <w:t>.00</w:t>
+            </w:r>
+          </w:p>
+        </w:tc>
+        <w:tc>
+          <w:tcPr>
+            <w:tcW w:w="1554" w:type="dxa"/>
+            <w:vAlign w:val="center"/>
+          </w:tcPr>
+          <w:p>
+            <w:pPr>
+              <w:ind w:firstLine="0"/>
+              <w:jc w:val="center"/>
+              <w:rPr>
+                <w:szCs w:val="26"/>
+                <w:lang w:val="vi-VN"/>
+              </w:rPr>
+            </w:pPr>
+            <w:r>
+              <w:rPr>
+                <w:szCs w:val="26"/>
+              </w:rPr>
+              <w:t>0</w:t>
+            </w:r>
+            <w:r>
+              <w:rPr>
+                <w:szCs w:val="26"/>
+                <w:lang w:val="vi-VN"/>
+              </w:rPr>
+              <w:t>.90</w:t>
+            </w:r>
+          </w:p>
+        </w:tc>
+        <w:tc>
+          <w:tcPr>
+            <w:tcW w:w="1554" w:type="dxa"/>
+            <w:vAlign w:val="center"/>
+          </w:tcPr>
+          <w:p>
+            <w:pPr>
+              <w:ind w:firstLine="0"/>
+              <w:jc w:val="center"/>
+              <w:rPr>
+                <w:szCs w:val="26"/>
+                <w:lang w:val="vi-VN"/>
+              </w:rPr>
+            </w:pPr>
+            <w:r>
+              <w:rPr>
+                <w:szCs w:val="26"/>
+              </w:rPr>
+              <w:t>0</w:t>
+            </w:r>
+            <w:r>
+              <w:rPr>
+                <w:szCs w:val="26"/>
+                <w:lang w:val="vi-VN"/>
+              </w:rPr>
+              <w:t>.88</w:t>
+            </w:r>
+          </w:p>
+        </w:tc>
+        <w:tc>
+          <w:tcPr>
+            <w:tcW w:w="895" w:type="dxa"/>
+            <w:vAlign w:val="center"/>
+          </w:tcPr>
+          <w:p>
+            <w:pPr>
+              <w:ind w:firstLine="0"/>
+              <w:jc w:val="center"/>
+              <w:rPr>
+                <w:szCs w:val="26"/>
+              </w:rPr>
+            </w:pPr>
+            <w:r>
+              <w:rPr>
+                <w:szCs w:val="26"/>
+              </w:rPr>
+              <w:t>45</w:t>
+            </w:r>
+          </w:p>
+        </w:tc>
+        <w:tc>
+          <w:tcPr>
+            <w:tcW w:w="895" w:type="dxa"/>
+            <w:vAlign w:val="center"/>
+          </w:tcPr>
+          <w:p>
+            <w:pPr>
+              <w:ind w:firstLine="0"/>
+              <w:jc w:val="center"/>
+              <w:rPr>
+                <w:szCs w:val="26"/>
+              </w:rPr>
+            </w:pPr>
+            <w:r>
+              <w:rPr>
+                <w:szCs w:val="26"/>
+              </w:rPr>
+              <w:t>1967</w:t>
+            </w:r>
+          </w:p>
+        </w:tc>
+        <w:tc>
+          <w:tcPr>
+            <w:tcW w:w="1358" w:type="dxa"/>
+            <w:vAlign w:val="center"/>
+          </w:tcPr>
+          <w:p>
+            <w:pPr>
+              <w:ind w:firstLine="0"/>
+              <w:jc w:val="center"/>
+              <w:rPr>
+                <w:szCs w:val="26"/>
+              </w:rPr>
+            </w:pPr>
+            <w:r>
+              <w:rPr>
+                <w:szCs w:val="26"/>
+              </w:rPr>
+              <w:t>384</w:t>
+            </w:r>
+          </w:p>
+        </w:tc>
+        <w:tc>
+          <w:tcPr>
+            <w:tcW w:w="747" w:type="dxa"/>
+            <w:vAlign w:val="center"/>
+          </w:tcPr>
+          <w:p>
+            <w:pPr>
+              <w:ind w:firstLine="0"/>
+              <w:jc w:val="center"/>
+              <w:rPr>
+                <w:szCs w:val="26"/>
+              </w:rPr>
+            </w:pPr>
+            <w:r>
+              <w:rPr>
+                <w:szCs w:val="26"/>
+              </w:rPr>
+              <w:t>210</w:t>
+            </w:r>
+          </w:p>
+        </w:tc>
+        <w:tc>
+          <w:tcPr>
+            <w:tcW w:w="953" w:type="dxa"/>
+            <w:vAlign w:val="center"/>
+          </w:tcPr>
+          <w:p>
+            <w:pPr>
+              <w:ind w:firstLine="0"/>
+              <w:jc w:val="center"/>
+              <w:rPr>
+                <w:szCs w:val="26"/>
+              </w:rPr>
+            </w:pPr>
+            <w:r>
+              <w:rPr>
+                <w:szCs w:val="26"/>
+              </w:rPr>
+              <w:t>0.24</w:t>
+            </w:r>
+          </w:p>
+        </w:tc>
+      </w:tr>
+      <w:tr>
+        <w:tc>
+          <w:tcPr>
+            <w:tcW w:w="2757" w:type="dxa"/>
+            <w:vAlign w:val="center"/>
+          </w:tcPr>
+          <w:p>
+            <w:pPr>
+              <w:ind w:firstLine="0"/>
+              <w:jc w:val="center"/>
+              <w:rPr>
+                <w:b/>
+                <w:bCs/>
+                <w:szCs w:val="26"/>
+              </w:rPr>
+            </w:pPr>
+            <w:r>
+              <w:rPr>
+                <w:b/>
+                <w:bCs/>
+                <w:szCs w:val="26"/>
+              </w:rPr>
+              <w:t>sup-SimCSE-VietNamese-phobert-base</w:t>
+            </w:r>
+          </w:p>
+        </w:tc>
+        <w:tc>
+          <w:tcPr>
+            <w:tcW w:w="1554" w:type="dxa"/>
+            <w:vAlign w:val="center"/>
+          </w:tcPr>
+          <w:p>
+            <w:pPr>
+              <w:ind w:firstLine="0"/>
+              <w:jc w:val="center"/>
+              <w:rPr>
+                <w:szCs w:val="26"/>
+                <w:lang w:val="vi-VN"/>
+              </w:rPr>
+            </w:pPr>
+            <w:r>
+              <w:rPr>
+                <w:szCs w:val="26"/>
+              </w:rPr>
+              <w:t>0</w:t>
+            </w:r>
+            <w:r>
+              <w:rPr>
+                <w:szCs w:val="26"/>
+                <w:lang w:val="vi-VN"/>
+              </w:rPr>
+              <w:t>.57</w:t>
+            </w:r>
+          </w:p>
+        </w:tc>
+        <w:tc>
+          <w:tcPr>
+            <w:tcW w:w="1554" w:type="dxa"/>
+            <w:vAlign w:val="center"/>
+          </w:tcPr>
+          <w:p>
+            <w:pPr>
+              <w:ind w:firstLine="0"/>
+              <w:jc w:val="center"/>
+              <w:rPr>
+                <w:szCs w:val="26"/>
+                <w:lang w:val="vi-VN"/>
+              </w:rPr>
+            </w:pPr>
+            <w:r>
+              <w:rPr>
+                <w:szCs w:val="26"/>
+              </w:rPr>
+              <w:t>0</w:t>
+            </w:r>
+            <w:r>
+              <w:rPr>
+                <w:szCs w:val="26"/>
+                <w:lang w:val="vi-VN"/>
+              </w:rPr>
+              <w:t>.62</w:t>
+            </w:r>
+          </w:p>
+        </w:tc>
+        <w:tc>
+          <w:tcPr>
+            <w:tcW w:w="1554" w:type="dxa"/>
+            <w:vAlign w:val="center"/>
+          </w:tcPr>
+          <w:p>
+            <w:pPr>
+              <w:ind w:firstLine="0"/>
+              <w:jc w:val="center"/>
+              <w:rPr>
+                <w:szCs w:val="26"/>
+                <w:lang w:val="vi-VN"/>
+              </w:rPr>
+            </w:pPr>
+            <w:r>
+              <w:rPr>
+                <w:szCs w:val="26"/>
+              </w:rPr>
+              <w:t>0</w:t>
+            </w:r>
+            <w:r>
+              <w:rPr>
+                <w:szCs w:val="26"/>
+                <w:lang w:val="vi-VN"/>
+              </w:rPr>
+              <w:t>.57</w:t>
+            </w:r>
+          </w:p>
+        </w:tc>
+        <w:tc>
+          <w:tcPr>
+            <w:tcW w:w="895" w:type="dxa"/>
+            <w:vAlign w:val="center"/>
+          </w:tcPr>
+          <w:p>
+            <w:pPr>
+              <w:ind w:firstLine="0"/>
+              <w:jc w:val="center"/>
+              <w:rPr>
+                <w:szCs w:val="26"/>
+              </w:rPr>
+            </w:pPr>
+            <w:r>
+              <w:rPr>
+                <w:szCs w:val="26"/>
+              </w:rPr>
+              <w:t>50</w:t>
+            </w:r>
+          </w:p>
+        </w:tc>
+        <w:tc>
+          <w:tcPr>
+            <w:tcW w:w="895" w:type="dxa"/>
+            <w:vAlign w:val="center"/>
+          </w:tcPr>
+          <w:p>
+            <w:pPr>
+              <w:ind w:firstLine="0"/>
+              <w:jc w:val="center"/>
+              <w:rPr>
+                <w:szCs w:val="26"/>
+              </w:rPr>
+            </w:pPr>
+            <w:r>
+              <w:rPr>
+                <w:szCs w:val="26"/>
+              </w:rPr>
+              <w:t>1967</w:t>
+            </w:r>
+          </w:p>
+        </w:tc>
+        <w:tc>
+          <w:tcPr>
+            <w:tcW w:w="1358" w:type="dxa"/>
+            <w:vAlign w:val="center"/>
+          </w:tcPr>
+          <w:p>
+            <w:pPr>
+              <w:ind w:firstLine="0"/>
+              <w:jc w:val="center"/>
+              <w:rPr>
+                <w:szCs w:val="26"/>
+              </w:rPr>
+            </w:pPr>
+            <w:r>
+              <w:rPr>
+                <w:szCs w:val="26"/>
+              </w:rPr>
+              <w:t>768</w:t>
+            </w:r>
+          </w:p>
+        </w:tc>
+        <w:tc>
+          <w:tcPr>
+            <w:tcW w:w="747" w:type="dxa"/>
+            <w:vAlign w:val="center"/>
+          </w:tcPr>
+          <w:p>
+            <w:pPr>
+              <w:ind w:firstLine="0"/>
+              <w:jc w:val="center"/>
+              <w:rPr>
+                <w:szCs w:val="26"/>
+              </w:rPr>
+            </w:pPr>
+            <w:r>
+              <w:rPr>
+                <w:szCs w:val="26"/>
+              </w:rPr>
+              <w:t>363</w:t>
+            </w:r>
+          </w:p>
+        </w:tc>
+        <w:tc>
+          <w:tcPr>
+            <w:tcW w:w="953" w:type="dxa"/>
+            <w:vAlign w:val="center"/>
+          </w:tcPr>
+          <w:p>
+            <w:pPr>
+              <w:ind w:firstLine="0"/>
+              <w:jc w:val="center"/>
+              <w:rPr>
+                <w:szCs w:val="26"/>
+              </w:rPr>
+            </w:pPr>
+            <w:r>
+              <w:rPr>
+                <w:szCs w:val="26"/>
+              </w:rPr>
+              <w:t>0.42</w:t>
+            </w:r>
+          </w:p>
+        </w:tc>
+      </w:tr>
+      <w:tr>
+        <w:tc>
+          <w:tcPr>
+            <w:tcW w:w="2757" w:type="dxa"/>
+            <w:vAlign w:val="center"/>
+          </w:tcPr>
+          <w:p>
+            <w:pPr>
+              <w:ind w:firstLine="0"/>
+              <w:jc w:val="center"/>
+              <w:rPr>
+                <w:b/>
+                <w:bCs/>
+                <w:szCs w:val="26"/>
+              </w:rPr>
+            </w:pPr>
+            <w:r>
+              <w:rPr>
+                <w:b/>
+                <w:bCs/>
+                <w:szCs w:val="26"/>
+              </w:rPr>
+              <w:t>vietnamese-bi-encoder</w:t>
+            </w:r>
+          </w:p>
+        </w:tc>
+        <w:tc>
+          <w:tcPr>
+            <w:tcW w:w="1554" w:type="dxa"/>
+            <w:vAlign w:val="center"/>
+          </w:tcPr>
+          <w:p>
+            <w:pPr>
+              <w:ind w:firstLine="0"/>
+              <w:jc w:val="center"/>
+              <w:rPr>
+                <w:szCs w:val="26"/>
+                <w:lang w:val="vi-VN"/>
+              </w:rPr>
+            </w:pPr>
+            <w:r>
+              <w:rPr>
+                <w:szCs w:val="26"/>
+                <w:lang w:val="vi-VN"/>
+              </w:rPr>
+              <w:t>1.00</w:t>
+            </w:r>
+          </w:p>
+        </w:tc>
+        <w:tc>
+          <w:tcPr>
+            <w:tcW w:w="1554" w:type="dxa"/>
+            <w:vAlign w:val="center"/>
+          </w:tcPr>
+          <w:p>
+            <w:pPr>
+              <w:ind w:firstLine="0"/>
+              <w:jc w:val="center"/>
+              <w:rPr>
+                <w:szCs w:val="26"/>
+                <w:lang w:val="vi-VN"/>
+              </w:rPr>
+            </w:pPr>
+            <w:r>
+              <w:rPr>
+                <w:szCs w:val="26"/>
+              </w:rPr>
+              <w:t>1</w:t>
+            </w:r>
+            <w:r>
+              <w:rPr>
+                <w:szCs w:val="26"/>
+                <w:lang w:val="vi-VN"/>
+              </w:rPr>
+              <w:t>.00</w:t>
+            </w:r>
+          </w:p>
+        </w:tc>
+        <w:tc>
+          <w:tcPr>
+            <w:tcW w:w="1554" w:type="dxa"/>
+            <w:vAlign w:val="center"/>
+          </w:tcPr>
+          <w:p>
+            <w:pPr>
+              <w:ind w:firstLine="0"/>
+              <w:jc w:val="center"/>
+              <w:rPr>
+                <w:szCs w:val="26"/>
+                <w:lang w:val="vi-VN"/>
+              </w:rPr>
+            </w:pPr>
+            <w:r>
+              <w:rPr>
+                <w:szCs w:val="26"/>
+              </w:rPr>
+              <w:t>0</w:t>
+            </w:r>
+            <w:r>
+              <w:rPr>
+                <w:szCs w:val="26"/>
+                <w:lang w:val="vi-VN"/>
+              </w:rPr>
+              <w:t>.88</w:t>
+            </w:r>
+          </w:p>
+        </w:tc>
+        <w:tc>
+          <w:tcPr>
+            <w:tcW w:w="895" w:type="dxa"/>
+            <w:vAlign w:val="center"/>
+          </w:tcPr>
+          <w:p>
+            <w:pPr>
+              <w:ind w:firstLine="0"/>
+              <w:jc w:val="center"/>
+              <w:rPr>
+                <w:szCs w:val="26"/>
+              </w:rPr>
+            </w:pPr>
+            <w:r>
+              <w:rPr>
+                <w:szCs w:val="26"/>
+              </w:rPr>
+              <w:t>50</w:t>
+            </w:r>
+          </w:p>
+        </w:tc>
+        <w:tc>
+          <w:tcPr>
+            <w:tcW w:w="895" w:type="dxa"/>
+            <w:vAlign w:val="center"/>
+          </w:tcPr>
+          <w:p>
+            <w:pPr>
+              <w:ind w:firstLine="0"/>
+              <w:jc w:val="center"/>
+              <w:rPr>
+                <w:szCs w:val="26"/>
+              </w:rPr>
+            </w:pPr>
+            <w:r>
+              <w:rPr>
+                <w:szCs w:val="26"/>
+              </w:rPr>
+              <w:t>1967</w:t>
+            </w:r>
+          </w:p>
+        </w:tc>
+        <w:tc>
+          <w:tcPr>
+            <w:tcW w:w="1358" w:type="dxa"/>
+            <w:vAlign w:val="center"/>
+          </w:tcPr>
+          <w:p>
+            <w:pPr>
+              <w:ind w:firstLine="0"/>
+              <w:jc w:val="center"/>
+              <w:rPr>
+                <w:szCs w:val="26"/>
+              </w:rPr>
+            </w:pPr>
+            <w:r>
+              <w:rPr>
+                <w:szCs w:val="26"/>
+              </w:rPr>
+              <w:t>768</w:t>
+            </w:r>
+          </w:p>
+        </w:tc>
+        <w:tc>
+          <w:tcPr>
+            <w:tcW w:w="747" w:type="dxa"/>
+            <w:vAlign w:val="center"/>
+          </w:tcPr>
+          <w:p>
+            <w:pPr>
+              <w:ind w:firstLine="0"/>
+              <w:jc w:val="center"/>
+              <w:rPr>
+                <w:szCs w:val="26"/>
+              </w:rPr>
+            </w:pPr>
+            <w:r>
+              <w:rPr>
+                <w:szCs w:val="26"/>
+              </w:rPr>
+              <w:t>269</w:t>
+            </w:r>
+          </w:p>
+        </w:tc>
+        <w:tc>
+          <w:tcPr>
+            <w:tcW w:w="953" w:type="dxa"/>
+            <w:vAlign w:val="center"/>
+          </w:tcPr>
+          <w:p>
+            <w:pPr>
+              <w:ind w:firstLine="0"/>
+              <w:jc w:val="center"/>
+              <w:rPr>
+                <w:szCs w:val="26"/>
+              </w:rPr>
+            </w:pPr>
+            <w:r>
+              <w:rPr>
+                <w:szCs w:val="26"/>
+              </w:rPr>
+              <w:t>0.31</w:t>
+            </w:r>
+          </w:p>
+        </w:tc>
+      </w:tr>
+      <w:bookmarkEnd w:id="0"/>
+    </w:tbl>
+    <w:p>
+      <w:pPr>
+        <w:ind w:firstLine="0"/>
+      </w:pPr>
+    </w:p>
+    <w:p>
+      <w:pPr>
+        <w:ind w:firstLine="0"/>
+      </w:pPr>
+    </w:p>
     <w:p>
       <w:pPr>
         <w:ind w:firstLine="0"/>
@@ -3314,7 +4869,6 @@
               <w:rPr>
                 <w:highlight w:val="black"/>
               </w:rPr>
-              <w:lastRenderedPageBreak/>
               <w:t>phobert-base-v2</w:t>
             </w:r>
           </w:p>
@@ -5058,6 +6612,2919 @@
               <w:ind w:firstLine="0"/>
               <w:jc w:val="center"/>
             </w:pPr>
+          </w:p>
+        </w:tc>
+      </w:tr>
+    </w:tbl>
+    <w:p>
+      <w:pPr>
+        <w:ind w:firstLine="0"/>
+      </w:pPr>
+      <w:r>
+        <w:br w:type="page"/>
+      </w:r>
+    </w:p>
+    <w:tbl>
+      <w:tblPr>
+        <w:tblStyle w:val="TableGrid"/>
+        <w:tblW w:w="0" w:type="auto"/>
+        <w:tblLook w:val="04A0" w:firstRow="1" w:lastRow="0" w:firstColumn="1" w:lastColumn="0" w:noHBand="0" w:noVBand="1"/>
+      </w:tblPr>
+      <w:tblGrid>
+        <w:gridCol w:w="2758"/>
+        <w:gridCol w:w="1284"/>
+        <w:gridCol w:w="1190"/>
+        <w:gridCol w:w="1190"/>
+        <w:gridCol w:w="1190"/>
+        <w:gridCol w:w="1190"/>
+        <w:gridCol w:w="1190"/>
+        <w:gridCol w:w="1190"/>
+        <w:gridCol w:w="1190"/>
+      </w:tblGrid>
+      <w:tr>
+        <w:tc>
+          <w:tcPr>
+            <w:tcW w:w="4042" w:type="dxa"/>
+            <w:gridSpan w:val="2"/>
+            <w:vAlign w:val="center"/>
+          </w:tcPr>
+          <w:p>
+            <w:pPr>
+              <w:ind w:firstLine="0"/>
+              <w:jc w:val="center"/>
+            </w:pPr>
+            <w:r>
+              <w:lastRenderedPageBreak/>
+              <w:t>Index</w:t>
+            </w:r>
+          </w:p>
+        </w:tc>
+        <w:tc>
+          <w:tcPr>
+            <w:tcW w:w="1190" w:type="dxa"/>
+            <w:vAlign w:val="center"/>
+          </w:tcPr>
+          <w:p>
+            <w:pPr>
+              <w:ind w:firstLine="0"/>
+              <w:jc w:val="center"/>
+            </w:pPr>
+            <w:r>
+              <w:t>0</w:t>
+            </w:r>
+          </w:p>
+        </w:tc>
+        <w:tc>
+          <w:tcPr>
+            <w:tcW w:w="1190" w:type="dxa"/>
+            <w:vAlign w:val="center"/>
+          </w:tcPr>
+          <w:p>
+            <w:pPr>
+              <w:ind w:firstLine="0"/>
+              <w:jc w:val="center"/>
+            </w:pPr>
+            <w:r>
+              <w:t>1</w:t>
+            </w:r>
+          </w:p>
+        </w:tc>
+        <w:tc>
+          <w:tcPr>
+            <w:tcW w:w="1190" w:type="dxa"/>
+            <w:vAlign w:val="center"/>
+          </w:tcPr>
+          <w:p>
+            <w:pPr>
+              <w:ind w:firstLine="0"/>
+              <w:jc w:val="center"/>
+            </w:pPr>
+            <w:r>
+              <w:t>2</w:t>
+            </w:r>
+          </w:p>
+        </w:tc>
+        <w:tc>
+          <w:tcPr>
+            <w:tcW w:w="1190" w:type="dxa"/>
+            <w:vAlign w:val="center"/>
+          </w:tcPr>
+          <w:p>
+            <w:pPr>
+              <w:ind w:firstLine="0"/>
+              <w:jc w:val="center"/>
+            </w:pPr>
+            <w:r>
+              <w:t>3</w:t>
+            </w:r>
+          </w:p>
+        </w:tc>
+        <w:tc>
+          <w:tcPr>
+            <w:tcW w:w="1190" w:type="dxa"/>
+            <w:vAlign w:val="center"/>
+          </w:tcPr>
+          <w:p>
+            <w:pPr>
+              <w:ind w:firstLine="0"/>
+              <w:jc w:val="center"/>
+            </w:pPr>
+            <w:r>
+              <w:t>4</w:t>
+            </w:r>
+          </w:p>
+        </w:tc>
+        <w:tc>
+          <w:tcPr>
+            <w:tcW w:w="1190" w:type="dxa"/>
+            <w:vAlign w:val="center"/>
+          </w:tcPr>
+          <w:p>
+            <w:pPr>
+              <w:ind w:firstLine="0"/>
+              <w:jc w:val="center"/>
+            </w:pPr>
+            <w:r>
+              <w:t>5</w:t>
+            </w:r>
+          </w:p>
+        </w:tc>
+        <w:tc>
+          <w:tcPr>
+            <w:tcW w:w="1190" w:type="dxa"/>
+            <w:vAlign w:val="center"/>
+          </w:tcPr>
+          <w:p>
+            <w:pPr>
+              <w:ind w:firstLine="0"/>
+              <w:jc w:val="center"/>
+            </w:pPr>
+            <w:r>
+              <w:t>6</w:t>
+            </w:r>
+          </w:p>
+        </w:tc>
+      </w:tr>
+      <w:tr>
+        <w:tc>
+          <w:tcPr>
+            <w:tcW w:w="2758" w:type="dxa"/>
+            <w:vMerge w:val="restart"/>
+            <w:vAlign w:val="center"/>
+          </w:tcPr>
+          <w:p>
+            <w:pPr>
+              <w:ind w:firstLine="0"/>
+              <w:jc w:val="center"/>
+            </w:pPr>
+            <w:r>
+              <w:t>all-MiniLM-L6-v2</w:t>
+            </w:r>
+          </w:p>
+        </w:tc>
+        <w:tc>
+          <w:tcPr>
+            <w:tcW w:w="1284" w:type="dxa"/>
+            <w:shd w:val="clear" w:color="auto" w:fill="84E290" w:themeFill="accent3" w:themeFillTint="66"/>
+            <w:vAlign w:val="center"/>
+          </w:tcPr>
+          <w:p>
+            <w:pPr>
+              <w:ind w:firstLine="0"/>
+              <w:jc w:val="center"/>
+            </w:pPr>
+            <w:r>
+              <w:t>Relative</w:t>
+            </w:r>
+          </w:p>
+        </w:tc>
+        <w:tc>
+          <w:tcPr>
+            <w:tcW w:w="1190" w:type="dxa"/>
+            <w:shd w:val="clear" w:color="auto" w:fill="84E290" w:themeFill="accent3" w:themeFillTint="66"/>
+            <w:vAlign w:val="center"/>
+          </w:tcPr>
+          <w:p>
+            <w:pPr>
+              <w:ind w:firstLine="0"/>
+              <w:jc w:val="center"/>
+            </w:pPr>
+            <w:r>
+              <w:t>1/5</w:t>
+            </w:r>
+          </w:p>
+        </w:tc>
+        <w:tc>
+          <w:tcPr>
+            <w:tcW w:w="1190" w:type="dxa"/>
+            <w:shd w:val="clear" w:color="auto" w:fill="84E290" w:themeFill="accent3" w:themeFillTint="66"/>
+            <w:vAlign w:val="center"/>
+          </w:tcPr>
+          <w:p>
+            <w:pPr>
+              <w:ind w:firstLine="0"/>
+              <w:jc w:val="center"/>
+            </w:pPr>
+            <w:r>
+              <w:t>0</w:t>
+            </w:r>
+          </w:p>
+        </w:tc>
+        <w:tc>
+          <w:tcPr>
+            <w:tcW w:w="1190" w:type="dxa"/>
+            <w:shd w:val="clear" w:color="auto" w:fill="84E290" w:themeFill="accent3" w:themeFillTint="66"/>
+            <w:vAlign w:val="center"/>
+          </w:tcPr>
+          <w:p>
+            <w:pPr>
+              <w:ind w:firstLine="0"/>
+              <w:jc w:val="center"/>
+            </w:pPr>
+            <w:r>
+              <w:t>0</w:t>
+            </w:r>
+          </w:p>
+        </w:tc>
+        <w:tc>
+          <w:tcPr>
+            <w:tcW w:w="1190" w:type="dxa"/>
+            <w:shd w:val="clear" w:color="auto" w:fill="84E290" w:themeFill="accent3" w:themeFillTint="66"/>
+            <w:vAlign w:val="center"/>
+          </w:tcPr>
+          <w:p>
+            <w:pPr>
+              <w:ind w:firstLine="0"/>
+              <w:jc w:val="center"/>
+            </w:pPr>
+            <w:r>
+              <w:t>1/5</w:t>
+            </w:r>
+          </w:p>
+        </w:tc>
+        <w:tc>
+          <w:tcPr>
+            <w:tcW w:w="1190" w:type="dxa"/>
+            <w:shd w:val="clear" w:color="auto" w:fill="84E290" w:themeFill="accent3" w:themeFillTint="66"/>
+            <w:vAlign w:val="center"/>
+          </w:tcPr>
+          <w:p>
+            <w:pPr>
+              <w:ind w:firstLine="0"/>
+              <w:jc w:val="center"/>
+            </w:pPr>
+            <w:r>
+              <w:t>0</w:t>
+            </w:r>
+          </w:p>
+        </w:tc>
+        <w:tc>
+          <w:tcPr>
+            <w:tcW w:w="1190" w:type="dxa"/>
+            <w:shd w:val="clear" w:color="auto" w:fill="84E290" w:themeFill="accent3" w:themeFillTint="66"/>
+            <w:vAlign w:val="center"/>
+          </w:tcPr>
+          <w:p>
+            <w:pPr>
+              <w:ind w:firstLine="0"/>
+              <w:jc w:val="center"/>
+            </w:pPr>
+            <w:r>
+              <w:t>3/5</w:t>
+            </w:r>
+          </w:p>
+        </w:tc>
+        <w:tc>
+          <w:tcPr>
+            <w:tcW w:w="1190" w:type="dxa"/>
+            <w:shd w:val="clear" w:color="auto" w:fill="84E290" w:themeFill="accent3" w:themeFillTint="66"/>
+            <w:vAlign w:val="center"/>
+          </w:tcPr>
+          <w:p>
+            <w:pPr>
+              <w:ind w:firstLine="0"/>
+              <w:jc w:val="center"/>
+            </w:pPr>
+            <w:r>
+              <w:t>1/5</w:t>
+            </w:r>
+          </w:p>
+        </w:tc>
+      </w:tr>
+      <w:tr>
+        <w:tc>
+          <w:tcPr>
+            <w:tcW w:w="2758" w:type="dxa"/>
+            <w:vMerge/>
+            <w:vAlign w:val="center"/>
+          </w:tcPr>
+          <w:p>
+            <w:pPr>
+              <w:ind w:firstLine="0"/>
+              <w:jc w:val="center"/>
+            </w:pPr>
+          </w:p>
+        </w:tc>
+        <w:tc>
+          <w:tcPr>
+            <w:tcW w:w="1284" w:type="dxa"/>
+            <w:vAlign w:val="center"/>
+          </w:tcPr>
+          <w:p>
+            <w:pPr>
+              <w:ind w:firstLine="0"/>
+              <w:jc w:val="center"/>
+              <w:rPr>
+                <w:lang w:val="vi-VN"/>
+              </w:rPr>
+            </w:pPr>
+            <w:r>
+              <w:t>Rank</w:t>
+            </w:r>
+          </w:p>
+        </w:tc>
+        <w:tc>
+          <w:tcPr>
+            <w:tcW w:w="1190" w:type="dxa"/>
+            <w:vAlign w:val="center"/>
+          </w:tcPr>
+          <w:p>
+            <w:pPr>
+              <w:ind w:firstLine="0"/>
+              <w:jc w:val="center"/>
+            </w:pPr>
+            <w:r>
+              <w:t>1</w:t>
+            </w:r>
+          </w:p>
+        </w:tc>
+        <w:tc>
+          <w:tcPr>
+            <w:tcW w:w="1190" w:type="dxa"/>
+            <w:vAlign w:val="center"/>
+          </w:tcPr>
+          <w:p>
+            <w:pPr>
+              <w:ind w:firstLine="0"/>
+              <w:jc w:val="center"/>
+            </w:pPr>
+            <w:r>
+              <w:t>0</w:t>
+            </w:r>
+          </w:p>
+        </w:tc>
+        <w:tc>
+          <w:tcPr>
+            <w:tcW w:w="1190" w:type="dxa"/>
+            <w:vAlign w:val="center"/>
+          </w:tcPr>
+          <w:p>
+            <w:pPr>
+              <w:ind w:firstLine="0"/>
+              <w:jc w:val="center"/>
+            </w:pPr>
+            <w:r>
+              <w:t>0</w:t>
+            </w:r>
+          </w:p>
+        </w:tc>
+        <w:tc>
+          <w:tcPr>
+            <w:tcW w:w="1190" w:type="dxa"/>
+            <w:vAlign w:val="center"/>
+          </w:tcPr>
+          <w:p>
+            <w:pPr>
+              <w:ind w:firstLine="0"/>
+              <w:jc w:val="center"/>
+              <w:rPr>
+                <w:lang w:val="vi-VN"/>
+              </w:rPr>
+            </w:pPr>
+            <w:r>
+              <w:rPr>
+                <w:lang w:val="vi-VN"/>
+              </w:rPr>
+              <w:t>1</w:t>
+            </w:r>
+          </w:p>
+        </w:tc>
+        <w:tc>
+          <w:tcPr>
+            <w:tcW w:w="1190" w:type="dxa"/>
+            <w:vAlign w:val="center"/>
+          </w:tcPr>
+          <w:p>
+            <w:pPr>
+              <w:ind w:firstLine="0"/>
+              <w:jc w:val="center"/>
+            </w:pPr>
+            <w:r>
+              <w:t>0</w:t>
+            </w:r>
+          </w:p>
+        </w:tc>
+        <w:tc>
+          <w:tcPr>
+            <w:tcW w:w="1190" w:type="dxa"/>
+            <w:vAlign w:val="center"/>
+          </w:tcPr>
+          <w:p>
+            <w:pPr>
+              <w:ind w:firstLine="0"/>
+              <w:jc w:val="center"/>
+            </w:pPr>
+            <w:r>
+              <w:t>1,2,3</w:t>
+            </w:r>
+          </w:p>
+        </w:tc>
+        <w:tc>
+          <w:tcPr>
+            <w:tcW w:w="1190" w:type="dxa"/>
+            <w:vAlign w:val="center"/>
+          </w:tcPr>
+          <w:p>
+            <w:pPr>
+              <w:ind w:firstLine="0"/>
+              <w:jc w:val="center"/>
+              <w:rPr>
+                <w:lang w:val="vi-VN"/>
+              </w:rPr>
+            </w:pPr>
+            <w:r>
+              <w:t>1</w:t>
+            </w:r>
+          </w:p>
+        </w:tc>
+      </w:tr>
+      <w:tr>
+        <w:tc>
+          <w:tcPr>
+            <w:tcW w:w="2758" w:type="dxa"/>
+            <w:vMerge/>
+            <w:vAlign w:val="center"/>
+          </w:tcPr>
+          <w:p>
+            <w:pPr>
+              <w:ind w:firstLine="0"/>
+              <w:jc w:val="center"/>
+            </w:pPr>
+          </w:p>
+        </w:tc>
+        <w:tc>
+          <w:tcPr>
+            <w:tcW w:w="1284" w:type="dxa"/>
+            <w:vAlign w:val="center"/>
+          </w:tcPr>
+          <w:p>
+            <w:pPr>
+              <w:ind w:firstLine="0"/>
+              <w:jc w:val="center"/>
+            </w:pPr>
+            <w:r>
+              <w:t>Correct</w:t>
+            </w:r>
+          </w:p>
+        </w:tc>
+        <w:tc>
+          <w:tcPr>
+            <w:tcW w:w="1190" w:type="dxa"/>
+            <w:vAlign w:val="center"/>
+          </w:tcPr>
+          <w:p>
+            <w:pPr>
+              <w:ind w:firstLine="0"/>
+              <w:jc w:val="center"/>
+              <w:rPr>
+                <w:lang w:val="vi-VN"/>
+              </w:rPr>
+            </w:pPr>
+            <w:r>
+              <w:t>1</w:t>
+            </w:r>
+          </w:p>
+        </w:tc>
+        <w:tc>
+          <w:tcPr>
+            <w:tcW w:w="1190" w:type="dxa"/>
+            <w:vAlign w:val="center"/>
+          </w:tcPr>
+          <w:p>
+            <w:pPr>
+              <w:ind w:firstLine="0"/>
+              <w:jc w:val="center"/>
+            </w:pPr>
+            <w:r>
+              <w:t>0</w:t>
+            </w:r>
+          </w:p>
+        </w:tc>
+        <w:tc>
+          <w:tcPr>
+            <w:tcW w:w="1190" w:type="dxa"/>
+            <w:vAlign w:val="center"/>
+          </w:tcPr>
+          <w:p>
+            <w:pPr>
+              <w:ind w:firstLine="0"/>
+              <w:jc w:val="center"/>
+            </w:pPr>
+            <w:r>
+              <w:t>0</w:t>
+            </w:r>
+          </w:p>
+        </w:tc>
+        <w:tc>
+          <w:tcPr>
+            <w:tcW w:w="1190" w:type="dxa"/>
+            <w:vAlign w:val="center"/>
+          </w:tcPr>
+          <w:p>
+            <w:pPr>
+              <w:ind w:firstLine="0"/>
+              <w:jc w:val="center"/>
+              <w:rPr>
+                <w:lang w:val="vi-VN"/>
+              </w:rPr>
+            </w:pPr>
+            <w:r>
+              <w:rPr>
+                <w:lang w:val="vi-VN"/>
+              </w:rPr>
+              <w:t>1</w:t>
+            </w:r>
+          </w:p>
+        </w:tc>
+        <w:tc>
+          <w:tcPr>
+            <w:tcW w:w="1190" w:type="dxa"/>
+            <w:vAlign w:val="center"/>
+          </w:tcPr>
+          <w:p>
+            <w:pPr>
+              <w:ind w:firstLine="0"/>
+              <w:jc w:val="center"/>
+            </w:pPr>
+            <w:r>
+              <w:t>0</w:t>
+            </w:r>
+          </w:p>
+        </w:tc>
+        <w:tc>
+          <w:tcPr>
+            <w:tcW w:w="1190" w:type="dxa"/>
+            <w:vAlign w:val="center"/>
+          </w:tcPr>
+          <w:p>
+            <w:pPr>
+              <w:ind w:firstLine="0"/>
+              <w:jc w:val="center"/>
+              <w:rPr>
+                <w:lang w:val="vi-VN"/>
+              </w:rPr>
+            </w:pPr>
+            <w:r>
+              <w:rPr>
+                <w:lang w:val="vi-VN"/>
+              </w:rPr>
+              <w:t>1,2</w:t>
+            </w:r>
+          </w:p>
+        </w:tc>
+        <w:tc>
+          <w:tcPr>
+            <w:tcW w:w="1190" w:type="dxa"/>
+            <w:vAlign w:val="center"/>
+          </w:tcPr>
+          <w:p>
+            <w:pPr>
+              <w:ind w:firstLine="0"/>
+              <w:jc w:val="center"/>
+              <w:rPr>
+                <w:lang w:val="vi-VN"/>
+              </w:rPr>
+            </w:pPr>
+            <w:r>
+              <w:t>1</w:t>
+            </w:r>
+          </w:p>
+        </w:tc>
+      </w:tr>
+      <w:tr>
+        <w:tc>
+          <w:tcPr>
+            <w:tcW w:w="2758" w:type="dxa"/>
+            <w:vMerge w:val="restart"/>
+            <w:vAlign w:val="center"/>
+          </w:tcPr>
+          <w:p>
+            <w:pPr>
+              <w:ind w:firstLine="0"/>
+              <w:jc w:val="center"/>
+            </w:pPr>
+            <w:r>
+              <w:t>bert-base-vietnamese-uncased</w:t>
+            </w:r>
+          </w:p>
+        </w:tc>
+        <w:tc>
+          <w:tcPr>
+            <w:tcW w:w="1284" w:type="dxa"/>
+            <w:shd w:val="clear" w:color="auto" w:fill="84E290" w:themeFill="accent3" w:themeFillTint="66"/>
+            <w:vAlign w:val="center"/>
+          </w:tcPr>
+          <w:p>
+            <w:pPr>
+              <w:ind w:firstLine="0"/>
+              <w:jc w:val="center"/>
+            </w:pPr>
+            <w:r>
+              <w:t>Relative</w:t>
+            </w:r>
+          </w:p>
+        </w:tc>
+        <w:tc>
+          <w:tcPr>
+            <w:tcW w:w="1190" w:type="dxa"/>
+            <w:shd w:val="clear" w:color="auto" w:fill="84E290" w:themeFill="accent3" w:themeFillTint="66"/>
+            <w:vAlign w:val="center"/>
+          </w:tcPr>
+          <w:p>
+            <w:pPr>
+              <w:ind w:firstLine="0"/>
+              <w:jc w:val="center"/>
+            </w:pPr>
+            <w:r>
+              <w:t>5/5</w:t>
+            </w:r>
+          </w:p>
+        </w:tc>
+        <w:tc>
+          <w:tcPr>
+            <w:tcW w:w="1190" w:type="dxa"/>
+            <w:shd w:val="clear" w:color="auto" w:fill="84E290" w:themeFill="accent3" w:themeFillTint="66"/>
+            <w:vAlign w:val="center"/>
+          </w:tcPr>
+          <w:p>
+            <w:pPr>
+              <w:ind w:firstLine="0"/>
+              <w:jc w:val="center"/>
+            </w:pPr>
+            <w:r>
+              <w:t>4/5</w:t>
+            </w:r>
+          </w:p>
+        </w:tc>
+        <w:tc>
+          <w:tcPr>
+            <w:tcW w:w="1190" w:type="dxa"/>
+            <w:shd w:val="clear" w:color="auto" w:fill="84E290" w:themeFill="accent3" w:themeFillTint="66"/>
+            <w:vAlign w:val="center"/>
+          </w:tcPr>
+          <w:p>
+            <w:pPr>
+              <w:ind w:firstLine="0"/>
+              <w:jc w:val="center"/>
+            </w:pPr>
+            <w:r>
+              <w:t>1/5</w:t>
+            </w:r>
+          </w:p>
+        </w:tc>
+        <w:tc>
+          <w:tcPr>
+            <w:tcW w:w="1190" w:type="dxa"/>
+            <w:shd w:val="clear" w:color="auto" w:fill="84E290" w:themeFill="accent3" w:themeFillTint="66"/>
+            <w:vAlign w:val="center"/>
+          </w:tcPr>
+          <w:p>
+            <w:pPr>
+              <w:ind w:firstLine="0"/>
+              <w:jc w:val="center"/>
+            </w:pPr>
+            <w:r>
+              <w:t>2/5</w:t>
+            </w:r>
+          </w:p>
+        </w:tc>
+        <w:tc>
+          <w:tcPr>
+            <w:tcW w:w="1190" w:type="dxa"/>
+            <w:shd w:val="clear" w:color="auto" w:fill="84E290" w:themeFill="accent3" w:themeFillTint="66"/>
+            <w:vAlign w:val="center"/>
+          </w:tcPr>
+          <w:p>
+            <w:pPr>
+              <w:ind w:firstLine="0"/>
+              <w:jc w:val="center"/>
+            </w:pPr>
+            <w:r>
+              <w:t>0</w:t>
+            </w:r>
+          </w:p>
+        </w:tc>
+        <w:tc>
+          <w:tcPr>
+            <w:tcW w:w="1190" w:type="dxa"/>
+            <w:shd w:val="clear" w:color="auto" w:fill="84E290" w:themeFill="accent3" w:themeFillTint="66"/>
+            <w:vAlign w:val="center"/>
+          </w:tcPr>
+          <w:p>
+            <w:pPr>
+              <w:ind w:firstLine="0"/>
+              <w:jc w:val="center"/>
+            </w:pPr>
+            <w:r>
+              <w:t>0</w:t>
+            </w:r>
+          </w:p>
+        </w:tc>
+        <w:tc>
+          <w:tcPr>
+            <w:tcW w:w="1190" w:type="dxa"/>
+            <w:shd w:val="clear" w:color="auto" w:fill="84E290" w:themeFill="accent3" w:themeFillTint="66"/>
+            <w:vAlign w:val="center"/>
+          </w:tcPr>
+          <w:p>
+            <w:pPr>
+              <w:ind w:firstLine="0"/>
+              <w:jc w:val="center"/>
+            </w:pPr>
+            <w:r>
+              <w:t>5/5</w:t>
+            </w:r>
+          </w:p>
+        </w:tc>
+      </w:tr>
+      <w:tr>
+        <w:tc>
+          <w:tcPr>
+            <w:tcW w:w="2758" w:type="dxa"/>
+            <w:vMerge/>
+            <w:vAlign w:val="center"/>
+          </w:tcPr>
+          <w:p>
+            <w:pPr>
+              <w:ind w:firstLine="0"/>
+              <w:jc w:val="center"/>
+            </w:pPr>
+          </w:p>
+        </w:tc>
+        <w:tc>
+          <w:tcPr>
+            <w:tcW w:w="1284" w:type="dxa"/>
+            <w:vAlign w:val="center"/>
+          </w:tcPr>
+          <w:p>
+            <w:pPr>
+              <w:ind w:firstLine="0"/>
+              <w:jc w:val="center"/>
+              <w:rPr>
+                <w:lang w:val="vi-VN"/>
+              </w:rPr>
+            </w:pPr>
+            <w:r>
+              <w:t>Rank</w:t>
+            </w:r>
+          </w:p>
+        </w:tc>
+        <w:tc>
+          <w:tcPr>
+            <w:tcW w:w="1190" w:type="dxa"/>
+            <w:vAlign w:val="center"/>
+          </w:tcPr>
+          <w:p>
+            <w:pPr>
+              <w:ind w:firstLine="0"/>
+              <w:jc w:val="center"/>
+            </w:pPr>
+            <w:r>
+              <w:t>1,2,3,4,5</w:t>
+            </w:r>
+          </w:p>
+        </w:tc>
+        <w:tc>
+          <w:tcPr>
+            <w:tcW w:w="1190" w:type="dxa"/>
+            <w:vAlign w:val="center"/>
+          </w:tcPr>
+          <w:p>
+            <w:pPr>
+              <w:ind w:firstLine="0"/>
+              <w:jc w:val="center"/>
+            </w:pPr>
+            <w:r>
+              <w:t>1,2,3,5</w:t>
+            </w:r>
+          </w:p>
+        </w:tc>
+        <w:tc>
+          <w:tcPr>
+            <w:tcW w:w="1190" w:type="dxa"/>
+            <w:vAlign w:val="center"/>
+          </w:tcPr>
+          <w:p>
+            <w:pPr>
+              <w:ind w:firstLine="0"/>
+              <w:jc w:val="center"/>
+            </w:pPr>
+            <w:r>
+              <w:t>5</w:t>
+            </w:r>
+          </w:p>
+        </w:tc>
+        <w:tc>
+          <w:tcPr>
+            <w:tcW w:w="1190" w:type="dxa"/>
+            <w:vAlign w:val="center"/>
+          </w:tcPr>
+          <w:p>
+            <w:pPr>
+              <w:ind w:firstLine="0"/>
+              <w:jc w:val="center"/>
+            </w:pPr>
+            <w:r>
+              <w:t>2,4</w:t>
+            </w:r>
+          </w:p>
+        </w:tc>
+        <w:tc>
+          <w:tcPr>
+            <w:tcW w:w="1190" w:type="dxa"/>
+            <w:vAlign w:val="center"/>
+          </w:tcPr>
+          <w:p>
+            <w:pPr>
+              <w:ind w:firstLine="0"/>
+              <w:jc w:val="center"/>
+            </w:pPr>
+            <w:r>
+              <w:t>0</w:t>
+            </w:r>
+          </w:p>
+        </w:tc>
+        <w:tc>
+          <w:tcPr>
+            <w:tcW w:w="1190" w:type="dxa"/>
+            <w:vAlign w:val="center"/>
+          </w:tcPr>
+          <w:p>
+            <w:pPr>
+              <w:ind w:firstLine="0"/>
+              <w:jc w:val="center"/>
+            </w:pPr>
+            <w:r>
+              <w:t>0</w:t>
+            </w:r>
+          </w:p>
+        </w:tc>
+        <w:tc>
+          <w:tcPr>
+            <w:tcW w:w="1190" w:type="dxa"/>
+            <w:vAlign w:val="center"/>
+          </w:tcPr>
+          <w:p>
+            <w:pPr>
+              <w:ind w:firstLine="0"/>
+              <w:jc w:val="center"/>
+            </w:pPr>
+            <w:r>
+              <w:t>1,2,3,4,5</w:t>
+            </w:r>
+          </w:p>
+        </w:tc>
+      </w:tr>
+      <w:tr>
+        <w:tc>
+          <w:tcPr>
+            <w:tcW w:w="2758" w:type="dxa"/>
+            <w:vMerge/>
+            <w:vAlign w:val="center"/>
+          </w:tcPr>
+          <w:p>
+            <w:pPr>
+              <w:ind w:firstLine="0"/>
+              <w:jc w:val="center"/>
+            </w:pPr>
+          </w:p>
+        </w:tc>
+        <w:tc>
+          <w:tcPr>
+            <w:tcW w:w="1284" w:type="dxa"/>
+            <w:vAlign w:val="center"/>
+          </w:tcPr>
+          <w:p>
+            <w:pPr>
+              <w:ind w:firstLine="0"/>
+              <w:jc w:val="center"/>
+            </w:pPr>
+            <w:r>
+              <w:t>Correct</w:t>
+            </w:r>
+          </w:p>
+        </w:tc>
+        <w:tc>
+          <w:tcPr>
+            <w:tcW w:w="1190" w:type="dxa"/>
+            <w:vAlign w:val="center"/>
+          </w:tcPr>
+          <w:p>
+            <w:pPr>
+              <w:ind w:firstLine="0"/>
+              <w:jc w:val="center"/>
+              <w:rPr>
+                <w:lang w:val="vi-VN"/>
+              </w:rPr>
+            </w:pPr>
+            <w:r>
+              <w:rPr>
+                <w:lang w:val="vi-VN"/>
+              </w:rPr>
+              <w:t>1,3,4</w:t>
+            </w:r>
+          </w:p>
+        </w:tc>
+        <w:tc>
+          <w:tcPr>
+            <w:tcW w:w="1190" w:type="dxa"/>
+            <w:vAlign w:val="center"/>
+          </w:tcPr>
+          <w:p>
+            <w:pPr>
+              <w:ind w:firstLine="0"/>
+              <w:jc w:val="center"/>
+              <w:rPr>
+                <w:lang w:val="vi-VN"/>
+              </w:rPr>
+            </w:pPr>
+            <w:r>
+              <w:t>1</w:t>
+            </w:r>
+            <w:r>
+              <w:rPr>
+                <w:lang w:val="vi-VN"/>
+              </w:rPr>
+              <w:t>,2,5</w:t>
+            </w:r>
+          </w:p>
+        </w:tc>
+        <w:tc>
+          <w:tcPr>
+            <w:tcW w:w="1190" w:type="dxa"/>
+            <w:vAlign w:val="center"/>
+          </w:tcPr>
+          <w:p>
+            <w:pPr>
+              <w:ind w:firstLine="0"/>
+              <w:jc w:val="center"/>
+            </w:pPr>
+            <w:r>
+              <w:t>5</w:t>
+            </w:r>
+          </w:p>
+        </w:tc>
+        <w:tc>
+          <w:tcPr>
+            <w:tcW w:w="1190" w:type="dxa"/>
+            <w:vAlign w:val="center"/>
+          </w:tcPr>
+          <w:p>
+            <w:pPr>
+              <w:ind w:firstLine="0"/>
+              <w:jc w:val="center"/>
+              <w:rPr>
+                <w:lang w:val="vi-VN"/>
+              </w:rPr>
+            </w:pPr>
+            <w:r>
+              <w:t>2</w:t>
+            </w:r>
+            <w:r>
+              <w:rPr>
+                <w:lang w:val="vi-VN"/>
+              </w:rPr>
+              <w:t>,4</w:t>
+            </w:r>
+          </w:p>
+        </w:tc>
+        <w:tc>
+          <w:tcPr>
+            <w:tcW w:w="1190" w:type="dxa"/>
+            <w:vAlign w:val="center"/>
+          </w:tcPr>
+          <w:p>
+            <w:pPr>
+              <w:ind w:firstLine="0"/>
+              <w:jc w:val="center"/>
+            </w:pPr>
+            <w:r>
+              <w:t>0</w:t>
+            </w:r>
+          </w:p>
+        </w:tc>
+        <w:tc>
+          <w:tcPr>
+            <w:tcW w:w="1190" w:type="dxa"/>
+            <w:vAlign w:val="center"/>
+          </w:tcPr>
+          <w:p>
+            <w:pPr>
+              <w:ind w:firstLine="0"/>
+              <w:jc w:val="center"/>
+            </w:pPr>
+            <w:r>
+              <w:t>0</w:t>
+            </w:r>
+          </w:p>
+        </w:tc>
+        <w:tc>
+          <w:tcPr>
+            <w:tcW w:w="1190" w:type="dxa"/>
+            <w:vAlign w:val="center"/>
+          </w:tcPr>
+          <w:p>
+            <w:pPr>
+              <w:ind w:firstLine="0"/>
+              <w:jc w:val="center"/>
+              <w:rPr>
+                <w:lang w:val="vi-VN"/>
+              </w:rPr>
+            </w:pPr>
+            <w:r>
+              <w:t>1</w:t>
+            </w:r>
+            <w:r>
+              <w:rPr>
+                <w:lang w:val="vi-VN"/>
+              </w:rPr>
+              <w:t>,2,3,4,5</w:t>
+            </w:r>
+          </w:p>
+        </w:tc>
+      </w:tr>
+      <w:tr>
+        <w:tc>
+          <w:tcPr>
+            <w:tcW w:w="2758" w:type="dxa"/>
+            <w:vMerge w:val="restart"/>
+            <w:vAlign w:val="center"/>
+          </w:tcPr>
+          <w:p>
+            <w:pPr>
+              <w:ind w:firstLine="0"/>
+              <w:jc w:val="center"/>
+            </w:pPr>
+            <w:r>
+              <w:t>distiluse-base-multilingual-cased-v2</w:t>
+            </w:r>
+          </w:p>
+        </w:tc>
+        <w:tc>
+          <w:tcPr>
+            <w:tcW w:w="1284" w:type="dxa"/>
+            <w:shd w:val="clear" w:color="auto" w:fill="84E290" w:themeFill="accent3" w:themeFillTint="66"/>
+            <w:vAlign w:val="center"/>
+          </w:tcPr>
+          <w:p>
+            <w:pPr>
+              <w:ind w:firstLine="0"/>
+              <w:jc w:val="center"/>
+            </w:pPr>
+            <w:r>
+              <w:t>Relative</w:t>
+            </w:r>
+          </w:p>
+        </w:tc>
+        <w:tc>
+          <w:tcPr>
+            <w:tcW w:w="1190" w:type="dxa"/>
+            <w:shd w:val="clear" w:color="auto" w:fill="84E290" w:themeFill="accent3" w:themeFillTint="66"/>
+            <w:vAlign w:val="center"/>
+          </w:tcPr>
+          <w:p>
+            <w:pPr>
+              <w:ind w:firstLine="0"/>
+              <w:jc w:val="center"/>
+            </w:pPr>
+            <w:r>
+              <w:t>4/5</w:t>
+            </w:r>
+          </w:p>
+        </w:tc>
+        <w:tc>
+          <w:tcPr>
+            <w:tcW w:w="1190" w:type="dxa"/>
+            <w:shd w:val="clear" w:color="auto" w:fill="84E290" w:themeFill="accent3" w:themeFillTint="66"/>
+            <w:vAlign w:val="center"/>
+          </w:tcPr>
+          <w:p>
+            <w:pPr>
+              <w:ind w:firstLine="0"/>
+              <w:jc w:val="center"/>
+            </w:pPr>
+            <w:r>
+              <w:t>5/5</w:t>
+            </w:r>
+          </w:p>
+        </w:tc>
+        <w:tc>
+          <w:tcPr>
+            <w:tcW w:w="1190" w:type="dxa"/>
+            <w:shd w:val="clear" w:color="auto" w:fill="84E290" w:themeFill="accent3" w:themeFillTint="66"/>
+            <w:vAlign w:val="center"/>
+          </w:tcPr>
+          <w:p>
+            <w:pPr>
+              <w:ind w:firstLine="0"/>
+              <w:jc w:val="center"/>
+            </w:pPr>
+            <w:r>
+              <w:t>0</w:t>
+            </w:r>
+          </w:p>
+        </w:tc>
+        <w:tc>
+          <w:tcPr>
+            <w:tcW w:w="1190" w:type="dxa"/>
+            <w:shd w:val="clear" w:color="auto" w:fill="84E290" w:themeFill="accent3" w:themeFillTint="66"/>
+            <w:vAlign w:val="center"/>
+          </w:tcPr>
+          <w:p>
+            <w:pPr>
+              <w:ind w:firstLine="0"/>
+              <w:jc w:val="center"/>
+            </w:pPr>
+            <w:r>
+              <w:t>0</w:t>
+            </w:r>
+          </w:p>
+        </w:tc>
+        <w:tc>
+          <w:tcPr>
+            <w:tcW w:w="1190" w:type="dxa"/>
+            <w:shd w:val="clear" w:color="auto" w:fill="84E290" w:themeFill="accent3" w:themeFillTint="66"/>
+            <w:vAlign w:val="center"/>
+          </w:tcPr>
+          <w:p>
+            <w:pPr>
+              <w:ind w:firstLine="0"/>
+              <w:jc w:val="center"/>
+            </w:pPr>
+            <w:r>
+              <w:t>0</w:t>
+            </w:r>
+          </w:p>
+        </w:tc>
+        <w:tc>
+          <w:tcPr>
+            <w:tcW w:w="1190" w:type="dxa"/>
+            <w:shd w:val="clear" w:color="auto" w:fill="84E290" w:themeFill="accent3" w:themeFillTint="66"/>
+            <w:vAlign w:val="center"/>
+          </w:tcPr>
+          <w:p>
+            <w:pPr>
+              <w:ind w:firstLine="0"/>
+              <w:jc w:val="center"/>
+            </w:pPr>
+            <w:r>
+              <w:t>5/5</w:t>
+            </w:r>
+          </w:p>
+        </w:tc>
+        <w:tc>
+          <w:tcPr>
+            <w:tcW w:w="1190" w:type="dxa"/>
+            <w:shd w:val="clear" w:color="auto" w:fill="84E290" w:themeFill="accent3" w:themeFillTint="66"/>
+            <w:vAlign w:val="center"/>
+          </w:tcPr>
+          <w:p>
+            <w:pPr>
+              <w:ind w:firstLine="0"/>
+              <w:jc w:val="center"/>
+            </w:pPr>
+            <w:r>
+              <w:t>5/5</w:t>
+            </w:r>
+          </w:p>
+        </w:tc>
+      </w:tr>
+      <w:tr>
+        <w:tc>
+          <w:tcPr>
+            <w:tcW w:w="2758" w:type="dxa"/>
+            <w:vMerge/>
+            <w:vAlign w:val="center"/>
+          </w:tcPr>
+          <w:p>
+            <w:pPr>
+              <w:ind w:firstLine="0"/>
+              <w:jc w:val="center"/>
+            </w:pPr>
+          </w:p>
+        </w:tc>
+        <w:tc>
+          <w:tcPr>
+            <w:tcW w:w="1284" w:type="dxa"/>
+            <w:vAlign w:val="center"/>
+          </w:tcPr>
+          <w:p>
+            <w:pPr>
+              <w:ind w:firstLine="0"/>
+              <w:jc w:val="center"/>
+              <w:rPr>
+                <w:lang w:val="vi-VN"/>
+              </w:rPr>
+            </w:pPr>
+            <w:r>
+              <w:t>Rank</w:t>
+            </w:r>
+          </w:p>
+        </w:tc>
+        <w:tc>
+          <w:tcPr>
+            <w:tcW w:w="1190" w:type="dxa"/>
+            <w:vAlign w:val="center"/>
+          </w:tcPr>
+          <w:p>
+            <w:pPr>
+              <w:ind w:firstLine="0"/>
+              <w:jc w:val="center"/>
+              <w:rPr>
+                <w:lang w:val="vi-VN"/>
+              </w:rPr>
+            </w:pPr>
+            <w:r>
+              <w:t>1,2,3,4,</w:t>
+            </w:r>
+          </w:p>
+        </w:tc>
+        <w:tc>
+          <w:tcPr>
+            <w:tcW w:w="1190" w:type="dxa"/>
+            <w:vAlign w:val="center"/>
+          </w:tcPr>
+          <w:p>
+            <w:pPr>
+              <w:ind w:firstLine="0"/>
+              <w:jc w:val="center"/>
+            </w:pPr>
+            <w:r>
+              <w:t>1,2,3,4,5</w:t>
+            </w:r>
+          </w:p>
+        </w:tc>
+        <w:tc>
+          <w:tcPr>
+            <w:tcW w:w="1190" w:type="dxa"/>
+            <w:vAlign w:val="center"/>
+          </w:tcPr>
+          <w:p>
+            <w:pPr>
+              <w:ind w:firstLine="0"/>
+              <w:jc w:val="center"/>
+            </w:pPr>
+            <w:r>
+              <w:t>0</w:t>
+            </w:r>
+          </w:p>
+        </w:tc>
+        <w:tc>
+          <w:tcPr>
+            <w:tcW w:w="1190" w:type="dxa"/>
+            <w:vAlign w:val="center"/>
+          </w:tcPr>
+          <w:p>
+            <w:pPr>
+              <w:ind w:firstLine="0"/>
+              <w:jc w:val="center"/>
+            </w:pPr>
+            <w:r>
+              <w:t>0</w:t>
+            </w:r>
+          </w:p>
+        </w:tc>
+        <w:tc>
+          <w:tcPr>
+            <w:tcW w:w="1190" w:type="dxa"/>
+            <w:vAlign w:val="center"/>
+          </w:tcPr>
+          <w:p>
+            <w:pPr>
+              <w:ind w:firstLine="0"/>
+              <w:jc w:val="center"/>
+            </w:pPr>
+            <w:r>
+              <w:t>0</w:t>
+            </w:r>
+          </w:p>
+        </w:tc>
+        <w:tc>
+          <w:tcPr>
+            <w:tcW w:w="1190" w:type="dxa"/>
+            <w:vAlign w:val="center"/>
+          </w:tcPr>
+          <w:p>
+            <w:pPr>
+              <w:ind w:firstLine="0"/>
+              <w:jc w:val="center"/>
+            </w:pPr>
+            <w:r>
+              <w:t>1,2,3,4,5</w:t>
+            </w:r>
+          </w:p>
+        </w:tc>
+        <w:tc>
+          <w:tcPr>
+            <w:tcW w:w="1190" w:type="dxa"/>
+            <w:vAlign w:val="center"/>
+          </w:tcPr>
+          <w:p>
+            <w:pPr>
+              <w:ind w:firstLine="0"/>
+              <w:jc w:val="center"/>
+            </w:pPr>
+            <w:r>
+              <w:t>1,2,3,4,5</w:t>
+            </w:r>
+          </w:p>
+        </w:tc>
+      </w:tr>
+      <w:tr>
+        <w:tc>
+          <w:tcPr>
+            <w:tcW w:w="2758" w:type="dxa"/>
+            <w:vMerge/>
+            <w:vAlign w:val="center"/>
+          </w:tcPr>
+          <w:p>
+            <w:pPr>
+              <w:ind w:firstLine="0"/>
+              <w:jc w:val="center"/>
+            </w:pPr>
+          </w:p>
+        </w:tc>
+        <w:tc>
+          <w:tcPr>
+            <w:tcW w:w="1284" w:type="dxa"/>
+            <w:vAlign w:val="center"/>
+          </w:tcPr>
+          <w:p>
+            <w:pPr>
+              <w:ind w:firstLine="0"/>
+              <w:jc w:val="center"/>
+            </w:pPr>
+            <w:r>
+              <w:t>Correct</w:t>
+            </w:r>
+          </w:p>
+        </w:tc>
+        <w:tc>
+          <w:tcPr>
+            <w:tcW w:w="1190" w:type="dxa"/>
+            <w:vAlign w:val="center"/>
+          </w:tcPr>
+          <w:p>
+            <w:pPr>
+              <w:ind w:firstLine="0"/>
+              <w:jc w:val="center"/>
+              <w:rPr>
+                <w:lang w:val="vi-VN"/>
+              </w:rPr>
+            </w:pPr>
+            <w:r>
+              <w:t>1</w:t>
+            </w:r>
+            <w:r>
+              <w:rPr>
+                <w:lang w:val="vi-VN"/>
+              </w:rPr>
+              <w:t>,2,3,4</w:t>
+            </w:r>
+          </w:p>
+        </w:tc>
+        <w:tc>
+          <w:tcPr>
+            <w:tcW w:w="1190" w:type="dxa"/>
+            <w:vAlign w:val="center"/>
+          </w:tcPr>
+          <w:p>
+            <w:pPr>
+              <w:ind w:firstLine="0"/>
+              <w:jc w:val="center"/>
+              <w:rPr>
+                <w:lang w:val="vi-VN"/>
+              </w:rPr>
+            </w:pPr>
+            <w:r>
+              <w:t>1</w:t>
+            </w:r>
+            <w:r>
+              <w:rPr>
+                <w:lang w:val="vi-VN"/>
+              </w:rPr>
+              <w:t>,2,3,4,5</w:t>
+            </w:r>
+          </w:p>
+        </w:tc>
+        <w:tc>
+          <w:tcPr>
+            <w:tcW w:w="1190" w:type="dxa"/>
+            <w:vAlign w:val="center"/>
+          </w:tcPr>
+          <w:p>
+            <w:pPr>
+              <w:ind w:firstLine="0"/>
+              <w:jc w:val="center"/>
+            </w:pPr>
+            <w:r>
+              <w:t>0</w:t>
+            </w:r>
+          </w:p>
+        </w:tc>
+        <w:tc>
+          <w:tcPr>
+            <w:tcW w:w="1190" w:type="dxa"/>
+            <w:vAlign w:val="center"/>
+          </w:tcPr>
+          <w:p>
+            <w:pPr>
+              <w:ind w:firstLine="0"/>
+              <w:jc w:val="center"/>
+            </w:pPr>
+            <w:r>
+              <w:t>0</w:t>
+            </w:r>
+          </w:p>
+        </w:tc>
+        <w:tc>
+          <w:tcPr>
+            <w:tcW w:w="1190" w:type="dxa"/>
+            <w:vAlign w:val="center"/>
+          </w:tcPr>
+          <w:p>
+            <w:pPr>
+              <w:ind w:firstLine="0"/>
+              <w:jc w:val="center"/>
+            </w:pPr>
+            <w:r>
+              <w:t>0</w:t>
+            </w:r>
+          </w:p>
+        </w:tc>
+        <w:tc>
+          <w:tcPr>
+            <w:tcW w:w="1190" w:type="dxa"/>
+            <w:vAlign w:val="center"/>
+          </w:tcPr>
+          <w:p>
+            <w:pPr>
+              <w:ind w:firstLine="0"/>
+              <w:jc w:val="center"/>
+              <w:rPr>
+                <w:lang w:val="vi-VN"/>
+              </w:rPr>
+            </w:pPr>
+            <w:r>
+              <w:t>1</w:t>
+            </w:r>
+            <w:r>
+              <w:rPr>
+                <w:lang w:val="vi-VN"/>
+              </w:rPr>
+              <w:t>,2,3,4,5</w:t>
+            </w:r>
+          </w:p>
+        </w:tc>
+        <w:tc>
+          <w:tcPr>
+            <w:tcW w:w="1190" w:type="dxa"/>
+            <w:vAlign w:val="center"/>
+          </w:tcPr>
+          <w:p>
+            <w:pPr>
+              <w:ind w:firstLine="0"/>
+              <w:jc w:val="center"/>
+              <w:rPr>
+                <w:lang w:val="vi-VN"/>
+              </w:rPr>
+            </w:pPr>
+            <w:r>
+              <w:rPr>
+                <w:lang w:val="vi-VN"/>
+              </w:rPr>
+              <w:t>1,2,3,4,</w:t>
+            </w:r>
+          </w:p>
+        </w:tc>
+      </w:tr>
+      <w:tr>
+        <w:tc>
+          <w:tcPr>
+            <w:tcW w:w="2758" w:type="dxa"/>
+            <w:vMerge w:val="restart"/>
+            <w:vAlign w:val="center"/>
+          </w:tcPr>
+          <w:p>
+            <w:pPr>
+              <w:ind w:firstLine="0"/>
+              <w:jc w:val="center"/>
+            </w:pPr>
+            <w:r>
+              <w:t>multilingual-e5-small</w:t>
+            </w:r>
+          </w:p>
+        </w:tc>
+        <w:tc>
+          <w:tcPr>
+            <w:tcW w:w="1284" w:type="dxa"/>
+            <w:shd w:val="clear" w:color="auto" w:fill="84E290" w:themeFill="accent3" w:themeFillTint="66"/>
+            <w:vAlign w:val="center"/>
+          </w:tcPr>
+          <w:p>
+            <w:pPr>
+              <w:ind w:firstLine="0"/>
+              <w:jc w:val="center"/>
+            </w:pPr>
+            <w:r>
+              <w:t>Relative</w:t>
+            </w:r>
+          </w:p>
+        </w:tc>
+        <w:tc>
+          <w:tcPr>
+            <w:tcW w:w="1190" w:type="dxa"/>
+            <w:shd w:val="clear" w:color="auto" w:fill="84E290" w:themeFill="accent3" w:themeFillTint="66"/>
+            <w:vAlign w:val="center"/>
+          </w:tcPr>
+          <w:p>
+            <w:pPr>
+              <w:ind w:firstLine="0"/>
+              <w:jc w:val="center"/>
+            </w:pPr>
+            <w:r>
+              <w:t>5/5</w:t>
+            </w:r>
+          </w:p>
+        </w:tc>
+        <w:tc>
+          <w:tcPr>
+            <w:tcW w:w="1190" w:type="dxa"/>
+            <w:shd w:val="clear" w:color="auto" w:fill="84E290" w:themeFill="accent3" w:themeFillTint="66"/>
+            <w:vAlign w:val="center"/>
+          </w:tcPr>
+          <w:p>
+            <w:pPr>
+              <w:ind w:firstLine="0"/>
+              <w:jc w:val="center"/>
+            </w:pPr>
+            <w:r>
+              <w:t>5/5</w:t>
+            </w:r>
+          </w:p>
+        </w:tc>
+        <w:tc>
+          <w:tcPr>
+            <w:tcW w:w="1190" w:type="dxa"/>
+            <w:shd w:val="clear" w:color="auto" w:fill="84E290" w:themeFill="accent3" w:themeFillTint="66"/>
+            <w:vAlign w:val="center"/>
+          </w:tcPr>
+          <w:p>
+            <w:pPr>
+              <w:ind w:firstLine="0"/>
+              <w:jc w:val="center"/>
+            </w:pPr>
+            <w:r>
+              <w:t>5/5</w:t>
+            </w:r>
+          </w:p>
+        </w:tc>
+        <w:tc>
+          <w:tcPr>
+            <w:tcW w:w="1190" w:type="dxa"/>
+            <w:shd w:val="clear" w:color="auto" w:fill="84E290" w:themeFill="accent3" w:themeFillTint="66"/>
+            <w:vAlign w:val="center"/>
+          </w:tcPr>
+          <w:p>
+            <w:pPr>
+              <w:ind w:firstLine="0"/>
+              <w:jc w:val="center"/>
+            </w:pPr>
+            <w:r>
+              <w:t>4/5</w:t>
+            </w:r>
+          </w:p>
+        </w:tc>
+        <w:tc>
+          <w:tcPr>
+            <w:tcW w:w="1190" w:type="dxa"/>
+            <w:shd w:val="clear" w:color="auto" w:fill="84E290" w:themeFill="accent3" w:themeFillTint="66"/>
+            <w:vAlign w:val="center"/>
+          </w:tcPr>
+          <w:p>
+            <w:pPr>
+              <w:ind w:firstLine="0"/>
+              <w:jc w:val="center"/>
+            </w:pPr>
+            <w:r>
+              <w:t>2/5</w:t>
+            </w:r>
+          </w:p>
+        </w:tc>
+        <w:tc>
+          <w:tcPr>
+            <w:tcW w:w="1190" w:type="dxa"/>
+            <w:shd w:val="clear" w:color="auto" w:fill="84E290" w:themeFill="accent3" w:themeFillTint="66"/>
+            <w:vAlign w:val="center"/>
+          </w:tcPr>
+          <w:p>
+            <w:pPr>
+              <w:ind w:firstLine="0"/>
+              <w:jc w:val="center"/>
+            </w:pPr>
+            <w:r>
+              <w:t>5/5</w:t>
+            </w:r>
+          </w:p>
+        </w:tc>
+        <w:tc>
+          <w:tcPr>
+            <w:tcW w:w="1190" w:type="dxa"/>
+            <w:shd w:val="clear" w:color="auto" w:fill="84E290" w:themeFill="accent3" w:themeFillTint="66"/>
+            <w:vAlign w:val="center"/>
+          </w:tcPr>
+          <w:p>
+            <w:pPr>
+              <w:ind w:firstLine="0"/>
+              <w:jc w:val="center"/>
+            </w:pPr>
+            <w:r>
+              <w:t>5/5</w:t>
+            </w:r>
+          </w:p>
+        </w:tc>
+      </w:tr>
+      <w:tr>
+        <w:tc>
+          <w:tcPr>
+            <w:tcW w:w="2758" w:type="dxa"/>
+            <w:vMerge/>
+            <w:vAlign w:val="center"/>
+          </w:tcPr>
+          <w:p>
+            <w:pPr>
+              <w:ind w:firstLine="0"/>
+              <w:jc w:val="center"/>
+            </w:pPr>
+          </w:p>
+        </w:tc>
+        <w:tc>
+          <w:tcPr>
+            <w:tcW w:w="1284" w:type="dxa"/>
+            <w:vAlign w:val="center"/>
+          </w:tcPr>
+          <w:p>
+            <w:pPr>
+              <w:ind w:firstLine="0"/>
+              <w:jc w:val="center"/>
+              <w:rPr>
+                <w:lang w:val="vi-VN"/>
+              </w:rPr>
+            </w:pPr>
+            <w:r>
+              <w:t>Rank</w:t>
+            </w:r>
+          </w:p>
+        </w:tc>
+        <w:tc>
+          <w:tcPr>
+            <w:tcW w:w="1190" w:type="dxa"/>
+            <w:vAlign w:val="center"/>
+          </w:tcPr>
+          <w:p>
+            <w:pPr>
+              <w:ind w:firstLine="0"/>
+              <w:jc w:val="center"/>
+            </w:pPr>
+            <w:r>
+              <w:t>1,2,3,4,5</w:t>
+            </w:r>
+          </w:p>
+        </w:tc>
+        <w:tc>
+          <w:tcPr>
+            <w:tcW w:w="1190" w:type="dxa"/>
+            <w:vAlign w:val="center"/>
+          </w:tcPr>
+          <w:p>
+            <w:pPr>
+              <w:ind w:firstLine="0"/>
+              <w:jc w:val="center"/>
+            </w:pPr>
+            <w:r>
+              <w:t>1,2,3,4,5</w:t>
+            </w:r>
+          </w:p>
+        </w:tc>
+        <w:tc>
+          <w:tcPr>
+            <w:tcW w:w="1190" w:type="dxa"/>
+            <w:vAlign w:val="center"/>
+          </w:tcPr>
+          <w:p>
+            <w:pPr>
+              <w:ind w:firstLine="0"/>
+              <w:jc w:val="center"/>
+            </w:pPr>
+            <w:r>
+              <w:t>1,2,3,4,5</w:t>
+            </w:r>
+          </w:p>
+        </w:tc>
+        <w:tc>
+          <w:tcPr>
+            <w:tcW w:w="1190" w:type="dxa"/>
+            <w:vAlign w:val="center"/>
+          </w:tcPr>
+          <w:p>
+            <w:pPr>
+              <w:ind w:firstLine="0"/>
+              <w:jc w:val="center"/>
+            </w:pPr>
+            <w:r>
+              <w:t>1,2,3,4</w:t>
+            </w:r>
+          </w:p>
+        </w:tc>
+        <w:tc>
+          <w:tcPr>
+            <w:tcW w:w="1190" w:type="dxa"/>
+            <w:vAlign w:val="center"/>
+          </w:tcPr>
+          <w:p>
+            <w:pPr>
+              <w:ind w:firstLine="0"/>
+              <w:jc w:val="center"/>
+            </w:pPr>
+            <w:r>
+              <w:t>1,4</w:t>
+            </w:r>
+          </w:p>
+        </w:tc>
+        <w:tc>
+          <w:tcPr>
+            <w:tcW w:w="1190" w:type="dxa"/>
+            <w:vAlign w:val="center"/>
+          </w:tcPr>
+          <w:p>
+            <w:pPr>
+              <w:ind w:firstLine="0"/>
+              <w:jc w:val="center"/>
+            </w:pPr>
+            <w:r>
+              <w:t>1,2,3,4,5</w:t>
+            </w:r>
+          </w:p>
+        </w:tc>
+        <w:tc>
+          <w:tcPr>
+            <w:tcW w:w="1190" w:type="dxa"/>
+            <w:vAlign w:val="center"/>
+          </w:tcPr>
+          <w:p>
+            <w:pPr>
+              <w:ind w:firstLine="0"/>
+              <w:jc w:val="center"/>
+            </w:pPr>
+            <w:r>
+              <w:t>1,2,3,4,5</w:t>
+            </w:r>
+          </w:p>
+        </w:tc>
+      </w:tr>
+      <w:tr>
+        <w:tc>
+          <w:tcPr>
+            <w:tcW w:w="2758" w:type="dxa"/>
+            <w:vMerge/>
+            <w:vAlign w:val="center"/>
+          </w:tcPr>
+          <w:p>
+            <w:pPr>
+              <w:ind w:firstLine="0"/>
+              <w:jc w:val="center"/>
+            </w:pPr>
+          </w:p>
+        </w:tc>
+        <w:tc>
+          <w:tcPr>
+            <w:tcW w:w="1284" w:type="dxa"/>
+            <w:vAlign w:val="center"/>
+          </w:tcPr>
+          <w:p>
+            <w:pPr>
+              <w:ind w:firstLine="0"/>
+              <w:jc w:val="center"/>
+            </w:pPr>
+            <w:r>
+              <w:t>Correct</w:t>
+            </w:r>
+          </w:p>
+        </w:tc>
+        <w:tc>
+          <w:tcPr>
+            <w:tcW w:w="1190" w:type="dxa"/>
+            <w:vAlign w:val="center"/>
+          </w:tcPr>
+          <w:p>
+            <w:pPr>
+              <w:ind w:firstLine="0"/>
+              <w:jc w:val="center"/>
+              <w:rPr>
+                <w:lang w:val="vi-VN"/>
+              </w:rPr>
+            </w:pPr>
+            <w:r>
+              <w:t>1</w:t>
+            </w:r>
+            <w:r>
+              <w:rPr>
+                <w:lang w:val="vi-VN"/>
+              </w:rPr>
+              <w:t>,2,3,4</w:t>
+            </w:r>
+          </w:p>
+        </w:tc>
+        <w:tc>
+          <w:tcPr>
+            <w:tcW w:w="1190" w:type="dxa"/>
+            <w:vAlign w:val="center"/>
+          </w:tcPr>
+          <w:p>
+            <w:pPr>
+              <w:ind w:firstLine="0"/>
+              <w:jc w:val="center"/>
+              <w:rPr>
+                <w:lang w:val="vi-VN"/>
+              </w:rPr>
+            </w:pPr>
+            <w:r>
+              <w:t>1</w:t>
+            </w:r>
+            <w:r>
+              <w:rPr>
+                <w:lang w:val="vi-VN"/>
+              </w:rPr>
+              <w:t>,3</w:t>
+            </w:r>
+          </w:p>
+        </w:tc>
+        <w:tc>
+          <w:tcPr>
+            <w:tcW w:w="1190" w:type="dxa"/>
+            <w:vAlign w:val="center"/>
+          </w:tcPr>
+          <w:p>
+            <w:pPr>
+              <w:ind w:firstLine="0"/>
+              <w:jc w:val="center"/>
+              <w:rPr>
+                <w:lang w:val="vi-VN"/>
+              </w:rPr>
+            </w:pPr>
+            <w:r>
+              <w:t>1</w:t>
+            </w:r>
+            <w:r>
+              <w:rPr>
+                <w:lang w:val="vi-VN"/>
+              </w:rPr>
+              <w:t>,2,4</w:t>
+            </w:r>
+          </w:p>
+        </w:tc>
+        <w:tc>
+          <w:tcPr>
+            <w:tcW w:w="1190" w:type="dxa"/>
+            <w:vAlign w:val="center"/>
+          </w:tcPr>
+          <w:p>
+            <w:pPr>
+              <w:ind w:firstLine="0"/>
+              <w:jc w:val="center"/>
+              <w:rPr>
+                <w:lang w:val="vi-VN"/>
+              </w:rPr>
+            </w:pPr>
+            <w:r>
+              <w:t>1</w:t>
+            </w:r>
+            <w:r>
+              <w:rPr>
+                <w:lang w:val="vi-VN"/>
+              </w:rPr>
+              <w:t>,2,3,4</w:t>
+            </w:r>
+          </w:p>
+        </w:tc>
+        <w:tc>
+          <w:tcPr>
+            <w:tcW w:w="1190" w:type="dxa"/>
+            <w:vAlign w:val="center"/>
+          </w:tcPr>
+          <w:p>
+            <w:pPr>
+              <w:ind w:firstLine="0"/>
+              <w:jc w:val="center"/>
+            </w:pPr>
+            <w:r>
+              <w:t>1</w:t>
+            </w:r>
+          </w:p>
+        </w:tc>
+        <w:tc>
+          <w:tcPr>
+            <w:tcW w:w="1190" w:type="dxa"/>
+            <w:vAlign w:val="center"/>
+          </w:tcPr>
+          <w:p>
+            <w:pPr>
+              <w:ind w:firstLine="0"/>
+              <w:jc w:val="center"/>
+              <w:rPr>
+                <w:lang w:val="vi-VN"/>
+              </w:rPr>
+            </w:pPr>
+            <w:r>
+              <w:t>1</w:t>
+            </w:r>
+            <w:r>
+              <w:rPr>
+                <w:lang w:val="vi-VN"/>
+              </w:rPr>
+              <w:t>,2,3</w:t>
+            </w:r>
+          </w:p>
+        </w:tc>
+        <w:tc>
+          <w:tcPr>
+            <w:tcW w:w="1190" w:type="dxa"/>
+            <w:vAlign w:val="center"/>
+          </w:tcPr>
+          <w:p>
+            <w:pPr>
+              <w:ind w:firstLine="0"/>
+              <w:jc w:val="center"/>
+              <w:rPr>
+                <w:lang w:val="vi-VN"/>
+              </w:rPr>
+            </w:pPr>
+            <w:r>
+              <w:t>1</w:t>
+            </w:r>
+            <w:r>
+              <w:rPr>
+                <w:lang w:val="vi-VN"/>
+              </w:rPr>
+              <w:t>,2,3,4,5</w:t>
+            </w:r>
+          </w:p>
+        </w:tc>
+      </w:tr>
+      <w:tr>
+        <w:tc>
+          <w:tcPr>
+            <w:tcW w:w="2758" w:type="dxa"/>
+            <w:vMerge w:val="restart"/>
+            <w:vAlign w:val="center"/>
+          </w:tcPr>
+          <w:p>
+            <w:pPr>
+              <w:ind w:firstLine="0"/>
+              <w:jc w:val="center"/>
+            </w:pPr>
+            <w:r>
+              <w:t>sup-SimCSE-VietNamese-phobert-base</w:t>
+            </w:r>
+          </w:p>
+        </w:tc>
+        <w:tc>
+          <w:tcPr>
+            <w:tcW w:w="1284" w:type="dxa"/>
+            <w:shd w:val="clear" w:color="auto" w:fill="84E290" w:themeFill="accent3" w:themeFillTint="66"/>
+            <w:vAlign w:val="center"/>
+          </w:tcPr>
+          <w:p>
+            <w:pPr>
+              <w:ind w:firstLine="0"/>
+              <w:jc w:val="center"/>
+            </w:pPr>
+            <w:r>
+              <w:t>Relative</w:t>
+            </w:r>
+          </w:p>
+        </w:tc>
+        <w:tc>
+          <w:tcPr>
+            <w:tcW w:w="1190" w:type="dxa"/>
+            <w:shd w:val="clear" w:color="auto" w:fill="84E290" w:themeFill="accent3" w:themeFillTint="66"/>
+            <w:vAlign w:val="center"/>
+          </w:tcPr>
+          <w:p>
+            <w:pPr>
+              <w:ind w:firstLine="0"/>
+              <w:jc w:val="center"/>
+            </w:pPr>
+            <w:r>
+              <w:t>5/5</w:t>
+            </w:r>
+          </w:p>
+        </w:tc>
+        <w:tc>
+          <w:tcPr>
+            <w:tcW w:w="1190" w:type="dxa"/>
+            <w:shd w:val="clear" w:color="auto" w:fill="84E290" w:themeFill="accent3" w:themeFillTint="66"/>
+            <w:vAlign w:val="center"/>
+          </w:tcPr>
+          <w:p>
+            <w:pPr>
+              <w:ind w:firstLine="0"/>
+              <w:jc w:val="center"/>
+            </w:pPr>
+            <w:r>
+              <w:t>1/5</w:t>
+            </w:r>
+          </w:p>
+        </w:tc>
+        <w:tc>
+          <w:tcPr>
+            <w:tcW w:w="1190" w:type="dxa"/>
+            <w:shd w:val="clear" w:color="auto" w:fill="84E290" w:themeFill="accent3" w:themeFillTint="66"/>
+            <w:vAlign w:val="center"/>
+          </w:tcPr>
+          <w:p>
+            <w:pPr>
+              <w:ind w:firstLine="0"/>
+              <w:jc w:val="center"/>
+            </w:pPr>
+            <w:r>
+              <w:t>1/5</w:t>
+            </w:r>
+          </w:p>
+        </w:tc>
+        <w:tc>
+          <w:tcPr>
+            <w:tcW w:w="1190" w:type="dxa"/>
+            <w:shd w:val="clear" w:color="auto" w:fill="84E290" w:themeFill="accent3" w:themeFillTint="66"/>
+            <w:vAlign w:val="center"/>
+          </w:tcPr>
+          <w:p>
+            <w:pPr>
+              <w:ind w:firstLine="0"/>
+              <w:jc w:val="center"/>
+            </w:pPr>
+            <w:r>
+              <w:t>0</w:t>
+            </w:r>
+          </w:p>
+        </w:tc>
+        <w:tc>
+          <w:tcPr>
+            <w:tcW w:w="1190" w:type="dxa"/>
+            <w:shd w:val="clear" w:color="auto" w:fill="84E290" w:themeFill="accent3" w:themeFillTint="66"/>
+            <w:vAlign w:val="center"/>
+          </w:tcPr>
+          <w:p>
+            <w:pPr>
+              <w:ind w:firstLine="0"/>
+              <w:jc w:val="center"/>
+            </w:pPr>
+            <w:r>
+              <w:t>3/5</w:t>
+            </w:r>
+          </w:p>
+        </w:tc>
+        <w:tc>
+          <w:tcPr>
+            <w:tcW w:w="1190" w:type="dxa"/>
+            <w:shd w:val="clear" w:color="auto" w:fill="84E290" w:themeFill="accent3" w:themeFillTint="66"/>
+            <w:vAlign w:val="center"/>
+          </w:tcPr>
+          <w:p>
+            <w:pPr>
+              <w:ind w:firstLine="0"/>
+              <w:jc w:val="center"/>
+            </w:pPr>
+            <w:r>
+              <w:t>5/5</w:t>
+            </w:r>
+          </w:p>
+        </w:tc>
+        <w:tc>
+          <w:tcPr>
+            <w:tcW w:w="1190" w:type="dxa"/>
+            <w:shd w:val="clear" w:color="auto" w:fill="84E290" w:themeFill="accent3" w:themeFillTint="66"/>
+            <w:vAlign w:val="center"/>
+          </w:tcPr>
+          <w:p>
+            <w:pPr>
+              <w:ind w:firstLine="0"/>
+              <w:jc w:val="center"/>
+            </w:pPr>
+            <w:r>
+              <w:t>5/5</w:t>
+            </w:r>
+          </w:p>
+        </w:tc>
+      </w:tr>
+      <w:tr>
+        <w:tc>
+          <w:tcPr>
+            <w:tcW w:w="2758" w:type="dxa"/>
+            <w:vMerge/>
+            <w:vAlign w:val="center"/>
+          </w:tcPr>
+          <w:p>
+            <w:pPr>
+              <w:ind w:firstLine="0"/>
+              <w:jc w:val="center"/>
+            </w:pPr>
+          </w:p>
+        </w:tc>
+        <w:tc>
+          <w:tcPr>
+            <w:tcW w:w="1284" w:type="dxa"/>
+            <w:vAlign w:val="center"/>
+          </w:tcPr>
+          <w:p>
+            <w:pPr>
+              <w:ind w:firstLine="0"/>
+              <w:jc w:val="center"/>
+              <w:rPr>
+                <w:lang w:val="vi-VN"/>
+              </w:rPr>
+            </w:pPr>
+            <w:r>
+              <w:t>Rank</w:t>
+            </w:r>
+          </w:p>
+        </w:tc>
+        <w:tc>
+          <w:tcPr>
+            <w:tcW w:w="1190" w:type="dxa"/>
+            <w:vAlign w:val="center"/>
+          </w:tcPr>
+          <w:p>
+            <w:pPr>
+              <w:ind w:firstLine="0"/>
+              <w:jc w:val="center"/>
+            </w:pPr>
+            <w:r>
+              <w:t>1,2,3,4,5</w:t>
+            </w:r>
+          </w:p>
+        </w:tc>
+        <w:tc>
+          <w:tcPr>
+            <w:tcW w:w="1190" w:type="dxa"/>
+            <w:vAlign w:val="center"/>
+          </w:tcPr>
+          <w:p>
+            <w:pPr>
+              <w:ind w:firstLine="0"/>
+              <w:jc w:val="center"/>
+            </w:pPr>
+            <w:r>
+              <w:t>1</w:t>
+            </w:r>
+          </w:p>
+        </w:tc>
+        <w:tc>
+          <w:tcPr>
+            <w:tcW w:w="1190" w:type="dxa"/>
+            <w:vAlign w:val="center"/>
+          </w:tcPr>
+          <w:p>
+            <w:pPr>
+              <w:ind w:firstLine="0"/>
+              <w:jc w:val="center"/>
+            </w:pPr>
+            <w:r>
+              <w:t>2</w:t>
+            </w:r>
+          </w:p>
+        </w:tc>
+        <w:tc>
+          <w:tcPr>
+            <w:tcW w:w="1190" w:type="dxa"/>
+            <w:vAlign w:val="center"/>
+          </w:tcPr>
+          <w:p>
+            <w:pPr>
+              <w:ind w:firstLine="0"/>
+              <w:jc w:val="center"/>
+            </w:pPr>
+            <w:r>
+              <w:t>0</w:t>
+            </w:r>
+          </w:p>
+        </w:tc>
+        <w:tc>
+          <w:tcPr>
+            <w:tcW w:w="1190" w:type="dxa"/>
+            <w:vAlign w:val="center"/>
+          </w:tcPr>
+          <w:p>
+            <w:pPr>
+              <w:ind w:firstLine="0"/>
+              <w:jc w:val="center"/>
+            </w:pPr>
+            <w:r>
+              <w:t>2,4,5</w:t>
+            </w:r>
+          </w:p>
+        </w:tc>
+        <w:tc>
+          <w:tcPr>
+            <w:tcW w:w="1190" w:type="dxa"/>
+            <w:vAlign w:val="center"/>
+          </w:tcPr>
+          <w:p>
+            <w:pPr>
+              <w:ind w:firstLine="0"/>
+              <w:jc w:val="center"/>
+            </w:pPr>
+            <w:r>
+              <w:t>1,2,3,4,5</w:t>
+            </w:r>
+          </w:p>
+        </w:tc>
+        <w:tc>
+          <w:tcPr>
+            <w:tcW w:w="1190" w:type="dxa"/>
+            <w:vAlign w:val="center"/>
+          </w:tcPr>
+          <w:p>
+            <w:pPr>
+              <w:ind w:firstLine="0"/>
+              <w:jc w:val="center"/>
+            </w:pPr>
+            <w:r>
+              <w:t>1,2,3,4,5</w:t>
+            </w:r>
+          </w:p>
+        </w:tc>
+      </w:tr>
+      <w:tr>
+        <w:tc>
+          <w:tcPr>
+            <w:tcW w:w="2758" w:type="dxa"/>
+            <w:vMerge/>
+            <w:vAlign w:val="center"/>
+          </w:tcPr>
+          <w:p>
+            <w:pPr>
+              <w:ind w:firstLine="0"/>
+              <w:jc w:val="center"/>
+            </w:pPr>
+          </w:p>
+        </w:tc>
+        <w:tc>
+          <w:tcPr>
+            <w:tcW w:w="1284" w:type="dxa"/>
+            <w:vAlign w:val="center"/>
+          </w:tcPr>
+          <w:p>
+            <w:pPr>
+              <w:ind w:firstLine="0"/>
+              <w:jc w:val="center"/>
+            </w:pPr>
+            <w:r>
+              <w:t>Correct</w:t>
+            </w:r>
+          </w:p>
+        </w:tc>
+        <w:tc>
+          <w:tcPr>
+            <w:tcW w:w="1190" w:type="dxa"/>
+            <w:vAlign w:val="center"/>
+          </w:tcPr>
+          <w:p>
+            <w:pPr>
+              <w:ind w:firstLine="0"/>
+              <w:jc w:val="center"/>
+              <w:rPr>
+                <w:lang w:val="vi-VN"/>
+              </w:rPr>
+            </w:pPr>
+            <w:r>
+              <w:t>1</w:t>
+            </w:r>
+            <w:r>
+              <w:rPr>
+                <w:lang w:val="vi-VN"/>
+              </w:rPr>
+              <w:t>,2,3,4,5</w:t>
+            </w:r>
+          </w:p>
+        </w:tc>
+        <w:tc>
+          <w:tcPr>
+            <w:tcW w:w="1190" w:type="dxa"/>
+            <w:vAlign w:val="center"/>
+          </w:tcPr>
+          <w:p>
+            <w:pPr>
+              <w:ind w:firstLine="0"/>
+              <w:jc w:val="center"/>
+            </w:pPr>
+            <w:r>
+              <w:t>1</w:t>
+            </w:r>
+          </w:p>
+        </w:tc>
+        <w:tc>
+          <w:tcPr>
+            <w:tcW w:w="1190" w:type="dxa"/>
+            <w:vAlign w:val="center"/>
+          </w:tcPr>
+          <w:p>
+            <w:pPr>
+              <w:ind w:firstLine="0"/>
+              <w:jc w:val="center"/>
+            </w:pPr>
+            <w:r>
+              <w:t>2</w:t>
+            </w:r>
+          </w:p>
+        </w:tc>
+        <w:tc>
+          <w:tcPr>
+            <w:tcW w:w="1190" w:type="dxa"/>
+            <w:vAlign w:val="center"/>
+          </w:tcPr>
+          <w:p>
+            <w:pPr>
+              <w:ind w:firstLine="0"/>
+              <w:jc w:val="center"/>
+            </w:pPr>
+            <w:r>
+              <w:t>0</w:t>
+            </w:r>
+          </w:p>
+        </w:tc>
+        <w:tc>
+          <w:tcPr>
+            <w:tcW w:w="1190" w:type="dxa"/>
+            <w:vAlign w:val="center"/>
+          </w:tcPr>
+          <w:p>
+            <w:pPr>
+              <w:ind w:firstLine="0"/>
+              <w:jc w:val="center"/>
+              <w:rPr>
+                <w:lang w:val="vi-VN"/>
+              </w:rPr>
+            </w:pPr>
+            <w:r>
+              <w:t>2</w:t>
+            </w:r>
+            <w:r>
+              <w:rPr>
+                <w:lang w:val="vi-VN"/>
+              </w:rPr>
+              <w:t>,5</w:t>
+            </w:r>
+          </w:p>
+        </w:tc>
+        <w:tc>
+          <w:tcPr>
+            <w:tcW w:w="1190" w:type="dxa"/>
+            <w:vAlign w:val="center"/>
+          </w:tcPr>
+          <w:p>
+            <w:pPr>
+              <w:ind w:firstLine="0"/>
+              <w:jc w:val="center"/>
+              <w:rPr>
+                <w:lang w:val="vi-VN"/>
+              </w:rPr>
+            </w:pPr>
+            <w:r>
+              <w:t>1</w:t>
+            </w:r>
+            <w:r>
+              <w:rPr>
+                <w:lang w:val="vi-VN"/>
+              </w:rPr>
+              <w:t>,2,3</w:t>
+            </w:r>
+          </w:p>
+        </w:tc>
+        <w:tc>
+          <w:tcPr>
+            <w:tcW w:w="1190" w:type="dxa"/>
+            <w:vAlign w:val="center"/>
+          </w:tcPr>
+          <w:p>
+            <w:pPr>
+              <w:ind w:firstLine="0"/>
+              <w:jc w:val="center"/>
+              <w:rPr>
+                <w:lang w:val="vi-VN"/>
+              </w:rPr>
+            </w:pPr>
+            <w:r>
+              <w:t>1</w:t>
+            </w:r>
+            <w:r>
+              <w:rPr>
+                <w:lang w:val="vi-VN"/>
+              </w:rPr>
+              <w:t>,2,3,4,5</w:t>
+            </w:r>
+          </w:p>
+        </w:tc>
+      </w:tr>
+      <w:tr>
+        <w:tc>
+          <w:tcPr>
+            <w:tcW w:w="2758" w:type="dxa"/>
+            <w:vMerge w:val="restart"/>
+            <w:vAlign w:val="center"/>
+          </w:tcPr>
+          <w:p>
+            <w:pPr>
+              <w:ind w:firstLine="0"/>
+              <w:jc w:val="center"/>
+            </w:pPr>
+            <w:r>
+              <w:t>vietnamese-bi-encoder</w:t>
+            </w:r>
+          </w:p>
+        </w:tc>
+        <w:tc>
+          <w:tcPr>
+            <w:tcW w:w="1284" w:type="dxa"/>
+            <w:shd w:val="clear" w:color="auto" w:fill="84E290" w:themeFill="accent3" w:themeFillTint="66"/>
+            <w:vAlign w:val="center"/>
+          </w:tcPr>
+          <w:p>
+            <w:pPr>
+              <w:ind w:firstLine="0"/>
+              <w:jc w:val="center"/>
+            </w:pPr>
+            <w:r>
+              <w:t>Relative</w:t>
+            </w:r>
+          </w:p>
+        </w:tc>
+        <w:tc>
+          <w:tcPr>
+            <w:tcW w:w="1190" w:type="dxa"/>
+            <w:shd w:val="clear" w:color="auto" w:fill="84E290" w:themeFill="accent3" w:themeFillTint="66"/>
+            <w:vAlign w:val="center"/>
+          </w:tcPr>
+          <w:p>
+            <w:pPr>
+              <w:ind w:firstLine="0"/>
+              <w:jc w:val="center"/>
+            </w:pPr>
+            <w:r>
+              <w:t>5/5</w:t>
+            </w:r>
+          </w:p>
+        </w:tc>
+        <w:tc>
+          <w:tcPr>
+            <w:tcW w:w="1190" w:type="dxa"/>
+            <w:shd w:val="clear" w:color="auto" w:fill="84E290" w:themeFill="accent3" w:themeFillTint="66"/>
+            <w:vAlign w:val="center"/>
+          </w:tcPr>
+          <w:p>
+            <w:pPr>
+              <w:ind w:firstLine="0"/>
+              <w:jc w:val="center"/>
+            </w:pPr>
+            <w:r>
+              <w:t>5/5</w:t>
+            </w:r>
+          </w:p>
+        </w:tc>
+        <w:tc>
+          <w:tcPr>
+            <w:tcW w:w="1190" w:type="dxa"/>
+            <w:shd w:val="clear" w:color="auto" w:fill="84E290" w:themeFill="accent3" w:themeFillTint="66"/>
+            <w:vAlign w:val="center"/>
+          </w:tcPr>
+          <w:p>
+            <w:pPr>
+              <w:ind w:firstLine="0"/>
+              <w:jc w:val="center"/>
+            </w:pPr>
+            <w:r>
+              <w:t>4/5</w:t>
+            </w:r>
+          </w:p>
+        </w:tc>
+        <w:tc>
+          <w:tcPr>
+            <w:tcW w:w="1190" w:type="dxa"/>
+            <w:shd w:val="clear" w:color="auto" w:fill="84E290" w:themeFill="accent3" w:themeFillTint="66"/>
+            <w:vAlign w:val="center"/>
+          </w:tcPr>
+          <w:p>
+            <w:pPr>
+              <w:ind w:firstLine="0"/>
+              <w:jc w:val="center"/>
+            </w:pPr>
+            <w:r>
+              <w:t>4/5</w:t>
+            </w:r>
+          </w:p>
+        </w:tc>
+        <w:tc>
+          <w:tcPr>
+            <w:tcW w:w="1190" w:type="dxa"/>
+            <w:shd w:val="clear" w:color="auto" w:fill="84E290" w:themeFill="accent3" w:themeFillTint="66"/>
+            <w:vAlign w:val="center"/>
+          </w:tcPr>
+          <w:p>
+            <w:pPr>
+              <w:ind w:firstLine="0"/>
+              <w:jc w:val="center"/>
+            </w:pPr>
+            <w:r>
+              <w:t>3/5</w:t>
+            </w:r>
+          </w:p>
+        </w:tc>
+        <w:tc>
+          <w:tcPr>
+            <w:tcW w:w="1190" w:type="dxa"/>
+            <w:shd w:val="clear" w:color="auto" w:fill="84E290" w:themeFill="accent3" w:themeFillTint="66"/>
+            <w:vAlign w:val="center"/>
+          </w:tcPr>
+          <w:p>
+            <w:pPr>
+              <w:ind w:firstLine="0"/>
+              <w:jc w:val="center"/>
+            </w:pPr>
+            <w:r>
+              <w:t>5/5</w:t>
+            </w:r>
+          </w:p>
+        </w:tc>
+        <w:tc>
+          <w:tcPr>
+            <w:tcW w:w="1190" w:type="dxa"/>
+            <w:shd w:val="clear" w:color="auto" w:fill="84E290" w:themeFill="accent3" w:themeFillTint="66"/>
+            <w:vAlign w:val="center"/>
+          </w:tcPr>
+          <w:p>
+            <w:pPr>
+              <w:ind w:firstLine="0"/>
+              <w:jc w:val="center"/>
+            </w:pPr>
+            <w:r>
+              <w:t>5/5</w:t>
+            </w:r>
+          </w:p>
+        </w:tc>
+      </w:tr>
+      <w:tr>
+        <w:tc>
+          <w:tcPr>
+            <w:tcW w:w="2758" w:type="dxa"/>
+            <w:vMerge/>
+            <w:vAlign w:val="center"/>
+          </w:tcPr>
+          <w:p>
+            <w:pPr>
+              <w:ind w:firstLine="0"/>
+              <w:jc w:val="center"/>
+            </w:pPr>
+          </w:p>
+        </w:tc>
+        <w:tc>
+          <w:tcPr>
+            <w:tcW w:w="1284" w:type="dxa"/>
+            <w:vAlign w:val="center"/>
+          </w:tcPr>
+          <w:p>
+            <w:pPr>
+              <w:ind w:firstLine="0"/>
+              <w:jc w:val="center"/>
+              <w:rPr>
+                <w:lang w:val="vi-VN"/>
+              </w:rPr>
+            </w:pPr>
+            <w:r>
+              <w:t>Rank</w:t>
+            </w:r>
+          </w:p>
+        </w:tc>
+        <w:tc>
+          <w:tcPr>
+            <w:tcW w:w="1190" w:type="dxa"/>
+            <w:vAlign w:val="center"/>
+          </w:tcPr>
+          <w:p>
+            <w:pPr>
+              <w:ind w:firstLine="0"/>
+              <w:jc w:val="center"/>
+            </w:pPr>
+            <w:r>
+              <w:t>1,2,3,4,5</w:t>
+            </w:r>
+          </w:p>
+        </w:tc>
+        <w:tc>
+          <w:tcPr>
+            <w:tcW w:w="1190" w:type="dxa"/>
+            <w:vAlign w:val="center"/>
+          </w:tcPr>
+          <w:p>
+            <w:pPr>
+              <w:ind w:firstLine="0"/>
+              <w:jc w:val="center"/>
+            </w:pPr>
+            <w:r>
+              <w:t>1,2,3,4,5</w:t>
+            </w:r>
+          </w:p>
+        </w:tc>
+        <w:tc>
+          <w:tcPr>
+            <w:tcW w:w="1190" w:type="dxa"/>
+            <w:vAlign w:val="center"/>
+          </w:tcPr>
+          <w:p>
+            <w:pPr>
+              <w:ind w:firstLine="0"/>
+              <w:jc w:val="center"/>
+            </w:pPr>
+            <w:r>
+              <w:t>1,2,3,5</w:t>
+            </w:r>
+          </w:p>
+        </w:tc>
+        <w:tc>
+          <w:tcPr>
+            <w:tcW w:w="1190" w:type="dxa"/>
+            <w:vAlign w:val="center"/>
+          </w:tcPr>
+          <w:p>
+            <w:pPr>
+              <w:ind w:firstLine="0"/>
+              <w:jc w:val="center"/>
+            </w:pPr>
+            <w:r>
+              <w:t>1,2,3,4</w:t>
+            </w:r>
+          </w:p>
+        </w:tc>
+        <w:tc>
+          <w:tcPr>
+            <w:tcW w:w="1190" w:type="dxa"/>
+            <w:vAlign w:val="center"/>
+          </w:tcPr>
+          <w:p>
+            <w:pPr>
+              <w:ind w:firstLine="0"/>
+              <w:jc w:val="center"/>
+            </w:pPr>
+            <w:r>
+              <w:t>1,2,3</w:t>
+            </w:r>
+          </w:p>
+        </w:tc>
+        <w:tc>
+          <w:tcPr>
+            <w:tcW w:w="1190" w:type="dxa"/>
+            <w:vAlign w:val="center"/>
+          </w:tcPr>
+          <w:p>
+            <w:pPr>
+              <w:ind w:firstLine="0"/>
+              <w:jc w:val="center"/>
+            </w:pPr>
+            <w:r>
+              <w:t>1,2,3,4,5</w:t>
+            </w:r>
+          </w:p>
+        </w:tc>
+        <w:tc>
+          <w:tcPr>
+            <w:tcW w:w="1190" w:type="dxa"/>
+            <w:vAlign w:val="center"/>
+          </w:tcPr>
+          <w:p>
+            <w:pPr>
+              <w:ind w:firstLine="0"/>
+              <w:jc w:val="center"/>
+            </w:pPr>
+            <w:r>
+              <w:t>1,2,3,4,5</w:t>
+            </w:r>
+          </w:p>
+        </w:tc>
+      </w:tr>
+      <w:tr>
+        <w:tc>
+          <w:tcPr>
+            <w:tcW w:w="2758" w:type="dxa"/>
+            <w:vMerge/>
+            <w:vAlign w:val="center"/>
+          </w:tcPr>
+          <w:p>
+            <w:pPr>
+              <w:ind w:firstLine="0"/>
+              <w:jc w:val="center"/>
+            </w:pPr>
+          </w:p>
+        </w:tc>
+        <w:tc>
+          <w:tcPr>
+            <w:tcW w:w="1284" w:type="dxa"/>
+            <w:vAlign w:val="center"/>
+          </w:tcPr>
+          <w:p>
+            <w:pPr>
+              <w:ind w:firstLine="0"/>
+              <w:jc w:val="center"/>
+            </w:pPr>
+            <w:r>
+              <w:t>Correct</w:t>
+            </w:r>
+          </w:p>
+        </w:tc>
+        <w:tc>
+          <w:tcPr>
+            <w:tcW w:w="1190" w:type="dxa"/>
+            <w:vAlign w:val="center"/>
+          </w:tcPr>
+          <w:p>
+            <w:pPr>
+              <w:ind w:firstLine="0"/>
+              <w:jc w:val="center"/>
+              <w:rPr>
+                <w:lang w:val="vi-VN"/>
+              </w:rPr>
+            </w:pPr>
+            <w:r>
+              <w:t>1</w:t>
+            </w:r>
+            <w:r>
+              <w:rPr>
+                <w:lang w:val="vi-VN"/>
+              </w:rPr>
+              <w:t>,3,4,5</w:t>
+            </w:r>
+          </w:p>
+        </w:tc>
+        <w:tc>
+          <w:tcPr>
+            <w:tcW w:w="1190" w:type="dxa"/>
+            <w:vAlign w:val="center"/>
+          </w:tcPr>
+          <w:p>
+            <w:pPr>
+              <w:ind w:firstLine="0"/>
+              <w:jc w:val="center"/>
+              <w:rPr>
+                <w:lang w:val="vi-VN"/>
+              </w:rPr>
+            </w:pPr>
+            <w:r>
+              <w:t>1</w:t>
+            </w:r>
+            <w:r>
+              <w:rPr>
+                <w:lang w:val="vi-VN"/>
+              </w:rPr>
+              <w:t>,2,3,4</w:t>
+            </w:r>
+          </w:p>
+        </w:tc>
+        <w:tc>
+          <w:tcPr>
+            <w:tcW w:w="1190" w:type="dxa"/>
+            <w:vAlign w:val="center"/>
+          </w:tcPr>
+          <w:p>
+            <w:pPr>
+              <w:ind w:firstLine="0"/>
+              <w:jc w:val="center"/>
+              <w:rPr>
+                <w:lang w:val="vi-VN"/>
+              </w:rPr>
+            </w:pPr>
+            <w:r>
+              <w:t>1</w:t>
+            </w:r>
+            <w:r>
+              <w:rPr>
+                <w:lang w:val="vi-VN"/>
+              </w:rPr>
+              <w:t>,2,3</w:t>
+            </w:r>
+          </w:p>
+        </w:tc>
+        <w:tc>
+          <w:tcPr>
+            <w:tcW w:w="1190" w:type="dxa"/>
+            <w:vAlign w:val="center"/>
+          </w:tcPr>
+          <w:p>
+            <w:pPr>
+              <w:ind w:firstLine="0"/>
+              <w:jc w:val="center"/>
+              <w:rPr>
+                <w:lang w:val="vi-VN"/>
+              </w:rPr>
+            </w:pPr>
+            <w:r>
+              <w:t>1</w:t>
+            </w:r>
+            <w:r>
+              <w:rPr>
+                <w:lang w:val="vi-VN"/>
+              </w:rPr>
+              <w:t>,2</w:t>
+            </w:r>
+          </w:p>
+        </w:tc>
+        <w:tc>
+          <w:tcPr>
+            <w:tcW w:w="1190" w:type="dxa"/>
+            <w:vAlign w:val="center"/>
+          </w:tcPr>
+          <w:p>
+            <w:pPr>
+              <w:ind w:firstLine="0"/>
+              <w:jc w:val="center"/>
+              <w:rPr>
+                <w:lang w:val="vi-VN"/>
+              </w:rPr>
+            </w:pPr>
+            <w:r>
+              <w:t>1</w:t>
+            </w:r>
+            <w:r>
+              <w:rPr>
+                <w:lang w:val="vi-VN"/>
+              </w:rPr>
+              <w:t>,3</w:t>
+            </w:r>
+          </w:p>
+        </w:tc>
+        <w:tc>
+          <w:tcPr>
+            <w:tcW w:w="1190" w:type="dxa"/>
+            <w:vAlign w:val="center"/>
+          </w:tcPr>
+          <w:p>
+            <w:pPr>
+              <w:ind w:firstLine="0"/>
+              <w:jc w:val="center"/>
+              <w:rPr>
+                <w:lang w:val="vi-VN"/>
+              </w:rPr>
+            </w:pPr>
+            <w:r>
+              <w:t>1</w:t>
+            </w:r>
+            <w:r>
+              <w:rPr>
+                <w:lang w:val="vi-VN"/>
+              </w:rPr>
+              <w:t>,3,4,5</w:t>
+            </w:r>
+          </w:p>
+        </w:tc>
+        <w:tc>
+          <w:tcPr>
+            <w:tcW w:w="1190" w:type="dxa"/>
+            <w:vAlign w:val="center"/>
+          </w:tcPr>
+          <w:p>
+            <w:pPr>
+              <w:ind w:firstLine="0"/>
+              <w:jc w:val="center"/>
+              <w:rPr>
+                <w:lang w:val="vi-VN"/>
+              </w:rPr>
+            </w:pPr>
+            <w:r>
+              <w:t>1</w:t>
+            </w:r>
+            <w:r>
+              <w:rPr>
+                <w:lang w:val="vi-VN"/>
+              </w:rPr>
+              <w:t>,2,4,5</w:t>
+            </w:r>
           </w:p>
         </w:tc>
       </w:tr>
@@ -5075,6 +9542,56 @@
     </w:sectPr>
   </w:body>
 </w:document>
+</file>
+
+<file path=word/endnotes.xml><?xml version="1.0" encoding="utf-8"?>
+<w:endnotes xmlns:wpc="http://schemas.microsoft.com/office/word/2010/wordprocessingCanvas" xmlns:cx="http://schemas.microsoft.com/office/drawing/2014/chartex" xmlns:cx1="http://schemas.microsoft.com/office/drawing/2015/9/8/chartex" xmlns:cx2="http://schemas.microsoft.com/office/drawing/2015/10/21/chartex" xmlns:cx3="http://schemas.microsoft.com/office/drawing/2016/5/9/chartex" xmlns:cx4="http://schemas.microsoft.com/office/drawing/2016/5/10/chartex" xmlns:cx5="http://schemas.microsoft.com/office/drawing/2016/5/11/chartex" xmlns:cx6="http://schemas.microsoft.com/office/drawing/2016/5/12/chartex" xmlns:cx7="http://schemas.microsoft.com/office/drawing/2016/5/13/chartex" xmlns:cx8="http://schemas.microsoft.com/office/drawing/2016/5/14/chartex" xmlns:mc="http://schemas.openxmlformats.org/markup-compatibility/2006" xmlns:aink="http://schemas.microsoft.com/office/drawing/2016/ink" xmlns:am3d="http://schemas.microsoft.com/office/drawing/2017/model3d" xmlns:o="urn:schemas-microsoft-com:office:office" xmlns:oel="http://schemas.microsoft.com/office/2019/extlst" xmlns:r="http://schemas.openxmlformats.org/officeDocument/2006/relationships" xmlns:m="http://schemas.openxmlformats.org/officeDocument/2006/math" xmlns:v="urn:schemas-microsoft-com:vml" xmlns:wp14="http://schemas.microsoft.com/office/word/2010/wordprocessingDrawing" xmlns:wp="http://schemas.openxmlformats.org/drawingml/2006/wordprocessingDrawing" xmlns:w10="urn:schemas-microsoft-com:office:word" xmlns:w="http://schemas.openxmlformats.org/wordprocessingml/2006/main" xmlns:w14="http://schemas.microsoft.com/office/word/2010/wordml" xmlns:w15="http://schemas.microsoft.com/office/word/2012/wordml" xmlns:w16cex="http://schemas.microsoft.com/office/word/2018/wordml/cex" xmlns:w16cid="http://schemas.microsoft.com/office/word/2016/wordml/cid" xmlns:w16="http://schemas.microsoft.com/office/word/2018/wordml" xmlns:w16du="http://schemas.microsoft.com/office/word/2023/wordml/word16du" xmlns:w16sdtdh="http://schemas.microsoft.com/office/word/2020/wordml/sdtdatahash" xmlns:w16sdtfl="http://schemas.microsoft.com/office/word/2024/wordml/sdtformatlock" xmlns:w16se="http://schemas.microsoft.com/office/word/2015/wordml/symex" xmlns:wpg="http://schemas.microsoft.com/office/word/2010/wordprocessingGroup" xmlns:wpi="http://schemas.microsoft.com/office/word/2010/wordprocessingInk" xmlns:wne="http://schemas.microsoft.com/office/word/2006/wordml" xmlns:wps="http://schemas.microsoft.com/office/word/2010/wordprocessingShape" mc:Ignorable="w14 w15 w16se w16cid w16 w16cex w16sdtdh w16sdtfl w16du wp14">
+  <w:endnote w:type="separator" w:id="-1">
+    <w:p>
+      <w:pPr>
+        <w:spacing w:before="0" w:after="0" w:line="240" w:lineRule="auto"/>
+      </w:pPr>
+      <w:r>
+        <w:separator/>
+      </w:r>
+    </w:p>
+  </w:endnote>
+  <w:endnote w:type="continuationSeparator" w:id="0">
+    <w:p>
+      <w:pPr>
+        <w:spacing w:before="0" w:after="0" w:line="240" w:lineRule="auto"/>
+      </w:pPr>
+      <w:r>
+        <w:continuationSeparator/>
+      </w:r>
+    </w:p>
+  </w:endnote>
+</w:endnotes>
+</file>
+
+<file path=word/footnotes.xml><?xml version="1.0" encoding="utf-8"?>
+<w:footnotes xmlns:wpc="http://schemas.microsoft.com/office/word/2010/wordprocessingCanvas" xmlns:cx="http://schemas.microsoft.com/office/drawing/2014/chartex" xmlns:cx1="http://schemas.microsoft.com/office/drawing/2015/9/8/chartex" xmlns:cx2="http://schemas.microsoft.com/office/drawing/2015/10/21/chartex" xmlns:cx3="http://schemas.microsoft.com/office/drawing/2016/5/9/chartex" xmlns:cx4="http://schemas.microsoft.com/office/drawing/2016/5/10/chartex" xmlns:cx5="http://schemas.microsoft.com/office/drawing/2016/5/11/chartex" xmlns:cx6="http://schemas.microsoft.com/office/drawing/2016/5/12/chartex" xmlns:cx7="http://schemas.microsoft.com/office/drawing/2016/5/13/chartex" xmlns:cx8="http://schemas.microsoft.com/office/drawing/2016/5/14/chartex" xmlns:mc="http://schemas.openxmlformats.org/markup-compatibility/2006" xmlns:aink="http://schemas.microsoft.com/office/drawing/2016/ink" xmlns:am3d="http://schemas.microsoft.com/office/drawing/2017/model3d" xmlns:o="urn:schemas-microsoft-com:office:office" xmlns:oel="http://schemas.microsoft.com/office/2019/extlst" xmlns:r="http://schemas.openxmlformats.org/officeDocument/2006/relationships" xmlns:m="http://schemas.openxmlformats.org/officeDocument/2006/math" xmlns:v="urn:schemas-microsoft-com:vml" xmlns:wp14="http://schemas.microsoft.com/office/word/2010/wordprocessingDrawing" xmlns:wp="http://schemas.openxmlformats.org/drawingml/2006/wordprocessingDrawing" xmlns:w10="urn:schemas-microsoft-com:office:word" xmlns:w="http://schemas.openxmlformats.org/wordprocessingml/2006/main" xmlns:w14="http://schemas.microsoft.com/office/word/2010/wordml" xmlns:w15="http://schemas.microsoft.com/office/word/2012/wordml" xmlns:w16cex="http://schemas.microsoft.com/office/word/2018/wordml/cex" xmlns:w16cid="http://schemas.microsoft.com/office/word/2016/wordml/cid" xmlns:w16="http://schemas.microsoft.com/office/word/2018/wordml" xmlns:w16du="http://schemas.microsoft.com/office/word/2023/wordml/word16du" xmlns:w16sdtdh="http://schemas.microsoft.com/office/word/2020/wordml/sdtdatahash" xmlns:w16sdtfl="http://schemas.microsoft.com/office/word/2024/wordml/sdtformatlock" xmlns:w16se="http://schemas.microsoft.com/office/word/2015/wordml/symex" xmlns:wpg="http://schemas.microsoft.com/office/word/2010/wordprocessingGroup" xmlns:wpi="http://schemas.microsoft.com/office/word/2010/wordprocessingInk" xmlns:wne="http://schemas.microsoft.com/office/word/2006/wordml" xmlns:wps="http://schemas.microsoft.com/office/word/2010/wordprocessingShape" mc:Ignorable="w14 w15 w16se w16cid w16 w16cex w16sdtdh w16sdtfl w16du wp14">
+  <w:footnote w:type="separator" w:id="-1">
+    <w:p>
+      <w:pPr>
+        <w:spacing w:before="0" w:after="0" w:line="240" w:lineRule="auto"/>
+      </w:pPr>
+      <w:r>
+        <w:separator/>
+      </w:r>
+    </w:p>
+  </w:footnote>
+  <w:footnote w:type="continuationSeparator" w:id="0">
+    <w:p>
+      <w:pPr>
+        <w:spacing w:before="0" w:after="0" w:line="240" w:lineRule="auto"/>
+      </w:pPr>
+      <w:r>
+        <w:continuationSeparator/>
+      </w:r>
+    </w:p>
+  </w:footnote>
+</w:footnotes>
 </file>
 
 <file path=word/styles.xml><?xml version="1.0" encoding="utf-8"?>
@@ -5683,6 +10200,7 @@
   <w:style w:type="character" w:default="1" w:styleId="DefaultParagraphFont">
     <w:name w:val="Default Paragraph Font"/>
     <w:uiPriority w:val="1"/>
+    <w:semiHidden/>
     <w:unhideWhenUsed/>
   </w:style>
   <w:style w:type="table" w:default="1" w:styleId="TableNormal">
@@ -6018,6 +10536,56 @@
       </w:tblBorders>
     </w:tblPr>
   </w:style>
+  <w:style w:type="paragraph" w:styleId="Header">
+    <w:name w:val="header"/>
+    <w:basedOn w:val="Normal"/>
+    <w:link w:val="HeaderChar"/>
+    <w:uiPriority w:val="99"/>
+    <w:unhideWhenUsed/>
+    <w:rsid w:val="00C365D3"/>
+    <w:pPr>
+      <w:tabs>
+        <w:tab w:val="center" w:pos="4680"/>
+        <w:tab w:val="right" w:pos="9360"/>
+      </w:tabs>
+      <w:spacing w:before="0" w:after="0" w:line="240" w:lineRule="auto"/>
+    </w:pPr>
+  </w:style>
+  <w:style w:type="character" w:customStyle="1" w:styleId="HeaderChar">
+    <w:name w:val="Header Char"/>
+    <w:basedOn w:val="DefaultParagraphFont"/>
+    <w:link w:val="Header"/>
+    <w:uiPriority w:val="99"/>
+    <w:rsid w:val="00C365D3"/>
+    <w:rPr>
+      <w:color w:val="000000" w:themeColor="text1"/>
+    </w:rPr>
+  </w:style>
+  <w:style w:type="paragraph" w:styleId="Footer">
+    <w:name w:val="footer"/>
+    <w:basedOn w:val="Normal"/>
+    <w:link w:val="FooterChar"/>
+    <w:uiPriority w:val="99"/>
+    <w:unhideWhenUsed/>
+    <w:rsid w:val="00C365D3"/>
+    <w:pPr>
+      <w:tabs>
+        <w:tab w:val="center" w:pos="4680"/>
+        <w:tab w:val="right" w:pos="9360"/>
+      </w:tabs>
+      <w:spacing w:before="0" w:after="0" w:line="240" w:lineRule="auto"/>
+    </w:pPr>
+  </w:style>
+  <w:style w:type="character" w:customStyle="1" w:styleId="FooterChar">
+    <w:name w:val="Footer Char"/>
+    <w:basedOn w:val="DefaultParagraphFont"/>
+    <w:link w:val="Footer"/>
+    <w:uiPriority w:val="99"/>
+    <w:rsid w:val="00C365D3"/>
+    <w:rPr>
+      <w:color w:val="000000" w:themeColor="text1"/>
+    </w:rPr>
+  </w:style>
 </w:styles>
 </file>
 

</xml_diff>

<commit_message>
Update file bao cao va bang danh gia retrieval
</commit_message>
<xml_diff>
--- a/documents/bang_thong_so_danh_gia_models_embedding.docx
+++ b/documents/bang_thong_so_danh_gia_models_embedding.docx
@@ -314,18 +314,15 @@
           <w:p>
             <w:pPr>
               <w:ind w:firstLine="0"/>
-              <w:rPr>
-                <w:lang w:val="vi-VN"/>
-              </w:rPr>
-            </w:pPr>
-            <w:r>
-              <w:t>4</w:t>
-            </w:r>
-            <w:r>
-              <w:rPr>
-                <w:lang w:val="vi-VN"/>
-              </w:rPr>
-              <w:t>.72</w:t>
+            </w:pPr>
+            <w:r>
+              <w:t>0.4</w:t>
+            </w:r>
+            <w:r>
+              <w:rPr>
+                <w:lang w:val="vi-VN"/>
+              </w:rPr>
+              <w:t>7</w:t>
             </w:r>
           </w:p>
         </w:tc>
@@ -1828,14 +1825,7 @@
               <w:rPr>
                 <w:szCs w:val="26"/>
               </w:rPr>
-              <w:t>4</w:t>
-            </w:r>
-            <w:r>
-              <w:rPr>
-                <w:szCs w:val="26"/>
-                <w:lang w:val="vi-VN"/>
-              </w:rPr>
-              <w:t>.72</w:t>
+              <w:t>0.47</w:t>
             </w:r>
           </w:p>
         </w:tc>

</xml_diff>

<commit_message>
Update file bao cao
</commit_message>
<xml_diff>
--- a/documents/bang_thong_so_danh_gia_models_embedding.docx
+++ b/documents/bang_thong_so_danh_gia_models_embedding.docx
@@ -1330,8 +1330,8 @@
         <w:tblLook w:val="04A0" w:firstRow="1" w:lastRow="0" w:firstColumn="1" w:lastColumn="0" w:noHBand="0" w:noVBand="1"/>
       </w:tblPr>
       <w:tblGrid>
-        <w:gridCol w:w="2757"/>
-        <w:gridCol w:w="1609"/>
+        <w:gridCol w:w="2122"/>
+        <w:gridCol w:w="2244"/>
         <w:gridCol w:w="1609"/>
         <w:gridCol w:w="1609"/>
         <w:gridCol w:w="939"/>
@@ -1343,7 +1343,7 @@
       <w:tr>
         <w:tc>
           <w:tcPr>
-            <w:tcW w:w="2757" w:type="dxa"/>
+            <w:tcW w:w="2122" w:type="dxa"/>
             <w:vAlign w:val="center"/>
           </w:tcPr>
           <w:p>
@@ -1353,7 +1353,8 @@
               <w:rPr>
                 <w:b/>
                 <w:bCs/>
-                <w:szCs w:val="26"/>
+                <w:sz w:val="20"/>
+                <w:szCs w:val="20"/>
               </w:rPr>
             </w:pPr>
             <w:bookmarkStart w:id="0" w:name="_Hlk199427122"/>
@@ -1361,7 +1362,7 @@
         </w:tc>
         <w:tc>
           <w:tcPr>
-            <w:tcW w:w="1554" w:type="dxa"/>
+            <w:tcW w:w="2244" w:type="dxa"/>
             <w:vAlign w:val="center"/>
           </w:tcPr>
           <w:p>
@@ -1371,7 +1372,8 @@
               <w:rPr>
                 <w:b/>
                 <w:bCs/>
-                <w:szCs w:val="26"/>
+                <w:sz w:val="20"/>
+                <w:szCs w:val="20"/>
                 <w:lang w:val="vi-VN"/>
               </w:rPr>
             </w:pPr>
@@ -1379,7 +1381,8 @@
               <w:rPr>
                 <w:b/>
                 <w:bCs/>
-                <w:szCs w:val="26"/>
+                <w:sz w:val="20"/>
+                <w:szCs w:val="20"/>
               </w:rPr>
               <w:t>Precision@1</w:t>
             </w:r>
@@ -1387,7 +1390,7 @@
         </w:tc>
         <w:tc>
           <w:tcPr>
-            <w:tcW w:w="1554" w:type="dxa"/>
+            <w:tcW w:w="1609" w:type="dxa"/>
             <w:vAlign w:val="center"/>
           </w:tcPr>
           <w:p>
@@ -1397,7 +1400,8 @@
               <w:rPr>
                 <w:b/>
                 <w:bCs/>
-                <w:szCs w:val="26"/>
+                <w:sz w:val="20"/>
+                <w:szCs w:val="20"/>
                 <w:lang w:val="vi-VN"/>
               </w:rPr>
             </w:pPr>
@@ -1405,7 +1409,8 @@
               <w:rPr>
                 <w:b/>
                 <w:bCs/>
-                <w:szCs w:val="26"/>
+                <w:sz w:val="20"/>
+                <w:szCs w:val="20"/>
               </w:rPr>
               <w:t>Precision@3</w:t>
             </w:r>
@@ -1413,7 +1418,7 @@
         </w:tc>
         <w:tc>
           <w:tcPr>
-            <w:tcW w:w="1554" w:type="dxa"/>
+            <w:tcW w:w="1609" w:type="dxa"/>
             <w:vAlign w:val="center"/>
           </w:tcPr>
           <w:p>
@@ -1423,14 +1428,16 @@
               <w:rPr>
                 <w:b/>
                 <w:bCs/>
-                <w:szCs w:val="26"/>
+                <w:sz w:val="20"/>
+                <w:szCs w:val="20"/>
               </w:rPr>
             </w:pPr>
             <w:r>
               <w:rPr>
                 <w:b/>
                 <w:bCs/>
-                <w:szCs w:val="26"/>
+                <w:sz w:val="20"/>
+                <w:szCs w:val="20"/>
               </w:rPr>
               <w:t>Precision@5</w:t>
             </w:r>
@@ -1438,7 +1445,7 @@
         </w:tc>
         <w:tc>
           <w:tcPr>
-            <w:tcW w:w="895" w:type="dxa"/>
+            <w:tcW w:w="939" w:type="dxa"/>
             <w:vAlign w:val="center"/>
           </w:tcPr>
           <w:p>
@@ -1448,14 +1455,16 @@
               <w:rPr>
                 <w:b/>
                 <w:bCs/>
-                <w:szCs w:val="26"/>
+                <w:sz w:val="20"/>
+                <w:szCs w:val="20"/>
               </w:rPr>
             </w:pPr>
             <w:r>
               <w:rPr>
                 <w:b/>
                 <w:bCs/>
-                <w:szCs w:val="26"/>
+                <w:sz w:val="20"/>
+                <w:szCs w:val="20"/>
               </w:rPr>
               <w:t>Min tokens</w:t>
             </w:r>
@@ -1463,7 +1472,7 @@
         </w:tc>
         <w:tc>
           <w:tcPr>
-            <w:tcW w:w="895" w:type="dxa"/>
+            <w:tcW w:w="939" w:type="dxa"/>
             <w:vAlign w:val="center"/>
           </w:tcPr>
           <w:p>
@@ -1473,14 +1482,16 @@
               <w:rPr>
                 <w:b/>
                 <w:bCs/>
-                <w:szCs w:val="26"/>
+                <w:sz w:val="20"/>
+                <w:szCs w:val="20"/>
               </w:rPr>
             </w:pPr>
             <w:r>
               <w:rPr>
                 <w:b/>
                 <w:bCs/>
-                <w:szCs w:val="26"/>
+                <w:sz w:val="20"/>
+                <w:szCs w:val="20"/>
               </w:rPr>
               <w:t>Max tokens</w:t>
             </w:r>
@@ -1488,7 +1499,7 @@
         </w:tc>
         <w:tc>
           <w:tcPr>
-            <w:tcW w:w="1358" w:type="dxa"/>
+            <w:tcW w:w="1401" w:type="dxa"/>
             <w:vAlign w:val="center"/>
           </w:tcPr>
           <w:p>
@@ -1498,14 +1509,16 @@
               <w:rPr>
                 <w:b/>
                 <w:bCs/>
-                <w:szCs w:val="26"/>
+                <w:sz w:val="20"/>
+                <w:szCs w:val="20"/>
               </w:rPr>
             </w:pPr>
             <w:r>
               <w:rPr>
                 <w:b/>
                 <w:bCs/>
-                <w:szCs w:val="26"/>
+                <w:sz w:val="20"/>
+                <w:szCs w:val="20"/>
               </w:rPr>
               <w:t>Dimension</w:t>
             </w:r>
@@ -1513,7 +1526,7 @@
         </w:tc>
         <w:tc>
           <w:tcPr>
-            <w:tcW w:w="747" w:type="dxa"/>
+            <w:tcW w:w="785" w:type="dxa"/>
             <w:vAlign w:val="center"/>
           </w:tcPr>
           <w:p>
@@ -1523,14 +1536,16 @@
               <w:rPr>
                 <w:b/>
                 <w:bCs/>
-                <w:szCs w:val="26"/>
+                <w:sz w:val="20"/>
+                <w:szCs w:val="20"/>
               </w:rPr>
             </w:pPr>
             <w:r>
               <w:rPr>
                 <w:b/>
                 <w:bCs/>
-                <w:szCs w:val="26"/>
+                <w:sz w:val="20"/>
+                <w:szCs w:val="20"/>
               </w:rPr>
               <w:t>Total time (s)</w:t>
             </w:r>
@@ -1538,7 +1553,7 @@
         </w:tc>
         <w:tc>
           <w:tcPr>
-            <w:tcW w:w="953" w:type="dxa"/>
+            <w:tcW w:w="996" w:type="dxa"/>
             <w:vAlign w:val="center"/>
           </w:tcPr>
           <w:p>
@@ -1548,14 +1563,16 @@
               <w:rPr>
                 <w:b/>
                 <w:bCs/>
-                <w:szCs w:val="26"/>
+                <w:sz w:val="20"/>
+                <w:szCs w:val="20"/>
               </w:rPr>
             </w:pPr>
             <w:r>
               <w:rPr>
                 <w:b/>
                 <w:bCs/>
-                <w:szCs w:val="26"/>
+                <w:sz w:val="20"/>
+                <w:szCs w:val="20"/>
               </w:rPr>
               <w:t>On a sample (s)</w:t>
             </w:r>
@@ -1565,24 +1582,26 @@
       <w:tr>
         <w:tc>
           <w:tcPr>
-            <w:tcW w:w="2757" w:type="dxa"/>
-            <w:vAlign w:val="center"/>
-          </w:tcPr>
-          <w:p>
-            <w:pPr>
-              <w:ind w:firstLine="0"/>
-              <w:jc w:val="center"/>
-              <w:rPr>
-                <w:b/>
-                <w:bCs/>
-                <w:szCs w:val="26"/>
-              </w:rPr>
-            </w:pPr>
-            <w:r>
-              <w:rPr>
-                <w:b/>
-                <w:bCs/>
-                <w:szCs w:val="26"/>
+            <w:tcW w:w="2122" w:type="dxa"/>
+            <w:vAlign w:val="center"/>
+          </w:tcPr>
+          <w:p>
+            <w:pPr>
+              <w:ind w:firstLine="0"/>
+              <w:jc w:val="center"/>
+              <w:rPr>
+                <w:i/>
+                <w:iCs/>
+                <w:sz w:val="20"/>
+                <w:szCs w:val="20"/>
+              </w:rPr>
+            </w:pPr>
+            <w:r>
+              <w:rPr>
+                <w:i/>
+                <w:iCs/>
+                <w:sz w:val="20"/>
+                <w:szCs w:val="20"/>
               </w:rPr>
               <w:t>all-MiniLM-L6-v2</w:t>
             </w:r>
@@ -1590,27 +1609,30 @@
         </w:tc>
         <w:tc>
           <w:tcPr>
-            <w:tcW w:w="1554" w:type="dxa"/>
-            <w:vAlign w:val="center"/>
-          </w:tcPr>
-          <w:p>
-            <w:pPr>
-              <w:ind w:firstLine="0"/>
-              <w:jc w:val="center"/>
-              <w:rPr>
-                <w:szCs w:val="26"/>
-                <w:lang w:val="vi-VN"/>
-              </w:rPr>
-            </w:pPr>
-            <w:r>
-              <w:rPr>
-                <w:szCs w:val="26"/>
+            <w:tcW w:w="2244" w:type="dxa"/>
+            <w:vAlign w:val="center"/>
+          </w:tcPr>
+          <w:p>
+            <w:pPr>
+              <w:ind w:firstLine="0"/>
+              <w:jc w:val="center"/>
+              <w:rPr>
+                <w:sz w:val="20"/>
+                <w:szCs w:val="20"/>
+                <w:lang w:val="vi-VN"/>
+              </w:rPr>
+            </w:pPr>
+            <w:r>
+              <w:rPr>
+                <w:sz w:val="20"/>
+                <w:szCs w:val="20"/>
               </w:rPr>
               <w:t>0</w:t>
             </w:r>
             <w:r>
               <w:rPr>
-                <w:szCs w:val="26"/>
+                <w:sz w:val="20"/>
+                <w:szCs w:val="20"/>
                 <w:lang w:val="vi-VN"/>
               </w:rPr>
               <w:t>.57</w:t>
@@ -1619,27 +1641,30 @@
         </w:tc>
         <w:tc>
           <w:tcPr>
-            <w:tcW w:w="1554" w:type="dxa"/>
-            <w:vAlign w:val="center"/>
-          </w:tcPr>
-          <w:p>
-            <w:pPr>
-              <w:ind w:firstLine="0"/>
-              <w:jc w:val="center"/>
-              <w:rPr>
-                <w:szCs w:val="26"/>
-                <w:lang w:val="vi-VN"/>
-              </w:rPr>
-            </w:pPr>
-            <w:r>
-              <w:rPr>
-                <w:szCs w:val="26"/>
+            <w:tcW w:w="1609" w:type="dxa"/>
+            <w:vAlign w:val="center"/>
+          </w:tcPr>
+          <w:p>
+            <w:pPr>
+              <w:ind w:firstLine="0"/>
+              <w:jc w:val="center"/>
+              <w:rPr>
+                <w:sz w:val="20"/>
+                <w:szCs w:val="20"/>
+                <w:lang w:val="vi-VN"/>
+              </w:rPr>
+            </w:pPr>
+            <w:r>
+              <w:rPr>
+                <w:sz w:val="20"/>
+                <w:szCs w:val="20"/>
               </w:rPr>
               <w:t>0</w:t>
             </w:r>
             <w:r>
               <w:rPr>
-                <w:szCs w:val="26"/>
+                <w:sz w:val="20"/>
+                <w:szCs w:val="20"/>
                 <w:lang w:val="vi-VN"/>
               </w:rPr>
               <w:t>.28</w:t>
@@ -1648,27 +1673,30 @@
         </w:tc>
         <w:tc>
           <w:tcPr>
-            <w:tcW w:w="1554" w:type="dxa"/>
-            <w:vAlign w:val="center"/>
-          </w:tcPr>
-          <w:p>
-            <w:pPr>
-              <w:ind w:firstLine="0"/>
-              <w:jc w:val="center"/>
-              <w:rPr>
-                <w:szCs w:val="26"/>
-                <w:lang w:val="vi-VN"/>
-              </w:rPr>
-            </w:pPr>
-            <w:r>
-              <w:rPr>
-                <w:szCs w:val="26"/>
+            <w:tcW w:w="1609" w:type="dxa"/>
+            <w:vAlign w:val="center"/>
+          </w:tcPr>
+          <w:p>
+            <w:pPr>
+              <w:ind w:firstLine="0"/>
+              <w:jc w:val="center"/>
+              <w:rPr>
+                <w:sz w:val="20"/>
+                <w:szCs w:val="20"/>
+                <w:lang w:val="vi-VN"/>
+              </w:rPr>
+            </w:pPr>
+            <w:r>
+              <w:rPr>
+                <w:sz w:val="20"/>
+                <w:szCs w:val="20"/>
               </w:rPr>
               <w:t>0</w:t>
             </w:r>
             <w:r>
               <w:rPr>
-                <w:szCs w:val="26"/>
+                <w:sz w:val="20"/>
+                <w:szCs w:val="20"/>
                 <w:lang w:val="vi-VN"/>
               </w:rPr>
               <w:t>.17</w:t>
@@ -1677,20 +1705,22 @@
         </w:tc>
         <w:tc>
           <w:tcPr>
-            <w:tcW w:w="895" w:type="dxa"/>
-            <w:vAlign w:val="center"/>
-          </w:tcPr>
-          <w:p>
-            <w:pPr>
-              <w:ind w:firstLine="0"/>
-              <w:jc w:val="center"/>
-              <w:rPr>
-                <w:szCs w:val="26"/>
-              </w:rPr>
-            </w:pPr>
-            <w:r>
-              <w:rPr>
-                <w:szCs w:val="26"/>
+            <w:tcW w:w="939" w:type="dxa"/>
+            <w:vAlign w:val="center"/>
+          </w:tcPr>
+          <w:p>
+            <w:pPr>
+              <w:ind w:firstLine="0"/>
+              <w:jc w:val="center"/>
+              <w:rPr>
+                <w:sz w:val="20"/>
+                <w:szCs w:val="20"/>
+              </w:rPr>
+            </w:pPr>
+            <w:r>
+              <w:rPr>
+                <w:sz w:val="20"/>
+                <w:szCs w:val="20"/>
               </w:rPr>
               <w:t>74</w:t>
             </w:r>
@@ -1698,20 +1728,22 @@
         </w:tc>
         <w:tc>
           <w:tcPr>
-            <w:tcW w:w="895" w:type="dxa"/>
-            <w:vAlign w:val="center"/>
-          </w:tcPr>
-          <w:p>
-            <w:pPr>
-              <w:ind w:firstLine="0"/>
-              <w:jc w:val="center"/>
-              <w:rPr>
-                <w:szCs w:val="26"/>
-              </w:rPr>
-            </w:pPr>
-            <w:r>
-              <w:rPr>
-                <w:szCs w:val="26"/>
+            <w:tcW w:w="939" w:type="dxa"/>
+            <w:vAlign w:val="center"/>
+          </w:tcPr>
+          <w:p>
+            <w:pPr>
+              <w:ind w:firstLine="0"/>
+              <w:jc w:val="center"/>
+              <w:rPr>
+                <w:sz w:val="20"/>
+                <w:szCs w:val="20"/>
+              </w:rPr>
+            </w:pPr>
+            <w:r>
+              <w:rPr>
+                <w:sz w:val="20"/>
+                <w:szCs w:val="20"/>
               </w:rPr>
               <w:t>2828</w:t>
             </w:r>
@@ -1719,20 +1751,22 @@
         </w:tc>
         <w:tc>
           <w:tcPr>
-            <w:tcW w:w="1358" w:type="dxa"/>
-            <w:vAlign w:val="center"/>
-          </w:tcPr>
-          <w:p>
-            <w:pPr>
-              <w:ind w:firstLine="0"/>
-              <w:jc w:val="center"/>
-              <w:rPr>
-                <w:szCs w:val="26"/>
-              </w:rPr>
-            </w:pPr>
-            <w:r>
-              <w:rPr>
-                <w:szCs w:val="26"/>
+            <w:tcW w:w="1401" w:type="dxa"/>
+            <w:vAlign w:val="center"/>
+          </w:tcPr>
+          <w:p>
+            <w:pPr>
+              <w:ind w:firstLine="0"/>
+              <w:jc w:val="center"/>
+              <w:rPr>
+                <w:sz w:val="20"/>
+                <w:szCs w:val="20"/>
+              </w:rPr>
+            </w:pPr>
+            <w:r>
+              <w:rPr>
+                <w:sz w:val="20"/>
+                <w:szCs w:val="20"/>
               </w:rPr>
               <w:t>384</w:t>
             </w:r>
@@ -1740,20 +1774,22 @@
         </w:tc>
         <w:tc>
           <w:tcPr>
-            <w:tcW w:w="747" w:type="dxa"/>
-            <w:vAlign w:val="center"/>
-          </w:tcPr>
-          <w:p>
-            <w:pPr>
-              <w:ind w:firstLine="0"/>
-              <w:jc w:val="center"/>
-              <w:rPr>
-                <w:szCs w:val="26"/>
-              </w:rPr>
-            </w:pPr>
-            <w:r>
-              <w:rPr>
-                <w:szCs w:val="26"/>
+            <w:tcW w:w="785" w:type="dxa"/>
+            <w:vAlign w:val="center"/>
+          </w:tcPr>
+          <w:p>
+            <w:pPr>
+              <w:ind w:firstLine="0"/>
+              <w:jc w:val="center"/>
+              <w:rPr>
+                <w:sz w:val="20"/>
+                <w:szCs w:val="20"/>
+              </w:rPr>
+            </w:pPr>
+            <w:r>
+              <w:rPr>
+                <w:sz w:val="20"/>
+                <w:szCs w:val="20"/>
               </w:rPr>
               <w:t>95</w:t>
             </w:r>
@@ -1761,20 +1797,22 @@
         </w:tc>
         <w:tc>
           <w:tcPr>
-            <w:tcW w:w="953" w:type="dxa"/>
-            <w:vAlign w:val="center"/>
-          </w:tcPr>
-          <w:p>
-            <w:pPr>
-              <w:ind w:firstLine="0"/>
-              <w:jc w:val="center"/>
-              <w:rPr>
-                <w:szCs w:val="26"/>
-              </w:rPr>
-            </w:pPr>
-            <w:r>
-              <w:rPr>
-                <w:szCs w:val="26"/>
+            <w:tcW w:w="996" w:type="dxa"/>
+            <w:vAlign w:val="center"/>
+          </w:tcPr>
+          <w:p>
+            <w:pPr>
+              <w:ind w:firstLine="0"/>
+              <w:jc w:val="center"/>
+              <w:rPr>
+                <w:sz w:val="20"/>
+                <w:szCs w:val="20"/>
+              </w:rPr>
+            </w:pPr>
+            <w:r>
+              <w:rPr>
+                <w:sz w:val="20"/>
+                <w:szCs w:val="20"/>
               </w:rPr>
               <w:t>0.11</w:t>
             </w:r>
@@ -1784,24 +1822,26 @@
       <w:tr>
         <w:tc>
           <w:tcPr>
-            <w:tcW w:w="2757" w:type="dxa"/>
-            <w:vAlign w:val="center"/>
-          </w:tcPr>
-          <w:p>
-            <w:pPr>
-              <w:ind w:firstLine="0"/>
-              <w:jc w:val="center"/>
-              <w:rPr>
-                <w:b/>
-                <w:bCs/>
-                <w:szCs w:val="26"/>
-              </w:rPr>
-            </w:pPr>
-            <w:r>
-              <w:rPr>
-                <w:b/>
-                <w:bCs/>
-                <w:szCs w:val="26"/>
+            <w:tcW w:w="2122" w:type="dxa"/>
+            <w:vAlign w:val="center"/>
+          </w:tcPr>
+          <w:p>
+            <w:pPr>
+              <w:ind w:firstLine="0"/>
+              <w:jc w:val="center"/>
+              <w:rPr>
+                <w:i/>
+                <w:iCs/>
+                <w:sz w:val="20"/>
+                <w:szCs w:val="20"/>
+              </w:rPr>
+            </w:pPr>
+            <w:r>
+              <w:rPr>
+                <w:i/>
+                <w:iCs/>
+                <w:sz w:val="20"/>
+                <w:szCs w:val="20"/>
               </w:rPr>
               <w:t>bert-base-vietnamese-uncased</w:t>
             </w:r>
@@ -1809,21 +1849,23 @@
         </w:tc>
         <w:tc>
           <w:tcPr>
-            <w:tcW w:w="1554" w:type="dxa"/>
-            <w:vAlign w:val="center"/>
-          </w:tcPr>
-          <w:p>
-            <w:pPr>
-              <w:ind w:firstLine="0"/>
-              <w:jc w:val="center"/>
-              <w:rPr>
-                <w:szCs w:val="26"/>
-                <w:lang w:val="vi-VN"/>
-              </w:rPr>
-            </w:pPr>
-            <w:r>
-              <w:rPr>
-                <w:szCs w:val="26"/>
+            <w:tcW w:w="2244" w:type="dxa"/>
+            <w:vAlign w:val="center"/>
+          </w:tcPr>
+          <w:p>
+            <w:pPr>
+              <w:ind w:firstLine="0"/>
+              <w:jc w:val="center"/>
+              <w:rPr>
+                <w:sz w:val="20"/>
+                <w:szCs w:val="20"/>
+                <w:lang w:val="vi-VN"/>
+              </w:rPr>
+            </w:pPr>
+            <w:r>
+              <w:rPr>
+                <w:sz w:val="20"/>
+                <w:szCs w:val="20"/>
               </w:rPr>
               <w:t>0.47</w:t>
             </w:r>
@@ -1831,27 +1873,30 @@
         </w:tc>
         <w:tc>
           <w:tcPr>
-            <w:tcW w:w="1554" w:type="dxa"/>
-            <w:vAlign w:val="center"/>
-          </w:tcPr>
-          <w:p>
-            <w:pPr>
-              <w:ind w:firstLine="0"/>
-              <w:jc w:val="center"/>
-              <w:rPr>
-                <w:szCs w:val="26"/>
-                <w:lang w:val="vi-VN"/>
-              </w:rPr>
-            </w:pPr>
-            <w:r>
-              <w:rPr>
-                <w:szCs w:val="26"/>
+            <w:tcW w:w="1609" w:type="dxa"/>
+            <w:vAlign w:val="center"/>
+          </w:tcPr>
+          <w:p>
+            <w:pPr>
+              <w:ind w:firstLine="0"/>
+              <w:jc w:val="center"/>
+              <w:rPr>
+                <w:sz w:val="20"/>
+                <w:szCs w:val="20"/>
+                <w:lang w:val="vi-VN"/>
+              </w:rPr>
+            </w:pPr>
+            <w:r>
+              <w:rPr>
+                <w:sz w:val="20"/>
+                <w:szCs w:val="20"/>
               </w:rPr>
               <w:t>0</w:t>
             </w:r>
             <w:r>
               <w:rPr>
-                <w:szCs w:val="26"/>
+                <w:sz w:val="20"/>
+                <w:szCs w:val="20"/>
                 <w:lang w:val="vi-VN"/>
               </w:rPr>
               <w:t>.47</w:t>
@@ -1860,27 +1905,30 @@
         </w:tc>
         <w:tc>
           <w:tcPr>
-            <w:tcW w:w="1554" w:type="dxa"/>
-            <w:vAlign w:val="center"/>
-          </w:tcPr>
-          <w:p>
-            <w:pPr>
-              <w:ind w:firstLine="0"/>
-              <w:jc w:val="center"/>
-              <w:rPr>
-                <w:szCs w:val="26"/>
-                <w:lang w:val="vi-VN"/>
-              </w:rPr>
-            </w:pPr>
-            <w:r>
-              <w:rPr>
-                <w:szCs w:val="26"/>
+            <w:tcW w:w="1609" w:type="dxa"/>
+            <w:vAlign w:val="center"/>
+          </w:tcPr>
+          <w:p>
+            <w:pPr>
+              <w:ind w:firstLine="0"/>
+              <w:jc w:val="center"/>
+              <w:rPr>
+                <w:sz w:val="20"/>
+                <w:szCs w:val="20"/>
+                <w:lang w:val="vi-VN"/>
+              </w:rPr>
+            </w:pPr>
+            <w:r>
+              <w:rPr>
+                <w:sz w:val="20"/>
+                <w:szCs w:val="20"/>
               </w:rPr>
               <w:t>0</w:t>
             </w:r>
             <w:r>
               <w:rPr>
-                <w:szCs w:val="26"/>
+                <w:sz w:val="20"/>
+                <w:szCs w:val="20"/>
                 <w:lang w:val="vi-VN"/>
               </w:rPr>
               <w:t>.48</w:t>
@@ -1889,20 +1937,22 @@
         </w:tc>
         <w:tc>
           <w:tcPr>
-            <w:tcW w:w="895" w:type="dxa"/>
-            <w:vAlign w:val="center"/>
-          </w:tcPr>
-          <w:p>
-            <w:pPr>
-              <w:ind w:firstLine="0"/>
-              <w:jc w:val="center"/>
-              <w:rPr>
-                <w:szCs w:val="26"/>
-              </w:rPr>
-            </w:pPr>
-            <w:r>
-              <w:rPr>
-                <w:szCs w:val="26"/>
+            <w:tcW w:w="939" w:type="dxa"/>
+            <w:vAlign w:val="center"/>
+          </w:tcPr>
+          <w:p>
+            <w:pPr>
+              <w:ind w:firstLine="0"/>
+              <w:jc w:val="center"/>
+              <w:rPr>
+                <w:sz w:val="20"/>
+                <w:szCs w:val="20"/>
+              </w:rPr>
+            </w:pPr>
+            <w:r>
+              <w:rPr>
+                <w:sz w:val="20"/>
+                <w:szCs w:val="20"/>
               </w:rPr>
               <w:t>53</w:t>
             </w:r>
@@ -1910,20 +1960,22 @@
         </w:tc>
         <w:tc>
           <w:tcPr>
-            <w:tcW w:w="895" w:type="dxa"/>
-            <w:vAlign w:val="center"/>
-          </w:tcPr>
-          <w:p>
-            <w:pPr>
-              <w:ind w:firstLine="0"/>
-              <w:jc w:val="center"/>
-              <w:rPr>
-                <w:szCs w:val="26"/>
-              </w:rPr>
-            </w:pPr>
-            <w:r>
-              <w:rPr>
-                <w:szCs w:val="26"/>
+            <w:tcW w:w="939" w:type="dxa"/>
+            <w:vAlign w:val="center"/>
+          </w:tcPr>
+          <w:p>
+            <w:pPr>
+              <w:ind w:firstLine="0"/>
+              <w:jc w:val="center"/>
+              <w:rPr>
+                <w:sz w:val="20"/>
+                <w:szCs w:val="20"/>
+              </w:rPr>
+            </w:pPr>
+            <w:r>
+              <w:rPr>
+                <w:sz w:val="20"/>
+                <w:szCs w:val="20"/>
               </w:rPr>
               <w:t>2267</w:t>
             </w:r>
@@ -1931,20 +1983,22 @@
         </w:tc>
         <w:tc>
           <w:tcPr>
-            <w:tcW w:w="1358" w:type="dxa"/>
-            <w:vAlign w:val="center"/>
-          </w:tcPr>
-          <w:p>
-            <w:pPr>
-              <w:ind w:firstLine="0"/>
-              <w:jc w:val="center"/>
-              <w:rPr>
-                <w:szCs w:val="26"/>
-              </w:rPr>
-            </w:pPr>
-            <w:r>
-              <w:rPr>
-                <w:szCs w:val="26"/>
+            <w:tcW w:w="1401" w:type="dxa"/>
+            <w:vAlign w:val="center"/>
+          </w:tcPr>
+          <w:p>
+            <w:pPr>
+              <w:ind w:firstLine="0"/>
+              <w:jc w:val="center"/>
+              <w:rPr>
+                <w:sz w:val="20"/>
+                <w:szCs w:val="20"/>
+              </w:rPr>
+            </w:pPr>
+            <w:r>
+              <w:rPr>
+                <w:sz w:val="20"/>
+                <w:szCs w:val="20"/>
               </w:rPr>
               <w:t>768</w:t>
             </w:r>
@@ -1952,20 +2006,22 @@
         </w:tc>
         <w:tc>
           <w:tcPr>
-            <w:tcW w:w="747" w:type="dxa"/>
-            <w:vAlign w:val="center"/>
-          </w:tcPr>
-          <w:p>
-            <w:pPr>
-              <w:ind w:firstLine="0"/>
-              <w:jc w:val="center"/>
-              <w:rPr>
-                <w:szCs w:val="26"/>
-              </w:rPr>
-            </w:pPr>
-            <w:r>
-              <w:rPr>
-                <w:szCs w:val="26"/>
+            <w:tcW w:w="785" w:type="dxa"/>
+            <w:vAlign w:val="center"/>
+          </w:tcPr>
+          <w:p>
+            <w:pPr>
+              <w:ind w:firstLine="0"/>
+              <w:jc w:val="center"/>
+              <w:rPr>
+                <w:sz w:val="20"/>
+                <w:szCs w:val="20"/>
+              </w:rPr>
+            </w:pPr>
+            <w:r>
+              <w:rPr>
+                <w:sz w:val="20"/>
+                <w:szCs w:val="20"/>
               </w:rPr>
               <w:t>643</w:t>
             </w:r>
@@ -1973,20 +2029,22 @@
         </w:tc>
         <w:tc>
           <w:tcPr>
-            <w:tcW w:w="953" w:type="dxa"/>
-            <w:vAlign w:val="center"/>
-          </w:tcPr>
-          <w:p>
-            <w:pPr>
-              <w:ind w:firstLine="0"/>
-              <w:jc w:val="center"/>
-              <w:rPr>
-                <w:szCs w:val="26"/>
-              </w:rPr>
-            </w:pPr>
-            <w:r>
-              <w:rPr>
-                <w:szCs w:val="26"/>
+            <w:tcW w:w="996" w:type="dxa"/>
+            <w:vAlign w:val="center"/>
+          </w:tcPr>
+          <w:p>
+            <w:pPr>
+              <w:ind w:firstLine="0"/>
+              <w:jc w:val="center"/>
+              <w:rPr>
+                <w:sz w:val="20"/>
+                <w:szCs w:val="20"/>
+              </w:rPr>
+            </w:pPr>
+            <w:r>
+              <w:rPr>
+                <w:sz w:val="20"/>
+                <w:szCs w:val="20"/>
               </w:rPr>
               <w:t>0.75</w:t>
             </w:r>
@@ -1996,24 +2054,26 @@
       <w:tr>
         <w:tc>
           <w:tcPr>
-            <w:tcW w:w="2757" w:type="dxa"/>
-            <w:vAlign w:val="center"/>
-          </w:tcPr>
-          <w:p>
-            <w:pPr>
-              <w:ind w:firstLine="0"/>
-              <w:jc w:val="center"/>
-              <w:rPr>
-                <w:b/>
-                <w:bCs/>
-                <w:szCs w:val="26"/>
-              </w:rPr>
-            </w:pPr>
-            <w:r>
-              <w:rPr>
-                <w:b/>
-                <w:bCs/>
-                <w:szCs w:val="26"/>
+            <w:tcW w:w="2122" w:type="dxa"/>
+            <w:vAlign w:val="center"/>
+          </w:tcPr>
+          <w:p>
+            <w:pPr>
+              <w:ind w:firstLine="0"/>
+              <w:jc w:val="center"/>
+              <w:rPr>
+                <w:i/>
+                <w:iCs/>
+                <w:sz w:val="20"/>
+                <w:szCs w:val="20"/>
+              </w:rPr>
+            </w:pPr>
+            <w:r>
+              <w:rPr>
+                <w:i/>
+                <w:iCs/>
+                <w:sz w:val="20"/>
+                <w:szCs w:val="20"/>
               </w:rPr>
               <w:t>distiluse-base-multilingual-cased-v2</w:t>
             </w:r>
@@ -2021,27 +2081,30 @@
         </w:tc>
         <w:tc>
           <w:tcPr>
-            <w:tcW w:w="1554" w:type="dxa"/>
-            <w:vAlign w:val="center"/>
-          </w:tcPr>
-          <w:p>
-            <w:pPr>
-              <w:ind w:firstLine="0"/>
-              <w:jc w:val="center"/>
-              <w:rPr>
-                <w:szCs w:val="26"/>
-                <w:lang w:val="vi-VN"/>
-              </w:rPr>
-            </w:pPr>
-            <w:r>
-              <w:rPr>
-                <w:szCs w:val="26"/>
+            <w:tcW w:w="2244" w:type="dxa"/>
+            <w:vAlign w:val="center"/>
+          </w:tcPr>
+          <w:p>
+            <w:pPr>
+              <w:ind w:firstLine="0"/>
+              <w:jc w:val="center"/>
+              <w:rPr>
+                <w:sz w:val="20"/>
+                <w:szCs w:val="20"/>
+                <w:lang w:val="vi-VN"/>
+              </w:rPr>
+            </w:pPr>
+            <w:r>
+              <w:rPr>
+                <w:sz w:val="20"/>
+                <w:szCs w:val="20"/>
               </w:rPr>
               <w:t>0</w:t>
             </w:r>
             <w:r>
               <w:rPr>
-                <w:szCs w:val="26"/>
+                <w:sz w:val="20"/>
+                <w:szCs w:val="20"/>
                 <w:lang w:val="vi-VN"/>
               </w:rPr>
               <w:t>.57</w:t>
@@ -2050,21 +2113,23 @@
         </w:tc>
         <w:tc>
           <w:tcPr>
-            <w:tcW w:w="1554" w:type="dxa"/>
-            <w:vAlign w:val="center"/>
-          </w:tcPr>
-          <w:p>
-            <w:pPr>
-              <w:ind w:firstLine="0"/>
-              <w:jc w:val="center"/>
-              <w:rPr>
-                <w:szCs w:val="26"/>
-                <w:lang w:val="vi-VN"/>
-              </w:rPr>
-            </w:pPr>
-            <w:r>
-              <w:rPr>
-                <w:szCs w:val="26"/>
+            <w:tcW w:w="1609" w:type="dxa"/>
+            <w:vAlign w:val="center"/>
+          </w:tcPr>
+          <w:p>
+            <w:pPr>
+              <w:ind w:firstLine="0"/>
+              <w:jc w:val="center"/>
+              <w:rPr>
+                <w:sz w:val="20"/>
+                <w:szCs w:val="20"/>
+                <w:lang w:val="vi-VN"/>
+              </w:rPr>
+            </w:pPr>
+            <w:r>
+              <w:rPr>
+                <w:sz w:val="20"/>
+                <w:szCs w:val="20"/>
                 <w:lang w:val="vi-VN"/>
               </w:rPr>
               <w:t>0.57</w:t>
@@ -2073,21 +2138,23 @@
         </w:tc>
         <w:tc>
           <w:tcPr>
-            <w:tcW w:w="1554" w:type="dxa"/>
-            <w:vAlign w:val="center"/>
-          </w:tcPr>
-          <w:p>
-            <w:pPr>
-              <w:ind w:firstLine="0"/>
-              <w:jc w:val="center"/>
-              <w:rPr>
-                <w:szCs w:val="26"/>
-                <w:lang w:val="vi-VN"/>
-              </w:rPr>
-            </w:pPr>
-            <w:r>
-              <w:rPr>
-                <w:szCs w:val="26"/>
+            <w:tcW w:w="1609" w:type="dxa"/>
+            <w:vAlign w:val="center"/>
+          </w:tcPr>
+          <w:p>
+            <w:pPr>
+              <w:ind w:firstLine="0"/>
+              <w:jc w:val="center"/>
+              <w:rPr>
+                <w:sz w:val="20"/>
+                <w:szCs w:val="20"/>
+                <w:lang w:val="vi-VN"/>
+              </w:rPr>
+            </w:pPr>
+            <w:r>
+              <w:rPr>
+                <w:sz w:val="20"/>
+                <w:szCs w:val="20"/>
                 <w:lang w:val="vi-VN"/>
               </w:rPr>
               <w:t>0.54</w:t>
@@ -2096,20 +2163,22 @@
         </w:tc>
         <w:tc>
           <w:tcPr>
-            <w:tcW w:w="895" w:type="dxa"/>
-            <w:vAlign w:val="center"/>
-          </w:tcPr>
-          <w:p>
-            <w:pPr>
-              <w:ind w:firstLine="0"/>
-              <w:jc w:val="center"/>
-              <w:rPr>
-                <w:szCs w:val="26"/>
-              </w:rPr>
-            </w:pPr>
-            <w:r>
-              <w:rPr>
-                <w:szCs w:val="26"/>
+            <w:tcW w:w="939" w:type="dxa"/>
+            <w:vAlign w:val="center"/>
+          </w:tcPr>
+          <w:p>
+            <w:pPr>
+              <w:ind w:firstLine="0"/>
+              <w:jc w:val="center"/>
+              <w:rPr>
+                <w:sz w:val="20"/>
+                <w:szCs w:val="20"/>
+              </w:rPr>
+            </w:pPr>
+            <w:r>
+              <w:rPr>
+                <w:sz w:val="20"/>
+                <w:szCs w:val="20"/>
               </w:rPr>
               <w:t>44</w:t>
             </w:r>
@@ -2117,20 +2186,22 @@
         </w:tc>
         <w:tc>
           <w:tcPr>
-            <w:tcW w:w="895" w:type="dxa"/>
-            <w:vAlign w:val="center"/>
-          </w:tcPr>
-          <w:p>
-            <w:pPr>
-              <w:ind w:firstLine="0"/>
-              <w:jc w:val="center"/>
-              <w:rPr>
-                <w:szCs w:val="26"/>
-              </w:rPr>
-            </w:pPr>
-            <w:r>
-              <w:rPr>
-                <w:szCs w:val="26"/>
+            <w:tcW w:w="939" w:type="dxa"/>
+            <w:vAlign w:val="center"/>
+          </w:tcPr>
+          <w:p>
+            <w:pPr>
+              <w:ind w:firstLine="0"/>
+              <w:jc w:val="center"/>
+              <w:rPr>
+                <w:sz w:val="20"/>
+                <w:szCs w:val="20"/>
+              </w:rPr>
+            </w:pPr>
+            <w:r>
+              <w:rPr>
+                <w:sz w:val="20"/>
+                <w:szCs w:val="20"/>
               </w:rPr>
               <w:t>2031</w:t>
             </w:r>
@@ -2138,20 +2209,22 @@
         </w:tc>
         <w:tc>
           <w:tcPr>
-            <w:tcW w:w="1358" w:type="dxa"/>
-            <w:vAlign w:val="center"/>
-          </w:tcPr>
-          <w:p>
-            <w:pPr>
-              <w:ind w:firstLine="0"/>
-              <w:jc w:val="center"/>
-              <w:rPr>
-                <w:szCs w:val="26"/>
-              </w:rPr>
-            </w:pPr>
-            <w:r>
-              <w:rPr>
-                <w:szCs w:val="26"/>
+            <w:tcW w:w="1401" w:type="dxa"/>
+            <w:vAlign w:val="center"/>
+          </w:tcPr>
+          <w:p>
+            <w:pPr>
+              <w:ind w:firstLine="0"/>
+              <w:jc w:val="center"/>
+              <w:rPr>
+                <w:sz w:val="20"/>
+                <w:szCs w:val="20"/>
+              </w:rPr>
+            </w:pPr>
+            <w:r>
+              <w:rPr>
+                <w:sz w:val="20"/>
+                <w:szCs w:val="20"/>
               </w:rPr>
               <w:t>512</w:t>
             </w:r>
@@ -2159,20 +2232,22 @@
         </w:tc>
         <w:tc>
           <w:tcPr>
-            <w:tcW w:w="747" w:type="dxa"/>
-            <w:vAlign w:val="center"/>
-          </w:tcPr>
-          <w:p>
-            <w:pPr>
-              <w:ind w:firstLine="0"/>
-              <w:jc w:val="center"/>
-              <w:rPr>
-                <w:szCs w:val="26"/>
-              </w:rPr>
-            </w:pPr>
-            <w:r>
-              <w:rPr>
-                <w:szCs w:val="26"/>
+            <w:tcW w:w="785" w:type="dxa"/>
+            <w:vAlign w:val="center"/>
+          </w:tcPr>
+          <w:p>
+            <w:pPr>
+              <w:ind w:firstLine="0"/>
+              <w:jc w:val="center"/>
+              <w:rPr>
+                <w:sz w:val="20"/>
+                <w:szCs w:val="20"/>
+              </w:rPr>
+            </w:pPr>
+            <w:r>
+              <w:rPr>
+                <w:sz w:val="20"/>
+                <w:szCs w:val="20"/>
               </w:rPr>
               <w:t>159</w:t>
             </w:r>
@@ -2180,20 +2255,22 @@
         </w:tc>
         <w:tc>
           <w:tcPr>
-            <w:tcW w:w="953" w:type="dxa"/>
-            <w:vAlign w:val="center"/>
-          </w:tcPr>
-          <w:p>
-            <w:pPr>
-              <w:ind w:firstLine="0"/>
-              <w:jc w:val="center"/>
-              <w:rPr>
-                <w:szCs w:val="26"/>
-              </w:rPr>
-            </w:pPr>
-            <w:r>
-              <w:rPr>
-                <w:szCs w:val="26"/>
+            <w:tcW w:w="996" w:type="dxa"/>
+            <w:vAlign w:val="center"/>
+          </w:tcPr>
+          <w:p>
+            <w:pPr>
+              <w:ind w:firstLine="0"/>
+              <w:jc w:val="center"/>
+              <w:rPr>
+                <w:sz w:val="20"/>
+                <w:szCs w:val="20"/>
+              </w:rPr>
+            </w:pPr>
+            <w:r>
+              <w:rPr>
+                <w:sz w:val="20"/>
+                <w:szCs w:val="20"/>
               </w:rPr>
               <w:t>0.18</w:t>
             </w:r>
@@ -2203,24 +2280,26 @@
       <w:tr>
         <w:tc>
           <w:tcPr>
-            <w:tcW w:w="2757" w:type="dxa"/>
-            <w:vAlign w:val="center"/>
-          </w:tcPr>
-          <w:p>
-            <w:pPr>
-              <w:ind w:firstLine="0"/>
-              <w:jc w:val="center"/>
-              <w:rPr>
-                <w:b/>
-                <w:bCs/>
-                <w:szCs w:val="26"/>
-              </w:rPr>
-            </w:pPr>
-            <w:r>
-              <w:rPr>
-                <w:b/>
-                <w:bCs/>
-                <w:szCs w:val="26"/>
+            <w:tcW w:w="2122" w:type="dxa"/>
+            <w:vAlign w:val="center"/>
+          </w:tcPr>
+          <w:p>
+            <w:pPr>
+              <w:ind w:firstLine="0"/>
+              <w:jc w:val="center"/>
+              <w:rPr>
+                <w:i/>
+                <w:iCs/>
+                <w:sz w:val="20"/>
+                <w:szCs w:val="20"/>
+              </w:rPr>
+            </w:pPr>
+            <w:r>
+              <w:rPr>
+                <w:i/>
+                <w:iCs/>
+                <w:sz w:val="20"/>
+                <w:szCs w:val="20"/>
               </w:rPr>
               <w:t>multilingual-e5-small</w:t>
             </w:r>
@@ -2228,27 +2307,30 @@
         </w:tc>
         <w:tc>
           <w:tcPr>
-            <w:tcW w:w="1554" w:type="dxa"/>
-            <w:vAlign w:val="center"/>
-          </w:tcPr>
-          <w:p>
-            <w:pPr>
-              <w:ind w:firstLine="0"/>
-              <w:jc w:val="center"/>
-              <w:rPr>
-                <w:szCs w:val="26"/>
-                <w:lang w:val="vi-VN"/>
-              </w:rPr>
-            </w:pPr>
-            <w:r>
-              <w:rPr>
-                <w:szCs w:val="26"/>
+            <w:tcW w:w="2244" w:type="dxa"/>
+            <w:vAlign w:val="center"/>
+          </w:tcPr>
+          <w:p>
+            <w:pPr>
+              <w:ind w:firstLine="0"/>
+              <w:jc w:val="center"/>
+              <w:rPr>
+                <w:sz w:val="20"/>
+                <w:szCs w:val="20"/>
+                <w:lang w:val="vi-VN"/>
+              </w:rPr>
+            </w:pPr>
+            <w:r>
+              <w:rPr>
+                <w:sz w:val="20"/>
+                <w:szCs w:val="20"/>
               </w:rPr>
               <w:t>1</w:t>
             </w:r>
             <w:r>
               <w:rPr>
-                <w:szCs w:val="26"/>
+                <w:sz w:val="20"/>
+                <w:szCs w:val="20"/>
                 <w:lang w:val="vi-VN"/>
               </w:rPr>
               <w:t>.00</w:t>
@@ -2257,27 +2339,30 @@
         </w:tc>
         <w:tc>
           <w:tcPr>
-            <w:tcW w:w="1554" w:type="dxa"/>
-            <w:vAlign w:val="center"/>
-          </w:tcPr>
-          <w:p>
-            <w:pPr>
-              <w:ind w:firstLine="0"/>
-              <w:jc w:val="center"/>
-              <w:rPr>
-                <w:szCs w:val="26"/>
-                <w:lang w:val="vi-VN"/>
-              </w:rPr>
-            </w:pPr>
-            <w:r>
-              <w:rPr>
-                <w:szCs w:val="26"/>
+            <w:tcW w:w="1609" w:type="dxa"/>
+            <w:vAlign w:val="center"/>
+          </w:tcPr>
+          <w:p>
+            <w:pPr>
+              <w:ind w:firstLine="0"/>
+              <w:jc w:val="center"/>
+              <w:rPr>
+                <w:sz w:val="20"/>
+                <w:szCs w:val="20"/>
+                <w:lang w:val="vi-VN"/>
+              </w:rPr>
+            </w:pPr>
+            <w:r>
+              <w:rPr>
+                <w:sz w:val="20"/>
+                <w:szCs w:val="20"/>
               </w:rPr>
               <w:t>0</w:t>
             </w:r>
             <w:r>
               <w:rPr>
-                <w:szCs w:val="26"/>
+                <w:sz w:val="20"/>
+                <w:szCs w:val="20"/>
                 <w:lang w:val="vi-VN"/>
               </w:rPr>
               <w:t>.90</w:t>
@@ -2286,27 +2371,30 @@
         </w:tc>
         <w:tc>
           <w:tcPr>
-            <w:tcW w:w="1554" w:type="dxa"/>
-            <w:vAlign w:val="center"/>
-          </w:tcPr>
-          <w:p>
-            <w:pPr>
-              <w:ind w:firstLine="0"/>
-              <w:jc w:val="center"/>
-              <w:rPr>
-                <w:szCs w:val="26"/>
-                <w:lang w:val="vi-VN"/>
-              </w:rPr>
-            </w:pPr>
-            <w:r>
-              <w:rPr>
-                <w:szCs w:val="26"/>
+            <w:tcW w:w="1609" w:type="dxa"/>
+            <w:vAlign w:val="center"/>
+          </w:tcPr>
+          <w:p>
+            <w:pPr>
+              <w:ind w:firstLine="0"/>
+              <w:jc w:val="center"/>
+              <w:rPr>
+                <w:sz w:val="20"/>
+                <w:szCs w:val="20"/>
+                <w:lang w:val="vi-VN"/>
+              </w:rPr>
+            </w:pPr>
+            <w:r>
+              <w:rPr>
+                <w:sz w:val="20"/>
+                <w:szCs w:val="20"/>
               </w:rPr>
               <w:t>0</w:t>
             </w:r>
             <w:r>
               <w:rPr>
-                <w:szCs w:val="26"/>
+                <w:sz w:val="20"/>
+                <w:szCs w:val="20"/>
                 <w:lang w:val="vi-VN"/>
               </w:rPr>
               <w:t>.88</w:t>
@@ -2315,20 +2403,22 @@
         </w:tc>
         <w:tc>
           <w:tcPr>
-            <w:tcW w:w="895" w:type="dxa"/>
-            <w:vAlign w:val="center"/>
-          </w:tcPr>
-          <w:p>
-            <w:pPr>
-              <w:ind w:firstLine="0"/>
-              <w:jc w:val="center"/>
-              <w:rPr>
-                <w:szCs w:val="26"/>
-              </w:rPr>
-            </w:pPr>
-            <w:r>
-              <w:rPr>
-                <w:szCs w:val="26"/>
+            <w:tcW w:w="939" w:type="dxa"/>
+            <w:vAlign w:val="center"/>
+          </w:tcPr>
+          <w:p>
+            <w:pPr>
+              <w:ind w:firstLine="0"/>
+              <w:jc w:val="center"/>
+              <w:rPr>
+                <w:sz w:val="20"/>
+                <w:szCs w:val="20"/>
+              </w:rPr>
+            </w:pPr>
+            <w:r>
+              <w:rPr>
+                <w:sz w:val="20"/>
+                <w:szCs w:val="20"/>
               </w:rPr>
               <w:t>45</w:t>
             </w:r>
@@ -2336,20 +2426,22 @@
         </w:tc>
         <w:tc>
           <w:tcPr>
-            <w:tcW w:w="895" w:type="dxa"/>
-            <w:vAlign w:val="center"/>
-          </w:tcPr>
-          <w:p>
-            <w:pPr>
-              <w:ind w:firstLine="0"/>
-              <w:jc w:val="center"/>
-              <w:rPr>
-                <w:szCs w:val="26"/>
-              </w:rPr>
-            </w:pPr>
-            <w:r>
-              <w:rPr>
-                <w:szCs w:val="26"/>
+            <w:tcW w:w="939" w:type="dxa"/>
+            <w:vAlign w:val="center"/>
+          </w:tcPr>
+          <w:p>
+            <w:pPr>
+              <w:ind w:firstLine="0"/>
+              <w:jc w:val="center"/>
+              <w:rPr>
+                <w:sz w:val="20"/>
+                <w:szCs w:val="20"/>
+              </w:rPr>
+            </w:pPr>
+            <w:r>
+              <w:rPr>
+                <w:sz w:val="20"/>
+                <w:szCs w:val="20"/>
               </w:rPr>
               <w:t>1967</w:t>
             </w:r>
@@ -2357,20 +2449,22 @@
         </w:tc>
         <w:tc>
           <w:tcPr>
-            <w:tcW w:w="1358" w:type="dxa"/>
-            <w:vAlign w:val="center"/>
-          </w:tcPr>
-          <w:p>
-            <w:pPr>
-              <w:ind w:firstLine="0"/>
-              <w:jc w:val="center"/>
-              <w:rPr>
-                <w:szCs w:val="26"/>
-              </w:rPr>
-            </w:pPr>
-            <w:r>
-              <w:rPr>
-                <w:szCs w:val="26"/>
+            <w:tcW w:w="1401" w:type="dxa"/>
+            <w:vAlign w:val="center"/>
+          </w:tcPr>
+          <w:p>
+            <w:pPr>
+              <w:ind w:firstLine="0"/>
+              <w:jc w:val="center"/>
+              <w:rPr>
+                <w:sz w:val="20"/>
+                <w:szCs w:val="20"/>
+              </w:rPr>
+            </w:pPr>
+            <w:r>
+              <w:rPr>
+                <w:sz w:val="20"/>
+                <w:szCs w:val="20"/>
               </w:rPr>
               <w:t>384</w:t>
             </w:r>
@@ -2378,20 +2472,22 @@
         </w:tc>
         <w:tc>
           <w:tcPr>
-            <w:tcW w:w="747" w:type="dxa"/>
-            <w:vAlign w:val="center"/>
-          </w:tcPr>
-          <w:p>
-            <w:pPr>
-              <w:ind w:firstLine="0"/>
-              <w:jc w:val="center"/>
-              <w:rPr>
-                <w:szCs w:val="26"/>
-              </w:rPr>
-            </w:pPr>
-            <w:r>
-              <w:rPr>
-                <w:szCs w:val="26"/>
+            <w:tcW w:w="785" w:type="dxa"/>
+            <w:vAlign w:val="center"/>
+          </w:tcPr>
+          <w:p>
+            <w:pPr>
+              <w:ind w:firstLine="0"/>
+              <w:jc w:val="center"/>
+              <w:rPr>
+                <w:sz w:val="20"/>
+                <w:szCs w:val="20"/>
+              </w:rPr>
+            </w:pPr>
+            <w:r>
+              <w:rPr>
+                <w:sz w:val="20"/>
+                <w:szCs w:val="20"/>
               </w:rPr>
               <w:t>210</w:t>
             </w:r>
@@ -2399,20 +2495,22 @@
         </w:tc>
         <w:tc>
           <w:tcPr>
-            <w:tcW w:w="953" w:type="dxa"/>
-            <w:vAlign w:val="center"/>
-          </w:tcPr>
-          <w:p>
-            <w:pPr>
-              <w:ind w:firstLine="0"/>
-              <w:jc w:val="center"/>
-              <w:rPr>
-                <w:szCs w:val="26"/>
-              </w:rPr>
-            </w:pPr>
-            <w:r>
-              <w:rPr>
-                <w:szCs w:val="26"/>
+            <w:tcW w:w="996" w:type="dxa"/>
+            <w:vAlign w:val="center"/>
+          </w:tcPr>
+          <w:p>
+            <w:pPr>
+              <w:ind w:firstLine="0"/>
+              <w:jc w:val="center"/>
+              <w:rPr>
+                <w:sz w:val="20"/>
+                <w:szCs w:val="20"/>
+              </w:rPr>
+            </w:pPr>
+            <w:r>
+              <w:rPr>
+                <w:sz w:val="20"/>
+                <w:szCs w:val="20"/>
               </w:rPr>
               <w:t>0.24</w:t>
             </w:r>
@@ -2422,24 +2520,26 @@
       <w:tr>
         <w:tc>
           <w:tcPr>
-            <w:tcW w:w="2757" w:type="dxa"/>
-            <w:vAlign w:val="center"/>
-          </w:tcPr>
-          <w:p>
-            <w:pPr>
-              <w:ind w:firstLine="0"/>
-              <w:jc w:val="center"/>
-              <w:rPr>
-                <w:b/>
-                <w:bCs/>
-                <w:szCs w:val="26"/>
-              </w:rPr>
-            </w:pPr>
-            <w:r>
-              <w:rPr>
-                <w:b/>
-                <w:bCs/>
-                <w:szCs w:val="26"/>
+            <w:tcW w:w="2122" w:type="dxa"/>
+            <w:vAlign w:val="center"/>
+          </w:tcPr>
+          <w:p>
+            <w:pPr>
+              <w:ind w:firstLine="0"/>
+              <w:jc w:val="center"/>
+              <w:rPr>
+                <w:i/>
+                <w:iCs/>
+                <w:sz w:val="20"/>
+                <w:szCs w:val="20"/>
+              </w:rPr>
+            </w:pPr>
+            <w:r>
+              <w:rPr>
+                <w:i/>
+                <w:iCs/>
+                <w:sz w:val="20"/>
+                <w:szCs w:val="20"/>
               </w:rPr>
               <w:t>sup-SimCSE-VietNamese-phobert-base</w:t>
             </w:r>
@@ -2447,27 +2547,30 @@
         </w:tc>
         <w:tc>
           <w:tcPr>
-            <w:tcW w:w="1554" w:type="dxa"/>
-            <w:vAlign w:val="center"/>
-          </w:tcPr>
-          <w:p>
-            <w:pPr>
-              <w:ind w:firstLine="0"/>
-              <w:jc w:val="center"/>
-              <w:rPr>
-                <w:szCs w:val="26"/>
-                <w:lang w:val="vi-VN"/>
-              </w:rPr>
-            </w:pPr>
-            <w:r>
-              <w:rPr>
-                <w:szCs w:val="26"/>
+            <w:tcW w:w="2244" w:type="dxa"/>
+            <w:vAlign w:val="center"/>
+          </w:tcPr>
+          <w:p>
+            <w:pPr>
+              <w:ind w:firstLine="0"/>
+              <w:jc w:val="center"/>
+              <w:rPr>
+                <w:sz w:val="20"/>
+                <w:szCs w:val="20"/>
+                <w:lang w:val="vi-VN"/>
+              </w:rPr>
+            </w:pPr>
+            <w:r>
+              <w:rPr>
+                <w:sz w:val="20"/>
+                <w:szCs w:val="20"/>
               </w:rPr>
               <w:t>0</w:t>
             </w:r>
             <w:r>
               <w:rPr>
-                <w:szCs w:val="26"/>
+                <w:sz w:val="20"/>
+                <w:szCs w:val="20"/>
                 <w:lang w:val="vi-VN"/>
               </w:rPr>
               <w:t>.57</w:t>
@@ -2476,27 +2579,30 @@
         </w:tc>
         <w:tc>
           <w:tcPr>
-            <w:tcW w:w="1554" w:type="dxa"/>
-            <w:vAlign w:val="center"/>
-          </w:tcPr>
-          <w:p>
-            <w:pPr>
-              <w:ind w:firstLine="0"/>
-              <w:jc w:val="center"/>
-              <w:rPr>
-                <w:szCs w:val="26"/>
-                <w:lang w:val="vi-VN"/>
-              </w:rPr>
-            </w:pPr>
-            <w:r>
-              <w:rPr>
-                <w:szCs w:val="26"/>
+            <w:tcW w:w="1609" w:type="dxa"/>
+            <w:vAlign w:val="center"/>
+          </w:tcPr>
+          <w:p>
+            <w:pPr>
+              <w:ind w:firstLine="0"/>
+              <w:jc w:val="center"/>
+              <w:rPr>
+                <w:sz w:val="20"/>
+                <w:szCs w:val="20"/>
+                <w:lang w:val="vi-VN"/>
+              </w:rPr>
+            </w:pPr>
+            <w:r>
+              <w:rPr>
+                <w:sz w:val="20"/>
+                <w:szCs w:val="20"/>
               </w:rPr>
               <w:t>0</w:t>
             </w:r>
             <w:r>
               <w:rPr>
-                <w:szCs w:val="26"/>
+                <w:sz w:val="20"/>
+                <w:szCs w:val="20"/>
                 <w:lang w:val="vi-VN"/>
               </w:rPr>
               <w:t>.62</w:t>
@@ -2505,27 +2611,30 @@
         </w:tc>
         <w:tc>
           <w:tcPr>
-            <w:tcW w:w="1554" w:type="dxa"/>
-            <w:vAlign w:val="center"/>
-          </w:tcPr>
-          <w:p>
-            <w:pPr>
-              <w:ind w:firstLine="0"/>
-              <w:jc w:val="center"/>
-              <w:rPr>
-                <w:szCs w:val="26"/>
-                <w:lang w:val="vi-VN"/>
-              </w:rPr>
-            </w:pPr>
-            <w:r>
-              <w:rPr>
-                <w:szCs w:val="26"/>
+            <w:tcW w:w="1609" w:type="dxa"/>
+            <w:vAlign w:val="center"/>
+          </w:tcPr>
+          <w:p>
+            <w:pPr>
+              <w:ind w:firstLine="0"/>
+              <w:jc w:val="center"/>
+              <w:rPr>
+                <w:sz w:val="20"/>
+                <w:szCs w:val="20"/>
+                <w:lang w:val="vi-VN"/>
+              </w:rPr>
+            </w:pPr>
+            <w:r>
+              <w:rPr>
+                <w:sz w:val="20"/>
+                <w:szCs w:val="20"/>
               </w:rPr>
               <w:t>0</w:t>
             </w:r>
             <w:r>
               <w:rPr>
-                <w:szCs w:val="26"/>
+                <w:sz w:val="20"/>
+                <w:szCs w:val="20"/>
                 <w:lang w:val="vi-VN"/>
               </w:rPr>
               <w:t>.57</w:t>
@@ -2534,20 +2643,22 @@
         </w:tc>
         <w:tc>
           <w:tcPr>
-            <w:tcW w:w="895" w:type="dxa"/>
-            <w:vAlign w:val="center"/>
-          </w:tcPr>
-          <w:p>
-            <w:pPr>
-              <w:ind w:firstLine="0"/>
-              <w:jc w:val="center"/>
-              <w:rPr>
-                <w:szCs w:val="26"/>
-              </w:rPr>
-            </w:pPr>
-            <w:r>
-              <w:rPr>
-                <w:szCs w:val="26"/>
+            <w:tcW w:w="939" w:type="dxa"/>
+            <w:vAlign w:val="center"/>
+          </w:tcPr>
+          <w:p>
+            <w:pPr>
+              <w:ind w:firstLine="0"/>
+              <w:jc w:val="center"/>
+              <w:rPr>
+                <w:sz w:val="20"/>
+                <w:szCs w:val="20"/>
+              </w:rPr>
+            </w:pPr>
+            <w:r>
+              <w:rPr>
+                <w:sz w:val="20"/>
+                <w:szCs w:val="20"/>
               </w:rPr>
               <w:t>50</w:t>
             </w:r>
@@ -2555,20 +2666,22 @@
         </w:tc>
         <w:tc>
           <w:tcPr>
-            <w:tcW w:w="895" w:type="dxa"/>
-            <w:vAlign w:val="center"/>
-          </w:tcPr>
-          <w:p>
-            <w:pPr>
-              <w:ind w:firstLine="0"/>
-              <w:jc w:val="center"/>
-              <w:rPr>
-                <w:szCs w:val="26"/>
-              </w:rPr>
-            </w:pPr>
-            <w:r>
-              <w:rPr>
-                <w:szCs w:val="26"/>
+            <w:tcW w:w="939" w:type="dxa"/>
+            <w:vAlign w:val="center"/>
+          </w:tcPr>
+          <w:p>
+            <w:pPr>
+              <w:ind w:firstLine="0"/>
+              <w:jc w:val="center"/>
+              <w:rPr>
+                <w:sz w:val="20"/>
+                <w:szCs w:val="20"/>
+              </w:rPr>
+            </w:pPr>
+            <w:r>
+              <w:rPr>
+                <w:sz w:val="20"/>
+                <w:szCs w:val="20"/>
               </w:rPr>
               <w:t>1967</w:t>
             </w:r>
@@ -2576,20 +2689,22 @@
         </w:tc>
         <w:tc>
           <w:tcPr>
-            <w:tcW w:w="1358" w:type="dxa"/>
-            <w:vAlign w:val="center"/>
-          </w:tcPr>
-          <w:p>
-            <w:pPr>
-              <w:ind w:firstLine="0"/>
-              <w:jc w:val="center"/>
-              <w:rPr>
-                <w:szCs w:val="26"/>
-              </w:rPr>
-            </w:pPr>
-            <w:r>
-              <w:rPr>
-                <w:szCs w:val="26"/>
+            <w:tcW w:w="1401" w:type="dxa"/>
+            <w:vAlign w:val="center"/>
+          </w:tcPr>
+          <w:p>
+            <w:pPr>
+              <w:ind w:firstLine="0"/>
+              <w:jc w:val="center"/>
+              <w:rPr>
+                <w:sz w:val="20"/>
+                <w:szCs w:val="20"/>
+              </w:rPr>
+            </w:pPr>
+            <w:r>
+              <w:rPr>
+                <w:sz w:val="20"/>
+                <w:szCs w:val="20"/>
               </w:rPr>
               <w:t>768</w:t>
             </w:r>
@@ -2597,20 +2712,22 @@
         </w:tc>
         <w:tc>
           <w:tcPr>
-            <w:tcW w:w="747" w:type="dxa"/>
-            <w:vAlign w:val="center"/>
-          </w:tcPr>
-          <w:p>
-            <w:pPr>
-              <w:ind w:firstLine="0"/>
-              <w:jc w:val="center"/>
-              <w:rPr>
-                <w:szCs w:val="26"/>
-              </w:rPr>
-            </w:pPr>
-            <w:r>
-              <w:rPr>
-                <w:szCs w:val="26"/>
+            <w:tcW w:w="785" w:type="dxa"/>
+            <w:vAlign w:val="center"/>
+          </w:tcPr>
+          <w:p>
+            <w:pPr>
+              <w:ind w:firstLine="0"/>
+              <w:jc w:val="center"/>
+              <w:rPr>
+                <w:sz w:val="20"/>
+                <w:szCs w:val="20"/>
+              </w:rPr>
+            </w:pPr>
+            <w:r>
+              <w:rPr>
+                <w:sz w:val="20"/>
+                <w:szCs w:val="20"/>
               </w:rPr>
               <w:t>363</w:t>
             </w:r>
@@ -2618,20 +2735,22 @@
         </w:tc>
         <w:tc>
           <w:tcPr>
-            <w:tcW w:w="953" w:type="dxa"/>
-            <w:vAlign w:val="center"/>
-          </w:tcPr>
-          <w:p>
-            <w:pPr>
-              <w:ind w:firstLine="0"/>
-              <w:jc w:val="center"/>
-              <w:rPr>
-                <w:szCs w:val="26"/>
-              </w:rPr>
-            </w:pPr>
-            <w:r>
-              <w:rPr>
-                <w:szCs w:val="26"/>
+            <w:tcW w:w="996" w:type="dxa"/>
+            <w:vAlign w:val="center"/>
+          </w:tcPr>
+          <w:p>
+            <w:pPr>
+              <w:ind w:firstLine="0"/>
+              <w:jc w:val="center"/>
+              <w:rPr>
+                <w:sz w:val="20"/>
+                <w:szCs w:val="20"/>
+              </w:rPr>
+            </w:pPr>
+            <w:r>
+              <w:rPr>
+                <w:sz w:val="20"/>
+                <w:szCs w:val="20"/>
               </w:rPr>
               <w:t>0.42</w:t>
             </w:r>
@@ -2641,24 +2760,26 @@
       <w:tr>
         <w:tc>
           <w:tcPr>
-            <w:tcW w:w="2757" w:type="dxa"/>
-            <w:vAlign w:val="center"/>
-          </w:tcPr>
-          <w:p>
-            <w:pPr>
-              <w:ind w:firstLine="0"/>
-              <w:jc w:val="center"/>
-              <w:rPr>
-                <w:b/>
-                <w:bCs/>
-                <w:szCs w:val="26"/>
-              </w:rPr>
-            </w:pPr>
-            <w:r>
-              <w:rPr>
-                <w:b/>
-                <w:bCs/>
-                <w:szCs w:val="26"/>
+            <w:tcW w:w="2122" w:type="dxa"/>
+            <w:vAlign w:val="center"/>
+          </w:tcPr>
+          <w:p>
+            <w:pPr>
+              <w:ind w:firstLine="0"/>
+              <w:jc w:val="center"/>
+              <w:rPr>
+                <w:i/>
+                <w:iCs/>
+                <w:sz w:val="20"/>
+                <w:szCs w:val="20"/>
+              </w:rPr>
+            </w:pPr>
+            <w:r>
+              <w:rPr>
+                <w:i/>
+                <w:iCs/>
+                <w:sz w:val="20"/>
+                <w:szCs w:val="20"/>
               </w:rPr>
               <w:t>vietnamese-bi-encoder</w:t>
             </w:r>
@@ -2666,21 +2787,23 @@
         </w:tc>
         <w:tc>
           <w:tcPr>
-            <w:tcW w:w="1554" w:type="dxa"/>
-            <w:vAlign w:val="center"/>
-          </w:tcPr>
-          <w:p>
-            <w:pPr>
-              <w:ind w:firstLine="0"/>
-              <w:jc w:val="center"/>
-              <w:rPr>
-                <w:szCs w:val="26"/>
-                <w:lang w:val="vi-VN"/>
-              </w:rPr>
-            </w:pPr>
-            <w:r>
-              <w:rPr>
-                <w:szCs w:val="26"/>
+            <w:tcW w:w="2244" w:type="dxa"/>
+            <w:vAlign w:val="center"/>
+          </w:tcPr>
+          <w:p>
+            <w:pPr>
+              <w:ind w:firstLine="0"/>
+              <w:jc w:val="center"/>
+              <w:rPr>
+                <w:sz w:val="20"/>
+                <w:szCs w:val="20"/>
+                <w:lang w:val="vi-VN"/>
+              </w:rPr>
+            </w:pPr>
+            <w:r>
+              <w:rPr>
+                <w:sz w:val="20"/>
+                <w:szCs w:val="20"/>
                 <w:lang w:val="vi-VN"/>
               </w:rPr>
               <w:t>1.00</w:t>
@@ -2689,27 +2812,30 @@
         </w:tc>
         <w:tc>
           <w:tcPr>
-            <w:tcW w:w="1554" w:type="dxa"/>
-            <w:vAlign w:val="center"/>
-          </w:tcPr>
-          <w:p>
-            <w:pPr>
-              <w:ind w:firstLine="0"/>
-              <w:jc w:val="center"/>
-              <w:rPr>
-                <w:szCs w:val="26"/>
-                <w:lang w:val="vi-VN"/>
-              </w:rPr>
-            </w:pPr>
-            <w:r>
-              <w:rPr>
-                <w:szCs w:val="26"/>
+            <w:tcW w:w="1609" w:type="dxa"/>
+            <w:vAlign w:val="center"/>
+          </w:tcPr>
+          <w:p>
+            <w:pPr>
+              <w:ind w:firstLine="0"/>
+              <w:jc w:val="center"/>
+              <w:rPr>
+                <w:sz w:val="20"/>
+                <w:szCs w:val="20"/>
+                <w:lang w:val="vi-VN"/>
+              </w:rPr>
+            </w:pPr>
+            <w:r>
+              <w:rPr>
+                <w:sz w:val="20"/>
+                <w:szCs w:val="20"/>
               </w:rPr>
               <w:t>1</w:t>
             </w:r>
             <w:r>
               <w:rPr>
-                <w:szCs w:val="26"/>
+                <w:sz w:val="20"/>
+                <w:szCs w:val="20"/>
                 <w:lang w:val="vi-VN"/>
               </w:rPr>
               <w:t>.00</w:t>
@@ -2718,27 +2844,30 @@
         </w:tc>
         <w:tc>
           <w:tcPr>
-            <w:tcW w:w="1554" w:type="dxa"/>
-            <w:vAlign w:val="center"/>
-          </w:tcPr>
-          <w:p>
-            <w:pPr>
-              <w:ind w:firstLine="0"/>
-              <w:jc w:val="center"/>
-              <w:rPr>
-                <w:szCs w:val="26"/>
-                <w:lang w:val="vi-VN"/>
-              </w:rPr>
-            </w:pPr>
-            <w:r>
-              <w:rPr>
-                <w:szCs w:val="26"/>
+            <w:tcW w:w="1609" w:type="dxa"/>
+            <w:vAlign w:val="center"/>
+          </w:tcPr>
+          <w:p>
+            <w:pPr>
+              <w:ind w:firstLine="0"/>
+              <w:jc w:val="center"/>
+              <w:rPr>
+                <w:sz w:val="20"/>
+                <w:szCs w:val="20"/>
+                <w:lang w:val="vi-VN"/>
+              </w:rPr>
+            </w:pPr>
+            <w:r>
+              <w:rPr>
+                <w:sz w:val="20"/>
+                <w:szCs w:val="20"/>
               </w:rPr>
               <w:t>0</w:t>
             </w:r>
             <w:r>
               <w:rPr>
-                <w:szCs w:val="26"/>
+                <w:sz w:val="20"/>
+                <w:szCs w:val="20"/>
                 <w:lang w:val="vi-VN"/>
               </w:rPr>
               <w:t>.88</w:t>
@@ -2747,20 +2876,22 @@
         </w:tc>
         <w:tc>
           <w:tcPr>
-            <w:tcW w:w="895" w:type="dxa"/>
-            <w:vAlign w:val="center"/>
-          </w:tcPr>
-          <w:p>
-            <w:pPr>
-              <w:ind w:firstLine="0"/>
-              <w:jc w:val="center"/>
-              <w:rPr>
-                <w:szCs w:val="26"/>
-              </w:rPr>
-            </w:pPr>
-            <w:r>
-              <w:rPr>
-                <w:szCs w:val="26"/>
+            <w:tcW w:w="939" w:type="dxa"/>
+            <w:vAlign w:val="center"/>
+          </w:tcPr>
+          <w:p>
+            <w:pPr>
+              <w:ind w:firstLine="0"/>
+              <w:jc w:val="center"/>
+              <w:rPr>
+                <w:sz w:val="20"/>
+                <w:szCs w:val="20"/>
+              </w:rPr>
+            </w:pPr>
+            <w:r>
+              <w:rPr>
+                <w:sz w:val="20"/>
+                <w:szCs w:val="20"/>
               </w:rPr>
               <w:t>50</w:t>
             </w:r>
@@ -2768,20 +2899,22 @@
         </w:tc>
         <w:tc>
           <w:tcPr>
-            <w:tcW w:w="895" w:type="dxa"/>
-            <w:vAlign w:val="center"/>
-          </w:tcPr>
-          <w:p>
-            <w:pPr>
-              <w:ind w:firstLine="0"/>
-              <w:jc w:val="center"/>
-              <w:rPr>
-                <w:szCs w:val="26"/>
-              </w:rPr>
-            </w:pPr>
-            <w:r>
-              <w:rPr>
-                <w:szCs w:val="26"/>
+            <w:tcW w:w="939" w:type="dxa"/>
+            <w:vAlign w:val="center"/>
+          </w:tcPr>
+          <w:p>
+            <w:pPr>
+              <w:ind w:firstLine="0"/>
+              <w:jc w:val="center"/>
+              <w:rPr>
+                <w:sz w:val="20"/>
+                <w:szCs w:val="20"/>
+              </w:rPr>
+            </w:pPr>
+            <w:r>
+              <w:rPr>
+                <w:sz w:val="20"/>
+                <w:szCs w:val="20"/>
               </w:rPr>
               <w:t>1967</w:t>
             </w:r>
@@ -2789,20 +2922,22 @@
         </w:tc>
         <w:tc>
           <w:tcPr>
-            <w:tcW w:w="1358" w:type="dxa"/>
-            <w:vAlign w:val="center"/>
-          </w:tcPr>
-          <w:p>
-            <w:pPr>
-              <w:ind w:firstLine="0"/>
-              <w:jc w:val="center"/>
-              <w:rPr>
-                <w:szCs w:val="26"/>
-              </w:rPr>
-            </w:pPr>
-            <w:r>
-              <w:rPr>
-                <w:szCs w:val="26"/>
+            <w:tcW w:w="1401" w:type="dxa"/>
+            <w:vAlign w:val="center"/>
+          </w:tcPr>
+          <w:p>
+            <w:pPr>
+              <w:ind w:firstLine="0"/>
+              <w:jc w:val="center"/>
+              <w:rPr>
+                <w:sz w:val="20"/>
+                <w:szCs w:val="20"/>
+              </w:rPr>
+            </w:pPr>
+            <w:r>
+              <w:rPr>
+                <w:sz w:val="20"/>
+                <w:szCs w:val="20"/>
               </w:rPr>
               <w:t>768</w:t>
             </w:r>
@@ -2810,20 +2945,22 @@
         </w:tc>
         <w:tc>
           <w:tcPr>
-            <w:tcW w:w="747" w:type="dxa"/>
-            <w:vAlign w:val="center"/>
-          </w:tcPr>
-          <w:p>
-            <w:pPr>
-              <w:ind w:firstLine="0"/>
-              <w:jc w:val="center"/>
-              <w:rPr>
-                <w:szCs w:val="26"/>
-              </w:rPr>
-            </w:pPr>
-            <w:r>
-              <w:rPr>
-                <w:szCs w:val="26"/>
+            <w:tcW w:w="785" w:type="dxa"/>
+            <w:vAlign w:val="center"/>
+          </w:tcPr>
+          <w:p>
+            <w:pPr>
+              <w:ind w:firstLine="0"/>
+              <w:jc w:val="center"/>
+              <w:rPr>
+                <w:sz w:val="20"/>
+                <w:szCs w:val="20"/>
+              </w:rPr>
+            </w:pPr>
+            <w:r>
+              <w:rPr>
+                <w:sz w:val="20"/>
+                <w:szCs w:val="20"/>
               </w:rPr>
               <w:t>269</w:t>
             </w:r>
@@ -2831,20 +2968,22 @@
         </w:tc>
         <w:tc>
           <w:tcPr>
-            <w:tcW w:w="953" w:type="dxa"/>
-            <w:vAlign w:val="center"/>
-          </w:tcPr>
-          <w:p>
-            <w:pPr>
-              <w:ind w:firstLine="0"/>
-              <w:jc w:val="center"/>
-              <w:rPr>
-                <w:szCs w:val="26"/>
-              </w:rPr>
-            </w:pPr>
-            <w:r>
-              <w:rPr>
-                <w:szCs w:val="26"/>
+            <w:tcW w:w="996" w:type="dxa"/>
+            <w:vAlign w:val="center"/>
+          </w:tcPr>
+          <w:p>
+            <w:pPr>
+              <w:ind w:firstLine="0"/>
+              <w:jc w:val="center"/>
+              <w:rPr>
+                <w:sz w:val="20"/>
+                <w:szCs w:val="20"/>
+              </w:rPr>
+            </w:pPr>
+            <w:r>
+              <w:rPr>
+                <w:sz w:val="20"/>
+                <w:szCs w:val="20"/>
               </w:rPr>
               <w:t>0.31</w:t>
             </w:r>
@@ -2853,6 +2992,11 @@
       </w:tr>
       <w:bookmarkEnd w:id="0"/>
     </w:tbl>
+    <w:p>
+      <w:pPr>
+        <w:ind w:firstLine="0"/>
+      </w:pPr>
+    </w:p>
     <w:p>
       <w:pPr>
         <w:ind w:firstLine="0"/>
@@ -4859,6 +5003,7 @@
               <w:rPr>
                 <w:highlight w:val="black"/>
               </w:rPr>
+              <w:lastRenderedPageBreak/>
               <w:t>phobert-base-v2</w:t>
             </w:r>
           </w:p>

</xml_diff>